<commit_message>
[labeling-studio-improve] Bước 1.2: Persist bảng jobs cho auto-label vào SQLite
- server/src/db.js: thêm CREATE TABLE IF NOT EXISTS jobs (12 cột), 2 indexes,
  startup cleanup UPDATE running/pending jobs → status=error khi server restart
- server/migrations/001_create_jobs.sql: migration SQL tham khảo (idempotent)
- server/src/routes/jobs.js: MỚI — GET /api/jobs?projectId, GET /api/jobs/:id,
  DELETE /api/jobs/:id
- server/src/index.js: import + mount jobsRouter tại /api/jobs
- server/src/routes/autolabel.js: thêm createJobInDB/syncJobToDB/getJobFromDB;
  POST handler tạo DB row ngay + sync khi inference hoàn thành;
  GET handler fall-back DB cho job đã hoàn thành/sau restart
- code-graph/CODE-GRAPH.md: cập nhật §2,3.1,3.2,3.10,3.11(MỚI),6,7,9,10

Plan: docs/plans/PLAN-labeling-studio-improve-2026-08-04/steps/STEP-1.2-jobs-table-persist.md
</commit_message>
<xml_diff>
--- a/code-graph/CODE-GRAPH.docx
+++ b/code-graph/CODE-GRAPH.docx
@@ -647,13 +647,19 @@
         <w:br/>
         <w:t>│   │   │   ├── models.js</w:t>
         <w:br/>
-        <w:t>│   │   │   └── autolabel.js        ← HTTP → FastAPI (STEP-1.1); legacy spawn (USE_LEGACY_INFER=1)</w:t>
+        <w:t>│   │   │   ├── autolabel.js        ← HTTP → FastAPI (STEP-1.1); DB-backed jobs (STEP-1.2)</w:t>
+        <w:br/>
+        <w:t>│   │   │   └── jobs.js             ← CRUD /api/jobs (STEP-1.2 MỚI)</w:t>
         <w:br/>
         <w:t>│   │   └── python/</w:t>
         <w:br/>
         <w:t>│   │       ├── inference_service.py  ← FastAPI thường trực, LRU cache 3 model (STEP-1.1 MỚI)</w:t>
         <w:br/>
         <w:t>│   │       └── infer.py              ← stdin→stdout JSON batch inference (GIỮ LẠI, rollback)</w:t>
+        <w:br/>
+        <w:t>│   ├── migrations/                 ← SQL migration files (chỉ tham khảo; db.js inline là nguồn sự thật)</w:t>
+        <w:br/>
+        <w:t>│   │   └── 001_create_jobs.sql     ← (STEP-1.2)</w:t>
         <w:br/>
         <w:t>│   ├── data/                       ← RUNTIME (git-ignored)</w:t>
         <w:br/>
@@ -1660,9 +1666,16 @@
           <w:p>
             <w:r>
               <w:rPr>
-                <w:sz w:val="20"/>
-              </w:rPr>
-              <w:t>Env vars đọc</w:t>
+                <w:b/>
+                <w:sz w:val="20"/>
+              </w:rPr>
+              <w:t>[STEP-1.2]</w:t>
+            </w:r>
+            <w:r>
+              <w:rPr>
+                <w:sz w:val="20"/>
+              </w:rPr>
+              <w:t xml:space="preserve"> Jobs router</w:t>
             </w:r>
           </w:p>
         </w:tc>
@@ -1677,19 +1690,25 @@
             </w:tcBorders>
           </w:tcPr>
           <w:p>
+            <w:r>
+              <w:rPr>
+                <w:sz w:val="20"/>
+              </w:rPr>
+              <w:t xml:space="preserve">import + mount </w:t>
+            </w:r>
             <w:r>
               <w:rPr>
                 <w:rFonts w:ascii="Courier New" w:hAnsi="Courier New"/>
                 <w:color w:val="F05922"/>
                 <w:sz w:val="20"/>
               </w:rPr>
-              <w:t>PORT</w:t>
-            </w:r>
-            <w:r>
-              <w:rPr>
-                <w:sz w:val="20"/>
-              </w:rPr>
-              <w:t xml:space="preserve">, </w:t>
+              <w:t>routes/jobs.js</w:t>
+            </w:r>
+            <w:r>
+              <w:rPr>
+                <w:sz w:val="20"/>
+              </w:rPr>
+              <w:t xml:space="preserve"> tại </w:t>
             </w:r>
             <w:r>
               <w:rPr>
@@ -1697,21 +1716,94 @@
                 <w:color w:val="F05922"/>
                 <w:sz w:val="20"/>
               </w:rPr>
-              <w:t>PYTHON_BIN</w:t>
-            </w:r>
-            <w:r>
-              <w:rPr>
-                <w:sz w:val="20"/>
-              </w:rPr>
-              <w:t xml:space="preserve">, </w:t>
-            </w:r>
+              <w:t>/api/jobs</w:t>
+            </w:r>
+          </w:p>
+        </w:tc>
+        <w:tc>
+          <w:tcPr>
+            <w:tcW w:type="dxa" w:w="1938"/>
+            <w:tcBorders>
+              <w:top w:val="single" w:sz="4" w:space="0" w:color="CBCBCB"/>
+              <w:left w:val="single" w:sz="4" w:space="0" w:color="CBCBCB"/>
+              <w:bottom w:val="single" w:sz="4" w:space="0" w:color="CBCBCB"/>
+              <w:right w:val="single" w:sz="4" w:space="0" w:color="CBCBCB"/>
+            </w:tcBorders>
+          </w:tcPr>
+          <w:p>
+            <w:r>
+              <w:rPr>
+                <w:sz w:val="20"/>
+              </w:rPr>
+              <w:t>CONFIRMED</w:t>
+            </w:r>
+          </w:p>
+        </w:tc>
+        <w:tc>
+          <w:tcPr>
+            <w:tcW w:type="dxa" w:w="1938"/>
+            <w:tcBorders>
+              <w:top w:val="single" w:sz="4" w:space="0" w:color="CBCBCB"/>
+              <w:left w:val="single" w:sz="4" w:space="0" w:color="CBCBCB"/>
+              <w:bottom w:val="single" w:sz="4" w:space="0" w:color="CBCBCB"/>
+              <w:right w:val="single" w:sz="4" w:space="0" w:color="CBCBCB"/>
+            </w:tcBorders>
+          </w:tcPr>
+          <w:p/>
+        </w:tc>
+        <w:tc>
+          <w:tcPr>
+            <w:tcW w:type="dxa" w:w="1938"/>
+            <w:tcBorders>
+              <w:top w:val="single" w:sz="4" w:space="0" w:color="CBCBCB"/>
+              <w:left w:val="single" w:sz="4" w:space="0" w:color="CBCBCB"/>
+              <w:bottom w:val="single" w:sz="4" w:space="0" w:color="CBCBCB"/>
+              <w:right w:val="single" w:sz="4" w:space="0" w:color="CBCBCB"/>
+            </w:tcBorders>
+          </w:tcPr>
+          <w:p/>
+        </w:tc>
+      </w:tr>
+      <w:tr>
+        <w:tc>
+          <w:tcPr>
+            <w:tcW w:type="dxa" w:w="1938"/>
+            <w:shd w:val="clear" w:color="auto" w:fill="B8B3D6"/>
+            <w:tcBorders>
+              <w:top w:val="single" w:sz="4" w:space="0" w:color="CBCBCB"/>
+              <w:left w:val="single" w:sz="4" w:space="0" w:color="CBCBCB"/>
+              <w:bottom w:val="single" w:sz="4" w:space="0" w:color="CBCBCB"/>
+              <w:right w:val="single" w:sz="4" w:space="0" w:color="CBCBCB"/>
+            </w:tcBorders>
+          </w:tcPr>
+          <w:p>
+            <w:r>
+              <w:rPr>
+                <w:sz w:val="20"/>
+              </w:rPr>
+              <w:t>Env vars đọc</w:t>
+            </w:r>
+          </w:p>
+        </w:tc>
+        <w:tc>
+          <w:tcPr>
+            <w:tcW w:type="dxa" w:w="1938"/>
+            <w:shd w:val="clear" w:color="auto" w:fill="B8B3D6"/>
+            <w:tcBorders>
+              <w:top w:val="single" w:sz="4" w:space="0" w:color="CBCBCB"/>
+              <w:left w:val="single" w:sz="4" w:space="0" w:color="CBCBCB"/>
+              <w:bottom w:val="single" w:sz="4" w:space="0" w:color="CBCBCB"/>
+              <w:right w:val="single" w:sz="4" w:space="0" w:color="CBCBCB"/>
+            </w:tcBorders>
+          </w:tcPr>
+          <w:p>
             <w:r>
               <w:rPr>
                 <w:rFonts w:ascii="Courier New" w:hAnsi="Courier New"/>
                 <w:color w:val="F05922"/>
                 <w:sz w:val="20"/>
               </w:rPr>
-              <w:t>INFERENCE_PORT</w:t>
+              <w:t>PORT</w:t>
             </w:r>
             <w:r>
               <w:rPr>
@@ -1725,6 +1817,34 @@
                 <w:color w:val="F05922"/>
                 <w:sz w:val="20"/>
               </w:rPr>
+              <w:t>PYTHON_BIN</w:t>
+            </w:r>
+            <w:r>
+              <w:rPr>
+                <w:sz w:val="20"/>
+              </w:rPr>
+              <w:t xml:space="preserve">, </w:t>
+            </w:r>
+            <w:r>
+              <w:rPr>
+                <w:rFonts w:ascii="Courier New" w:hAnsi="Courier New"/>
+                <w:color w:val="F05922"/>
+                <w:sz w:val="20"/>
+              </w:rPr>
+              <w:t>INFERENCE_PORT</w:t>
+            </w:r>
+            <w:r>
+              <w:rPr>
+                <w:sz w:val="20"/>
+              </w:rPr>
+              <w:t xml:space="preserve">, </w:t>
+            </w:r>
+            <w:r>
+              <w:rPr>
+                <w:rFonts w:ascii="Courier New" w:hAnsi="Courier New"/>
+                <w:color w:val="F05922"/>
+                <w:sz w:val="20"/>
+              </w:rPr>
               <w:t>USE_LEGACY_INFER</w:t>
             </w:r>
           </w:p>
@@ -1732,6 +1852,7 @@
         <w:tc>
           <w:tcPr>
             <w:tcW w:type="dxa" w:w="1938"/>
+            <w:shd w:val="clear" w:color="auto" w:fill="B8B3D6"/>
             <w:tcBorders>
               <w:top w:val="single" w:sz="4" w:space="0" w:color="CBCBCB"/>
               <w:left w:val="single" w:sz="4" w:space="0" w:color="CBCBCB"/>
@@ -1751,6 +1872,7 @@
         <w:tc>
           <w:tcPr>
             <w:tcW w:type="dxa" w:w="1938"/>
+            <w:shd w:val="clear" w:color="auto" w:fill="B8B3D6"/>
             <w:tcBorders>
               <w:top w:val="single" w:sz="4" w:space="0" w:color="CBCBCB"/>
               <w:left w:val="single" w:sz="4" w:space="0" w:color="CBCBCB"/>
@@ -1763,6 +1885,7 @@
         <w:tc>
           <w:tcPr>
             <w:tcW w:type="dxa" w:w="1938"/>
+            <w:shd w:val="clear" w:color="auto" w:fill="B8B3D6"/>
             <w:tcBorders>
               <w:top w:val="single" w:sz="4" w:space="0" w:color="CBCBCB"/>
               <w:left w:val="single" w:sz="4" w:space="0" w:color="CBCBCB"/>
@@ -1777,7 +1900,6 @@
         <w:tc>
           <w:tcPr>
             <w:tcW w:type="dxa" w:w="1938"/>
-            <w:shd w:val="clear" w:color="auto" w:fill="B8B3D6"/>
             <w:tcBorders>
               <w:top w:val="single" w:sz="4" w:space="0" w:color="CBCBCB"/>
               <w:left w:val="single" w:sz="4" w:space="0" w:color="CBCBCB"/>
@@ -1797,27 +1919,25 @@
         <w:tc>
           <w:tcPr>
             <w:tcW w:type="dxa" w:w="1938"/>
-            <w:shd w:val="clear" w:color="auto" w:fill="B8B3D6"/>
-            <w:tcBorders>
-              <w:top w:val="single" w:sz="4" w:space="0" w:color="CBCBCB"/>
-              <w:left w:val="single" w:sz="4" w:space="0" w:color="CBCBCB"/>
-              <w:bottom w:val="single" w:sz="4" w:space="0" w:color="CBCBCB"/>
-              <w:right w:val="single" w:sz="4" w:space="0" w:color="CBCBCB"/>
-            </w:tcBorders>
-          </w:tcPr>
-          <w:p>
-            <w:r>
-              <w:rPr>
-                <w:sz w:val="20"/>
-              </w:rPr>
-              <w:t>2026-08-04 (STEP-1.1)</w:t>
+            <w:tcBorders>
+              <w:top w:val="single" w:sz="4" w:space="0" w:color="CBCBCB"/>
+              <w:left w:val="single" w:sz="4" w:space="0" w:color="CBCBCB"/>
+              <w:bottom w:val="single" w:sz="4" w:space="0" w:color="CBCBCB"/>
+              <w:right w:val="single" w:sz="4" w:space="0" w:color="CBCBCB"/>
+            </w:tcBorders>
+          </w:tcPr>
+          <w:p>
+            <w:r>
+              <w:rPr>
+                <w:sz w:val="20"/>
+              </w:rPr>
+              <w:t>2026-08-04 (STEP-1.2)</w:t>
             </w:r>
           </w:p>
         </w:tc>
         <w:tc>
           <w:tcPr>
             <w:tcW w:type="dxa" w:w="1938"/>
-            <w:shd w:val="clear" w:color="auto" w:fill="B8B3D6"/>
             <w:tcBorders>
               <w:top w:val="single" w:sz="4" w:space="0" w:color="CBCBCB"/>
               <w:left w:val="single" w:sz="4" w:space="0" w:color="CBCBCB"/>
@@ -1837,7 +1957,6 @@
         <w:tc>
           <w:tcPr>
             <w:tcW w:type="dxa" w:w="1938"/>
-            <w:shd w:val="clear" w:color="auto" w:fill="B8B3D6"/>
             <w:tcBorders>
               <w:top w:val="single" w:sz="4" w:space="0" w:color="CBCBCB"/>
               <w:left w:val="single" w:sz="4" w:space="0" w:color="CBCBCB"/>
@@ -1850,7 +1969,6 @@
         <w:tc>
           <w:tcPr>
             <w:tcW w:type="dxa" w:w="1938"/>
-            <w:shd w:val="clear" w:color="auto" w:fill="B8B3D6"/>
             <w:tcBorders>
               <w:top w:val="single" w:sz="4" w:space="0" w:color="CBCBCB"/>
               <w:left w:val="single" w:sz="4" w:space="0" w:color="CBCBCB"/>
@@ -1902,6 +2020,8 @@
         <w:t>/api/projects/:projectId/models       → routes/models.js</w:t>
         <w:br/>
         <w:t>/api/projects/:projectId/auto-label   → routes/autolabel.js</w:t>
+        <w:br/>
+        <w:t>/api/jobs                             → routes/jobs.js    [STEP-1.2 MỚI]</w:t>
       </w:r>
     </w:p>
     <w:p>
@@ -2265,7 +2385,7 @@
               <w:rPr>
                 <w:sz w:val="20"/>
               </w:rPr>
-              <w:t>index.js (UPLOAD_DIR), projects.js, classes.js, images.js, annotations.js, export.js, stats.js, models.js, autolabel.js</w:t>
+              <w:t>index.js (UPLOAD_DIR), projects.js, classes.js, images.js, annotations.js, export.js, stats.js, models.js, autolabel.js, jobs.js</w:t>
             </w:r>
           </w:p>
         </w:tc>
@@ -2515,6 +2635,82 @@
           <w:p>
             <w:r>
               <w:rPr>
+                <w:b/>
+                <w:sz w:val="20"/>
+              </w:rPr>
+              <w:t>[STEP-1.2]</w:t>
+            </w:r>
+            <w:r>
+              <w:rPr>
+                <w:sz w:val="20"/>
+              </w:rPr>
+              <w:t xml:space="preserve"> Startup cleanup</w:t>
+            </w:r>
+          </w:p>
+        </w:tc>
+        <w:tc>
+          <w:tcPr>
+            <w:tcW w:type="dxa" w:w="3230"/>
+            <w:shd w:val="clear" w:color="auto" w:fill="B8B3D6"/>
+            <w:tcBorders>
+              <w:top w:val="single" w:sz="4" w:space="0" w:color="CBCBCB"/>
+              <w:left w:val="single" w:sz="4" w:space="0" w:color="CBCBCB"/>
+              <w:bottom w:val="single" w:sz="4" w:space="0" w:color="CBCBCB"/>
+              <w:right w:val="single" w:sz="4" w:space="0" w:color="CBCBCB"/>
+            </w:tcBorders>
+          </w:tcPr>
+          <w:p>
+            <w:r>
+              <w:rPr>
+                <w:rFonts w:ascii="Courier New" w:hAnsi="Courier New"/>
+                <w:color w:val="F05922"/>
+                <w:sz w:val="20"/>
+              </w:rPr>
+              <w:t>UPDATE jobs SET status='error' WHERE status IN ('running','pending')</w:t>
+            </w:r>
+            <w:r>
+              <w:rPr>
+                <w:sz w:val="20"/>
+              </w:rPr>
+              <w:t xml:space="preserve"> — mọi job dở dang khi restart đều bị đánh dấu error</w:t>
+            </w:r>
+          </w:p>
+        </w:tc>
+        <w:tc>
+          <w:tcPr>
+            <w:tcW w:type="dxa" w:w="3230"/>
+            <w:shd w:val="clear" w:color="auto" w:fill="B8B3D6"/>
+            <w:tcBorders>
+              <w:top w:val="single" w:sz="4" w:space="0" w:color="CBCBCB"/>
+              <w:left w:val="single" w:sz="4" w:space="0" w:color="CBCBCB"/>
+              <w:bottom w:val="single" w:sz="4" w:space="0" w:color="CBCBCB"/>
+              <w:right w:val="single" w:sz="4" w:space="0" w:color="CBCBCB"/>
+            </w:tcBorders>
+          </w:tcPr>
+          <w:p>
+            <w:r>
+              <w:rPr>
+                <w:sz w:val="20"/>
+              </w:rPr>
+              <w:t>CONFIRMED</w:t>
+            </w:r>
+          </w:p>
+        </w:tc>
+      </w:tr>
+      <w:tr>
+        <w:tc>
+          <w:tcPr>
+            <w:tcW w:type="dxa" w:w="3230"/>
+            <w:tcBorders>
+              <w:top w:val="single" w:sz="4" w:space="0" w:color="CBCBCB"/>
+              <w:left w:val="single" w:sz="4" w:space="0" w:color="CBCBCB"/>
+              <w:bottom w:val="single" w:sz="4" w:space="0" w:color="CBCBCB"/>
+              <w:right w:val="single" w:sz="4" w:space="0" w:color="CBCBCB"/>
+            </w:tcBorders>
+          </w:tcPr>
+          <w:p>
+            <w:r>
+              <w:rPr>
                 <w:sz w:val="20"/>
               </w:rPr>
               <w:t>Last verified</w:t>
@@ -2524,27 +2720,25 @@
         <w:tc>
           <w:tcPr>
             <w:tcW w:type="dxa" w:w="3230"/>
-            <w:shd w:val="clear" w:color="auto" w:fill="B8B3D6"/>
-            <w:tcBorders>
-              <w:top w:val="single" w:sz="4" w:space="0" w:color="CBCBCB"/>
-              <w:left w:val="single" w:sz="4" w:space="0" w:color="CBCBCB"/>
-              <w:bottom w:val="single" w:sz="4" w:space="0" w:color="CBCBCB"/>
-              <w:right w:val="single" w:sz="4" w:space="0" w:color="CBCBCB"/>
-            </w:tcBorders>
-          </w:tcPr>
-          <w:p>
-            <w:r>
-              <w:rPr>
-                <w:sz w:val="20"/>
-              </w:rPr>
-              <w:t>2026-08-04</w:t>
-            </w:r>
-          </w:p>
-        </w:tc>
-        <w:tc>
-          <w:tcPr>
-            <w:tcW w:type="dxa" w:w="3230"/>
-            <w:shd w:val="clear" w:color="auto" w:fill="B8B3D6"/>
+            <w:tcBorders>
+              <w:top w:val="single" w:sz="4" w:space="0" w:color="CBCBCB"/>
+              <w:left w:val="single" w:sz="4" w:space="0" w:color="CBCBCB"/>
+              <w:bottom w:val="single" w:sz="4" w:space="0" w:color="CBCBCB"/>
+              <w:right w:val="single" w:sz="4" w:space="0" w:color="CBCBCB"/>
+            </w:tcBorders>
+          </w:tcPr>
+          <w:p>
+            <w:r>
+              <w:rPr>
+                <w:sz w:val="20"/>
+              </w:rPr>
+              <w:t>2026-08-04 (STEP-1.2)</w:t>
+            </w:r>
+          </w:p>
+        </w:tc>
+        <w:tc>
+          <w:tcPr>
+            <w:tcW w:type="dxa" w:w="3230"/>
             <w:tcBorders>
               <w:top w:val="single" w:sz="4" w:space="0" w:color="CBCBCB"/>
               <w:left w:val="single" w:sz="4" w:space="0" w:color="CBCBCB"/>
@@ -2659,6 +2853,32 @@
     </w:p>
     <w:p>
       <w:pPr>
+        <w:spacing w:after="20"/>
+        <w:ind w:left="567" w:hanging="283"/>
+      </w:pPr>
+      <w:r>
+        <w:rPr>
+          <w:sz w:val="21"/>
+        </w:rPr>
+        <w:t>4.</w:t>
+        <w:tab/>
+      </w:r>
+      <w:r>
+        <w:rPr>
+          <w:b/>
+          <w:sz w:val="21"/>
+        </w:rPr>
+        <w:t>[STEP-1.2]</w:t>
+      </w:r>
+      <w:r>
+        <w:rPr>
+          <w:sz w:val="21"/>
+        </w:rPr>
+        <w:t xml:space="preserve"> Cleanup jobs — UPDATE running/pending → error (startup idempotent)</w:t>
+      </w:r>
+    </w:p>
+    <w:p>
+      <w:pPr>
         <w:pBdr>
           <w:bottom w:val="single" w:sz="6" w:space="1" w:color="F05922"/>
         </w:pBdr>
@@ -8572,9 +8792,10 @@
           <w:p>
             <w:r>
               <w:rPr>
-                <w:sz w:val="20"/>
-              </w:rPr>
-              <w:t>Job storage</w:t>
+                <w:b/>
+                <w:sz w:val="20"/>
+              </w:rPr>
+              <w:t>[STEP-1.2] Job storage</w:t>
             </w:r>
           </w:p>
         </w:tc>
@@ -8595,13 +8816,13 @@
                 <w:b/>
                 <w:sz w:val="20"/>
               </w:rPr>
-              <w:t>In-memory Map</w:t>
-            </w:r>
-            <w:r>
-              <w:rPr>
-                <w:sz w:val="20"/>
-              </w:rPr>
-              <w:t xml:space="preserve"> (mất khi restart server — STEP-1.2 sẽ migrate sang bảng </w:t>
+              <w:t>DB-backed</w:t>
+            </w:r>
+            <w:r>
+              <w:rPr>
+                <w:sz w:val="20"/>
+              </w:rPr>
+              <w:t xml:space="preserve">: </w:t>
             </w:r>
             <w:r>
               <w:rPr>
@@ -8609,13 +8830,41 @@
                 <w:color w:val="F05922"/>
                 <w:sz w:val="20"/>
               </w:rPr>
-              <w:t>jobs</w:t>
-            </w:r>
-            <w:r>
-              <w:rPr>
-                <w:sz w:val="20"/>
-              </w:rPr>
-              <w:t xml:space="preserve"> DB)</w:t>
+              <w:t>createJobInDB()</w:t>
+            </w:r>
+            <w:r>
+              <w:rPr>
+                <w:sz w:val="20"/>
+              </w:rPr>
+              <w:t xml:space="preserve"> khi POST; </w:t>
+            </w:r>
+            <w:r>
+              <w:rPr>
+                <w:rFonts w:ascii="Courier New" w:hAnsi="Courier New"/>
+                <w:color w:val="F05922"/>
+                <w:sz w:val="20"/>
+              </w:rPr>
+              <w:t>syncJobToDB()</w:t>
+            </w:r>
+            <w:r>
+              <w:rPr>
+                <w:sz w:val="20"/>
+              </w:rPr>
+              <w:t xml:space="preserve"> khi hoàn thành; </w:t>
+            </w:r>
+            <w:r>
+              <w:rPr>
+                <w:rFonts w:ascii="Courier New" w:hAnsi="Courier New"/>
+                <w:color w:val="F05922"/>
+                <w:sz w:val="20"/>
+              </w:rPr>
+              <w:t>getJobFromDB()</w:t>
+            </w:r>
+            <w:r>
+              <w:rPr>
+                <w:sz w:val="20"/>
+              </w:rPr>
+              <w:t xml:space="preserve"> khi GET fall-back. In-memory Map chỉ dùng trong quá trình inference đang chạy.</w:t>
             </w:r>
           </w:p>
         </w:tc>
@@ -9032,7 +9281,7 @@
               <w:rPr>
                 <w:sz w:val="20"/>
               </w:rPr>
-              <w:t>2026-08-04 (STEP-1.1)</w:t>
+              <w:t>2026-08-04 (STEP-1.2)</w:t>
             </w:r>
           </w:p>
         </w:tc>
@@ -9298,7 +9547,7 @@
               <w:rPr>
                 <w:sz w:val="20"/>
               </w:rPr>
-              <w:t>autolabel.js:234</w:t>
+              <w:t>autolabel.js:~290</w:t>
             </w:r>
           </w:p>
         </w:tc>
@@ -9318,7 +9567,7 @@
               <w:rPr>
                 <w:sz w:val="20"/>
               </w:rPr>
-              <w:t xml:space="preserve">Khởi chạy job inference (returns </w:t>
+              <w:t xml:space="preserve">Khởi chạy job inference; tạo row DB ngay; returns </w:t>
             </w:r>
             <w:r>
               <w:rPr>
@@ -9332,7 +9581,7 @@
               <w:rPr>
                 <w:sz w:val="20"/>
               </w:rPr>
-              <w:t xml:space="preserve"> 202)</w:t>
+              <w:t xml:space="preserve"> 202</w:t>
             </w:r>
           </w:p>
         </w:tc>
@@ -9393,7 +9642,7 @@
               <w:rPr>
                 <w:sz w:val="20"/>
               </w:rPr>
-              <w:t>autolabel.js:292</w:t>
+              <w:t>autolabel.js:~350</w:t>
             </w:r>
           </w:p>
         </w:tc>
@@ -9412,7 +9661,7 @@
               <w:rPr>
                 <w:sz w:val="20"/>
               </w:rPr>
-              <w:t>Poll trạng thái job</w:t>
+              <w:t>Poll trạng thái: memory Map → fall-back DB</w:t>
             </w:r>
           </w:p>
         </w:tc>
@@ -9490,7 +9739,95 @@
         <w:rPr>
           <w:sz w:val="21"/>
         </w:rPr>
-        <w:t xml:space="preserve"> → cập nhật job Map.</w:t>
+        <w:t xml:space="preserve"> → cập nhật job.</w:t>
+      </w:r>
+    </w:p>
+    <w:p>
+      <w:pPr>
+        <w:spacing w:after="80"/>
+      </w:pPr>
+      <w:r>
+        <w:rPr>
+          <w:b/>
+          <w:sz w:val="21"/>
+        </w:rPr>
+        <w:t>Cơ chế persist (STEP-1.2):</w:t>
+      </w:r>
+      <w:r>
+        <w:rPr>
+          <w:sz w:val="21"/>
+        </w:rPr>
+        <w:t xml:space="preserve"> </w:t>
+      </w:r>
+      <w:r>
+        <w:rPr>
+          <w:rFonts w:ascii="Courier New" w:hAnsi="Courier New"/>
+          <w:color w:val="F05922"/>
+          <w:sz w:val="18"/>
+        </w:rPr>
+        <w:t>createJobInDB()</w:t>
+      </w:r>
+      <w:r>
+        <w:rPr>
+          <w:sz w:val="21"/>
+        </w:rPr>
+        <w:t xml:space="preserve"> khi POST; HTTP mode </w:t>
+      </w:r>
+      <w:r>
+        <w:rPr>
+          <w:rFonts w:ascii="Courier New" w:hAnsi="Courier New"/>
+          <w:color w:val="F05922"/>
+          <w:sz w:val="18"/>
+        </w:rPr>
+        <w:t>.then()/.catch()</w:t>
+      </w:r>
+      <w:r>
+        <w:rPr>
+          <w:sz w:val="21"/>
+        </w:rPr>
+        <w:t xml:space="preserve"> → </w:t>
+      </w:r>
+      <w:r>
+        <w:rPr>
+          <w:rFonts w:ascii="Courier New" w:hAnsi="Courier New"/>
+          <w:color w:val="F05922"/>
+          <w:sz w:val="18"/>
+        </w:rPr>
+        <w:t>syncJobToDB()</w:t>
+      </w:r>
+      <w:r>
+        <w:rPr>
+          <w:sz w:val="21"/>
+        </w:rPr>
+        <w:t xml:space="preserve"> → </w:t>
+      </w:r>
+      <w:r>
+        <w:rPr>
+          <w:rFonts w:ascii="Courier New" w:hAnsi="Courier New"/>
+          <w:color w:val="F05922"/>
+          <w:sz w:val="18"/>
+        </w:rPr>
+        <w:t>jobs.delete()</w:t>
+      </w:r>
+      <w:r>
+        <w:rPr>
+          <w:sz w:val="21"/>
+        </w:rPr>
+        <w:t xml:space="preserve">. Legacy mode: </w:t>
+      </w:r>
+      <w:r>
+        <w:rPr>
+          <w:rFonts w:ascii="Courier New" w:hAnsi="Courier New"/>
+          <w:color w:val="F05922"/>
+          <w:sz w:val="18"/>
+        </w:rPr>
+        <w:t>setInterval(500ms)</w:t>
+      </w:r>
+      <w:r>
+        <w:rPr>
+          <w:sz w:val="21"/>
+        </w:rPr>
+        <w:t xml:space="preserve"> poll job.status → sync khi done/error.</w:t>
       </w:r>
     </w:p>
     <w:p>
@@ -9522,7 +9859,7 @@
         <w:rPr>
           <w:sz w:val="21"/>
         </w:rPr>
-        <w:t xml:space="preserve"> → stdin JSON → readline stdout → cập nhật job Map (giữ nguyên code, không xóa).</w:t>
+        <w:t xml:space="preserve"> → stdin JSON → readline stdout — giữ nguyên, không xóa.</w:t>
       </w:r>
     </w:p>
     <w:p>
@@ -9555,6 +9892,879 @@
           <w:sz w:val="21"/>
         </w:rPr>
         <w:t>) — không thay đổi mount path.</w:t>
+      </w:r>
+    </w:p>
+    <w:p>
+      <w:pPr>
+        <w:pBdr>
+          <w:bottom w:val="single" w:sz="6" w:space="1" w:color="F05922"/>
+        </w:pBdr>
+        <w:spacing w:after="120"/>
+      </w:pPr>
+    </w:p>
+    <w:p>
+      <w:pPr>
+        <w:pStyle w:val="Heading3"/>
+        <w:spacing w:before="160" w:after="60"/>
+      </w:pPr>
+      <w:r>
+        <w:rPr>
+          <w:color w:val="4A3F8C"/>
+          <w:sz w:val="24"/>
+        </w:rPr>
+        <w:t>3.11 `server/src/routes/jobs.js` — Job history CRUD (STEP-1.2 MỚI)</w:t>
+      </w:r>
+    </w:p>
+    <w:tbl>
+      <w:tblPr>
+        <w:tblStyle w:val="TableGrid"/>
+        <w:tblW w:type="auto" w:w="0"/>
+        <w:tblLook w:firstColumn="1" w:firstRow="1" w:lastColumn="0" w:lastRow="0" w:noHBand="0" w:noVBand="1" w:val="04A0"/>
+      </w:tblPr>
+      <w:tblGrid>
+        <w:gridCol w:w="3230"/>
+        <w:gridCol w:w="3230"/>
+        <w:gridCol w:w="3230"/>
+      </w:tblGrid>
+      <w:tr>
+        <w:tc>
+          <w:tcPr>
+            <w:tcW w:type="dxa" w:w="3230"/>
+            <w:shd w:val="clear" w:color="auto" w:fill="251C53"/>
+            <w:tcBorders>
+              <w:top w:val="single" w:sz="4" w:space="0" w:color="251C53"/>
+              <w:left w:val="single" w:sz="4" w:space="0" w:color="251C53"/>
+              <w:bottom w:val="single" w:sz="4" w:space="0" w:color="251C53"/>
+              <w:right w:val="single" w:sz="4" w:space="0" w:color="251C53"/>
+            </w:tcBorders>
+          </w:tcPr>
+          <w:p>
+            <w:r>
+              <w:rPr>
+                <w:b/>
+                <w:color w:val="FFFFFF"/>
+                <w:sz w:val="20"/>
+              </w:rPr>
+              <w:t>Thuộc tính</w:t>
+            </w:r>
+          </w:p>
+        </w:tc>
+        <w:tc>
+          <w:tcPr>
+            <w:tcW w:type="dxa" w:w="3230"/>
+            <w:shd w:val="clear" w:color="auto" w:fill="251C53"/>
+            <w:tcBorders>
+              <w:top w:val="single" w:sz="4" w:space="0" w:color="251C53"/>
+              <w:left w:val="single" w:sz="4" w:space="0" w:color="251C53"/>
+              <w:bottom w:val="single" w:sz="4" w:space="0" w:color="251C53"/>
+              <w:right w:val="single" w:sz="4" w:space="0" w:color="251C53"/>
+            </w:tcBorders>
+          </w:tcPr>
+          <w:p>
+            <w:r>
+              <w:rPr>
+                <w:b/>
+                <w:color w:val="FFFFFF"/>
+                <w:sz w:val="20"/>
+              </w:rPr>
+              <w:t>Giá trị</w:t>
+            </w:r>
+          </w:p>
+        </w:tc>
+        <w:tc>
+          <w:tcPr>
+            <w:tcW w:type="dxa" w:w="3230"/>
+            <w:shd w:val="clear" w:color="auto" w:fill="251C53"/>
+            <w:tcBorders>
+              <w:top w:val="single" w:sz="4" w:space="0" w:color="251C53"/>
+              <w:left w:val="single" w:sz="4" w:space="0" w:color="251C53"/>
+              <w:bottom w:val="single" w:sz="4" w:space="0" w:color="251C53"/>
+              <w:right w:val="single" w:sz="4" w:space="0" w:color="251C53"/>
+            </w:tcBorders>
+          </w:tcPr>
+          <w:p>
+            <w:r>
+              <w:rPr>
+                <w:b/>
+                <w:color w:val="FFFFFF"/>
+                <w:sz w:val="20"/>
+              </w:rPr>
+              <w:t>Confidence</w:t>
+            </w:r>
+          </w:p>
+        </w:tc>
+      </w:tr>
+      <w:tr>
+        <w:tc>
+          <w:tcPr>
+            <w:tcW w:type="dxa" w:w="3230"/>
+            <w:tcBorders>
+              <w:top w:val="single" w:sz="4" w:space="0" w:color="CBCBCB"/>
+              <w:left w:val="single" w:sz="4" w:space="0" w:color="CBCBCB"/>
+              <w:bottom w:val="single" w:sz="4" w:space="0" w:color="CBCBCB"/>
+              <w:right w:val="single" w:sz="4" w:space="0" w:color="CBCBCB"/>
+            </w:tcBorders>
+          </w:tcPr>
+          <w:p>
+            <w:r>
+              <w:rPr>
+                <w:sz w:val="20"/>
+              </w:rPr>
+              <w:t>---</w:t>
+            </w:r>
+          </w:p>
+        </w:tc>
+        <w:tc>
+          <w:tcPr>
+            <w:tcW w:type="dxa" w:w="3230"/>
+            <w:tcBorders>
+              <w:top w:val="single" w:sz="4" w:space="0" w:color="CBCBCB"/>
+              <w:left w:val="single" w:sz="4" w:space="0" w:color="CBCBCB"/>
+              <w:bottom w:val="single" w:sz="4" w:space="0" w:color="CBCBCB"/>
+              <w:right w:val="single" w:sz="4" w:space="0" w:color="CBCBCB"/>
+            </w:tcBorders>
+          </w:tcPr>
+          <w:p>
+            <w:r>
+              <w:rPr>
+                <w:sz w:val="20"/>
+              </w:rPr>
+              <w:t>---</w:t>
+            </w:r>
+          </w:p>
+        </w:tc>
+        <w:tc>
+          <w:tcPr>
+            <w:tcW w:type="dxa" w:w="3230"/>
+            <w:tcBorders>
+              <w:top w:val="single" w:sz="4" w:space="0" w:color="CBCBCB"/>
+              <w:left w:val="single" w:sz="4" w:space="0" w:color="CBCBCB"/>
+              <w:bottom w:val="single" w:sz="4" w:space="0" w:color="CBCBCB"/>
+              <w:right w:val="single" w:sz="4" w:space="0" w:color="CBCBCB"/>
+            </w:tcBorders>
+          </w:tcPr>
+          <w:p>
+            <w:r>
+              <w:rPr>
+                <w:sz w:val="20"/>
+              </w:rPr>
+              <w:t>---</w:t>
+            </w:r>
+          </w:p>
+        </w:tc>
+      </w:tr>
+      <w:tr>
+        <w:tc>
+          <w:tcPr>
+            <w:tcW w:type="dxa" w:w="3230"/>
+            <w:shd w:val="clear" w:color="auto" w:fill="B8B3D6"/>
+            <w:tcBorders>
+              <w:top w:val="single" w:sz="4" w:space="0" w:color="CBCBCB"/>
+              <w:left w:val="single" w:sz="4" w:space="0" w:color="CBCBCB"/>
+              <w:bottom w:val="single" w:sz="4" w:space="0" w:color="CBCBCB"/>
+              <w:right w:val="single" w:sz="4" w:space="0" w:color="CBCBCB"/>
+            </w:tcBorders>
+          </w:tcPr>
+          <w:p>
+            <w:r>
+              <w:rPr>
+                <w:sz w:val="20"/>
+              </w:rPr>
+              <w:t>Router options</w:t>
+            </w:r>
+          </w:p>
+        </w:tc>
+        <w:tc>
+          <w:tcPr>
+            <w:tcW w:type="dxa" w:w="3230"/>
+            <w:shd w:val="clear" w:color="auto" w:fill="B8B3D6"/>
+            <w:tcBorders>
+              <w:top w:val="single" w:sz="4" w:space="0" w:color="CBCBCB"/>
+              <w:left w:val="single" w:sz="4" w:space="0" w:color="CBCBCB"/>
+              <w:bottom w:val="single" w:sz="4" w:space="0" w:color="CBCBCB"/>
+              <w:right w:val="single" w:sz="4" w:space="0" w:color="CBCBCB"/>
+            </w:tcBorders>
+          </w:tcPr>
+          <w:p>
+            <w:r>
+              <w:rPr>
+                <w:sz w:val="20"/>
+              </w:rPr>
+              <w:t>Router()</w:t>
+            </w:r>
+          </w:p>
+        </w:tc>
+        <w:tc>
+          <w:tcPr>
+            <w:tcW w:type="dxa" w:w="3230"/>
+            <w:shd w:val="clear" w:color="auto" w:fill="B8B3D6"/>
+            <w:tcBorders>
+              <w:top w:val="single" w:sz="4" w:space="0" w:color="CBCBCB"/>
+              <w:left w:val="single" w:sz="4" w:space="0" w:color="CBCBCB"/>
+              <w:bottom w:val="single" w:sz="4" w:space="0" w:color="CBCBCB"/>
+              <w:right w:val="single" w:sz="4" w:space="0" w:color="CBCBCB"/>
+            </w:tcBorders>
+          </w:tcPr>
+          <w:p>
+            <w:r>
+              <w:rPr>
+                <w:sz w:val="20"/>
+              </w:rPr>
+              <w:t>CONFIRMED</w:t>
+            </w:r>
+          </w:p>
+        </w:tc>
+      </w:tr>
+      <w:tr>
+        <w:tc>
+          <w:tcPr>
+            <w:tcW w:type="dxa" w:w="3230"/>
+            <w:tcBorders>
+              <w:top w:val="single" w:sz="4" w:space="0" w:color="CBCBCB"/>
+              <w:left w:val="single" w:sz="4" w:space="0" w:color="CBCBCB"/>
+              <w:bottom w:val="single" w:sz="4" w:space="0" w:color="CBCBCB"/>
+              <w:right w:val="single" w:sz="4" w:space="0" w:color="CBCBCB"/>
+            </w:tcBorders>
+          </w:tcPr>
+          <w:p>
+            <w:r>
+              <w:rPr>
+                <w:sz w:val="20"/>
+              </w:rPr>
+              <w:t>Imports</w:t>
+            </w:r>
+          </w:p>
+        </w:tc>
+        <w:tc>
+          <w:tcPr>
+            <w:tcW w:type="dxa" w:w="3230"/>
+            <w:tcBorders>
+              <w:top w:val="single" w:sz="4" w:space="0" w:color="CBCBCB"/>
+              <w:left w:val="single" w:sz="4" w:space="0" w:color="CBCBCB"/>
+              <w:bottom w:val="single" w:sz="4" w:space="0" w:color="CBCBCB"/>
+              <w:right w:val="single" w:sz="4" w:space="0" w:color="CBCBCB"/>
+            </w:tcBorders>
+          </w:tcPr>
+          <w:p>
+            <w:r>
+              <w:rPr>
+                <w:sz w:val="20"/>
+              </w:rPr>
+              <w:t>db</w:t>
+            </w:r>
+          </w:p>
+        </w:tc>
+        <w:tc>
+          <w:tcPr>
+            <w:tcW w:type="dxa" w:w="3230"/>
+            <w:tcBorders>
+              <w:top w:val="single" w:sz="4" w:space="0" w:color="CBCBCB"/>
+              <w:left w:val="single" w:sz="4" w:space="0" w:color="CBCBCB"/>
+              <w:bottom w:val="single" w:sz="4" w:space="0" w:color="CBCBCB"/>
+              <w:right w:val="single" w:sz="4" w:space="0" w:color="CBCBCB"/>
+            </w:tcBorders>
+          </w:tcPr>
+          <w:p>
+            <w:r>
+              <w:rPr>
+                <w:sz w:val="20"/>
+              </w:rPr>
+              <w:t>CONFIRMED</w:t>
+            </w:r>
+          </w:p>
+        </w:tc>
+      </w:tr>
+      <w:tr>
+        <w:tc>
+          <w:tcPr>
+            <w:tcW w:type="dxa" w:w="3230"/>
+            <w:shd w:val="clear" w:color="auto" w:fill="B8B3D6"/>
+            <w:tcBorders>
+              <w:top w:val="single" w:sz="4" w:space="0" w:color="CBCBCB"/>
+              <w:left w:val="single" w:sz="4" w:space="0" w:color="CBCBCB"/>
+              <w:bottom w:val="single" w:sz="4" w:space="0" w:color="CBCBCB"/>
+              <w:right w:val="single" w:sz="4" w:space="0" w:color="CBCBCB"/>
+            </w:tcBorders>
+          </w:tcPr>
+          <w:p>
+            <w:r>
+              <w:rPr>
+                <w:sz w:val="20"/>
+              </w:rPr>
+              <w:t>Callers/Used-by</w:t>
+            </w:r>
+          </w:p>
+        </w:tc>
+        <w:tc>
+          <w:tcPr>
+            <w:tcW w:type="dxa" w:w="3230"/>
+            <w:shd w:val="clear" w:color="auto" w:fill="B8B3D6"/>
+            <w:tcBorders>
+              <w:top w:val="single" w:sz="4" w:space="0" w:color="CBCBCB"/>
+              <w:left w:val="single" w:sz="4" w:space="0" w:color="CBCBCB"/>
+              <w:bottom w:val="single" w:sz="4" w:space="0" w:color="CBCBCB"/>
+              <w:right w:val="single" w:sz="4" w:space="0" w:color="CBCBCB"/>
+            </w:tcBorders>
+          </w:tcPr>
+          <w:p>
+            <w:r>
+              <w:rPr>
+                <w:sz w:val="20"/>
+              </w:rPr>
+              <w:t>index.js (mounted /api/jobs)</w:t>
+            </w:r>
+          </w:p>
+        </w:tc>
+        <w:tc>
+          <w:tcPr>
+            <w:tcW w:type="dxa" w:w="3230"/>
+            <w:shd w:val="clear" w:color="auto" w:fill="B8B3D6"/>
+            <w:tcBorders>
+              <w:top w:val="single" w:sz="4" w:space="0" w:color="CBCBCB"/>
+              <w:left w:val="single" w:sz="4" w:space="0" w:color="CBCBCB"/>
+              <w:bottom w:val="single" w:sz="4" w:space="0" w:color="CBCBCB"/>
+              <w:right w:val="single" w:sz="4" w:space="0" w:color="CBCBCB"/>
+            </w:tcBorders>
+          </w:tcPr>
+          <w:p>
+            <w:r>
+              <w:rPr>
+                <w:sz w:val="20"/>
+              </w:rPr>
+              <w:t>CONFIRMED</w:t>
+            </w:r>
+          </w:p>
+        </w:tc>
+      </w:tr>
+      <w:tr>
+        <w:tc>
+          <w:tcPr>
+            <w:tcW w:type="dxa" w:w="3230"/>
+            <w:tcBorders>
+              <w:top w:val="single" w:sz="4" w:space="0" w:color="CBCBCB"/>
+              <w:left w:val="single" w:sz="4" w:space="0" w:color="CBCBCB"/>
+              <w:bottom w:val="single" w:sz="4" w:space="0" w:color="CBCBCB"/>
+              <w:right w:val="single" w:sz="4" w:space="0" w:color="CBCBCB"/>
+            </w:tcBorders>
+          </w:tcPr>
+          <w:p>
+            <w:r>
+              <w:rPr>
+                <w:sz w:val="20"/>
+              </w:rPr>
+              <w:t>Last verified</w:t>
+            </w:r>
+          </w:p>
+        </w:tc>
+        <w:tc>
+          <w:tcPr>
+            <w:tcW w:type="dxa" w:w="3230"/>
+            <w:tcBorders>
+              <w:top w:val="single" w:sz="4" w:space="0" w:color="CBCBCB"/>
+              <w:left w:val="single" w:sz="4" w:space="0" w:color="CBCBCB"/>
+              <w:bottom w:val="single" w:sz="4" w:space="0" w:color="CBCBCB"/>
+              <w:right w:val="single" w:sz="4" w:space="0" w:color="CBCBCB"/>
+            </w:tcBorders>
+          </w:tcPr>
+          <w:p>
+            <w:r>
+              <w:rPr>
+                <w:sz w:val="20"/>
+              </w:rPr>
+              <w:t>2026-08-04 (STEP-1.2)</w:t>
+            </w:r>
+          </w:p>
+        </w:tc>
+        <w:tc>
+          <w:tcPr>
+            <w:tcW w:type="dxa" w:w="3230"/>
+            <w:tcBorders>
+              <w:top w:val="single" w:sz="4" w:space="0" w:color="CBCBCB"/>
+              <w:left w:val="single" w:sz="4" w:space="0" w:color="CBCBCB"/>
+              <w:bottom w:val="single" w:sz="4" w:space="0" w:color="CBCBCB"/>
+              <w:right w:val="single" w:sz="4" w:space="0" w:color="CBCBCB"/>
+            </w:tcBorders>
+          </w:tcPr>
+          <w:p>
+            <w:r>
+              <w:rPr>
+                <w:sz w:val="20"/>
+              </w:rPr>
+              <w:t>-</w:t>
+            </w:r>
+          </w:p>
+        </w:tc>
+      </w:tr>
+    </w:tbl>
+    <w:p/>
+    <w:tbl>
+      <w:tblPr>
+        <w:tblStyle w:val="TableGrid"/>
+        <w:tblW w:type="auto" w:w="0"/>
+        <w:tblLook w:firstColumn="1" w:firstRow="1" w:lastColumn="0" w:lastRow="0" w:noHBand="0" w:noVBand="1" w:val="04A0"/>
+      </w:tblPr>
+      <w:tblGrid>
+        <w:gridCol w:w="2422"/>
+        <w:gridCol w:w="2422"/>
+        <w:gridCol w:w="2422"/>
+        <w:gridCol w:w="2422"/>
+      </w:tblGrid>
+      <w:tr>
+        <w:tc>
+          <w:tcPr>
+            <w:tcW w:type="dxa" w:w="2422"/>
+            <w:shd w:val="clear" w:color="auto" w:fill="251C53"/>
+            <w:tcBorders>
+              <w:top w:val="single" w:sz="4" w:space="0" w:color="251C53"/>
+              <w:left w:val="single" w:sz="4" w:space="0" w:color="251C53"/>
+              <w:bottom w:val="single" w:sz="4" w:space="0" w:color="251C53"/>
+              <w:right w:val="single" w:sz="4" w:space="0" w:color="251C53"/>
+            </w:tcBorders>
+          </w:tcPr>
+          <w:p>
+            <w:r>
+              <w:rPr>
+                <w:b/>
+                <w:color w:val="FFFFFF"/>
+                <w:sz w:val="20"/>
+              </w:rPr>
+              <w:t>Method</w:t>
+            </w:r>
+          </w:p>
+        </w:tc>
+        <w:tc>
+          <w:tcPr>
+            <w:tcW w:type="dxa" w:w="2422"/>
+            <w:shd w:val="clear" w:color="auto" w:fill="251C53"/>
+            <w:tcBorders>
+              <w:top w:val="single" w:sz="4" w:space="0" w:color="251C53"/>
+              <w:left w:val="single" w:sz="4" w:space="0" w:color="251C53"/>
+              <w:bottom w:val="single" w:sz="4" w:space="0" w:color="251C53"/>
+              <w:right w:val="single" w:sz="4" w:space="0" w:color="251C53"/>
+            </w:tcBorders>
+          </w:tcPr>
+          <w:p>
+            <w:r>
+              <w:rPr>
+                <w:b/>
+                <w:color w:val="FFFFFF"/>
+                <w:sz w:val="20"/>
+              </w:rPr>
+              <w:t>Path</w:t>
+            </w:r>
+          </w:p>
+        </w:tc>
+        <w:tc>
+          <w:tcPr>
+            <w:tcW w:type="dxa" w:w="2422"/>
+            <w:shd w:val="clear" w:color="auto" w:fill="251C53"/>
+            <w:tcBorders>
+              <w:top w:val="single" w:sz="4" w:space="0" w:color="251C53"/>
+              <w:left w:val="single" w:sz="4" w:space="0" w:color="251C53"/>
+              <w:bottom w:val="single" w:sz="4" w:space="0" w:color="251C53"/>
+              <w:right w:val="single" w:sz="4" w:space="0" w:color="251C53"/>
+            </w:tcBorders>
+          </w:tcPr>
+          <w:p>
+            <w:r>
+              <w:rPr>
+                <w:b/>
+                <w:color w:val="FFFFFF"/>
+                <w:sz w:val="20"/>
+              </w:rPr>
+              <w:t>File:Line</w:t>
+            </w:r>
+          </w:p>
+        </w:tc>
+        <w:tc>
+          <w:tcPr>
+            <w:tcW w:type="dxa" w:w="2422"/>
+            <w:shd w:val="clear" w:color="auto" w:fill="251C53"/>
+            <w:tcBorders>
+              <w:top w:val="single" w:sz="4" w:space="0" w:color="251C53"/>
+              <w:left w:val="single" w:sz="4" w:space="0" w:color="251C53"/>
+              <w:bottom w:val="single" w:sz="4" w:space="0" w:color="251C53"/>
+              <w:right w:val="single" w:sz="4" w:space="0" w:color="251C53"/>
+            </w:tcBorders>
+          </w:tcPr>
+          <w:p>
+            <w:r>
+              <w:rPr>
+                <w:b/>
+                <w:color w:val="FFFFFF"/>
+                <w:sz w:val="20"/>
+              </w:rPr>
+              <w:t>Mô tả</w:t>
+            </w:r>
+          </w:p>
+        </w:tc>
+      </w:tr>
+      <w:tr>
+        <w:tc>
+          <w:tcPr>
+            <w:tcW w:type="dxa" w:w="2422"/>
+            <w:tcBorders>
+              <w:top w:val="single" w:sz="4" w:space="0" w:color="CBCBCB"/>
+              <w:left w:val="single" w:sz="4" w:space="0" w:color="CBCBCB"/>
+              <w:bottom w:val="single" w:sz="4" w:space="0" w:color="CBCBCB"/>
+              <w:right w:val="single" w:sz="4" w:space="0" w:color="CBCBCB"/>
+            </w:tcBorders>
+          </w:tcPr>
+          <w:p>
+            <w:r>
+              <w:rPr>
+                <w:sz w:val="20"/>
+              </w:rPr>
+              <w:t>---</w:t>
+            </w:r>
+          </w:p>
+        </w:tc>
+        <w:tc>
+          <w:tcPr>
+            <w:tcW w:type="dxa" w:w="2422"/>
+            <w:tcBorders>
+              <w:top w:val="single" w:sz="4" w:space="0" w:color="CBCBCB"/>
+              <w:left w:val="single" w:sz="4" w:space="0" w:color="CBCBCB"/>
+              <w:bottom w:val="single" w:sz="4" w:space="0" w:color="CBCBCB"/>
+              <w:right w:val="single" w:sz="4" w:space="0" w:color="CBCBCB"/>
+            </w:tcBorders>
+          </w:tcPr>
+          <w:p>
+            <w:r>
+              <w:rPr>
+                <w:sz w:val="20"/>
+              </w:rPr>
+              <w:t>---</w:t>
+            </w:r>
+          </w:p>
+        </w:tc>
+        <w:tc>
+          <w:tcPr>
+            <w:tcW w:type="dxa" w:w="2422"/>
+            <w:tcBorders>
+              <w:top w:val="single" w:sz="4" w:space="0" w:color="CBCBCB"/>
+              <w:left w:val="single" w:sz="4" w:space="0" w:color="CBCBCB"/>
+              <w:bottom w:val="single" w:sz="4" w:space="0" w:color="CBCBCB"/>
+              <w:right w:val="single" w:sz="4" w:space="0" w:color="CBCBCB"/>
+            </w:tcBorders>
+          </w:tcPr>
+          <w:p>
+            <w:r>
+              <w:rPr>
+                <w:sz w:val="20"/>
+              </w:rPr>
+              <w:t>---</w:t>
+            </w:r>
+          </w:p>
+        </w:tc>
+        <w:tc>
+          <w:tcPr>
+            <w:tcW w:type="dxa" w:w="2422"/>
+            <w:tcBorders>
+              <w:top w:val="single" w:sz="4" w:space="0" w:color="CBCBCB"/>
+              <w:left w:val="single" w:sz="4" w:space="0" w:color="CBCBCB"/>
+              <w:bottom w:val="single" w:sz="4" w:space="0" w:color="CBCBCB"/>
+              <w:right w:val="single" w:sz="4" w:space="0" w:color="CBCBCB"/>
+            </w:tcBorders>
+          </w:tcPr>
+          <w:p>
+            <w:r>
+              <w:rPr>
+                <w:sz w:val="20"/>
+              </w:rPr>
+              <w:t>---</w:t>
+            </w:r>
+          </w:p>
+        </w:tc>
+      </w:tr>
+      <w:tr>
+        <w:tc>
+          <w:tcPr>
+            <w:tcW w:type="dxa" w:w="2422"/>
+            <w:shd w:val="clear" w:color="auto" w:fill="B8B3D6"/>
+            <w:tcBorders>
+              <w:top w:val="single" w:sz="4" w:space="0" w:color="CBCBCB"/>
+              <w:left w:val="single" w:sz="4" w:space="0" w:color="CBCBCB"/>
+              <w:bottom w:val="single" w:sz="4" w:space="0" w:color="CBCBCB"/>
+              <w:right w:val="single" w:sz="4" w:space="0" w:color="CBCBCB"/>
+            </w:tcBorders>
+          </w:tcPr>
+          <w:p>
+            <w:r>
+              <w:rPr>
+                <w:sz w:val="20"/>
+              </w:rPr>
+              <w:t>GET</w:t>
+            </w:r>
+          </w:p>
+        </w:tc>
+        <w:tc>
+          <w:tcPr>
+            <w:tcW w:type="dxa" w:w="2422"/>
+            <w:shd w:val="clear" w:color="auto" w:fill="B8B3D6"/>
+            <w:tcBorders>
+              <w:top w:val="single" w:sz="4" w:space="0" w:color="CBCBCB"/>
+              <w:left w:val="single" w:sz="4" w:space="0" w:color="CBCBCB"/>
+              <w:bottom w:val="single" w:sz="4" w:space="0" w:color="CBCBCB"/>
+              <w:right w:val="single" w:sz="4" w:space="0" w:color="CBCBCB"/>
+            </w:tcBorders>
+          </w:tcPr>
+          <w:p>
+            <w:r>
+              <w:rPr>
+                <w:rFonts w:ascii="Courier New" w:hAnsi="Courier New"/>
+                <w:color w:val="F05922"/>
+                <w:sz w:val="20"/>
+              </w:rPr>
+              <w:t>/</w:t>
+            </w:r>
+          </w:p>
+        </w:tc>
+        <w:tc>
+          <w:tcPr>
+            <w:tcW w:type="dxa" w:w="2422"/>
+            <w:shd w:val="clear" w:color="auto" w:fill="B8B3D6"/>
+            <w:tcBorders>
+              <w:top w:val="single" w:sz="4" w:space="0" w:color="CBCBCB"/>
+              <w:left w:val="single" w:sz="4" w:space="0" w:color="CBCBCB"/>
+              <w:bottom w:val="single" w:sz="4" w:space="0" w:color="CBCBCB"/>
+              <w:right w:val="single" w:sz="4" w:space="0" w:color="CBCBCB"/>
+            </w:tcBorders>
+          </w:tcPr>
+          <w:p>
+            <w:r>
+              <w:rPr>
+                <w:sz w:val="20"/>
+              </w:rPr>
+              <w:t>jobs.js:~22</w:t>
+            </w:r>
+          </w:p>
+        </w:tc>
+        <w:tc>
+          <w:tcPr>
+            <w:tcW w:type="dxa" w:w="2422"/>
+            <w:shd w:val="clear" w:color="auto" w:fill="B8B3D6"/>
+            <w:tcBorders>
+              <w:top w:val="single" w:sz="4" w:space="0" w:color="CBCBCB"/>
+              <w:left w:val="single" w:sz="4" w:space="0" w:color="CBCBCB"/>
+              <w:bottom w:val="single" w:sz="4" w:space="0" w:color="CBCBCB"/>
+              <w:right w:val="single" w:sz="4" w:space="0" w:color="CBCBCB"/>
+            </w:tcBorders>
+          </w:tcPr>
+          <w:p>
+            <w:r>
+              <w:rPr>
+                <w:sz w:val="20"/>
+              </w:rPr>
+              <w:t xml:space="preserve">List jobs by projectId (query param </w:t>
+            </w:r>
+            <w:r>
+              <w:rPr>
+                <w:rFonts w:ascii="Courier New" w:hAnsi="Courier New"/>
+                <w:color w:val="F05922"/>
+                <w:sz w:val="20"/>
+              </w:rPr>
+              <w:t>?projectId=</w:t>
+            </w:r>
+            <w:r>
+              <w:rPr>
+                <w:sz w:val="20"/>
+              </w:rPr>
+              <w:t>) — ORDER BY created_at DESC</w:t>
+            </w:r>
+          </w:p>
+        </w:tc>
+      </w:tr>
+      <w:tr>
+        <w:tc>
+          <w:tcPr>
+            <w:tcW w:type="dxa" w:w="2422"/>
+            <w:tcBorders>
+              <w:top w:val="single" w:sz="4" w:space="0" w:color="CBCBCB"/>
+              <w:left w:val="single" w:sz="4" w:space="0" w:color="CBCBCB"/>
+              <w:bottom w:val="single" w:sz="4" w:space="0" w:color="CBCBCB"/>
+              <w:right w:val="single" w:sz="4" w:space="0" w:color="CBCBCB"/>
+            </w:tcBorders>
+          </w:tcPr>
+          <w:p>
+            <w:r>
+              <w:rPr>
+                <w:sz w:val="20"/>
+              </w:rPr>
+              <w:t>GET</w:t>
+            </w:r>
+          </w:p>
+        </w:tc>
+        <w:tc>
+          <w:tcPr>
+            <w:tcW w:type="dxa" w:w="2422"/>
+            <w:tcBorders>
+              <w:top w:val="single" w:sz="4" w:space="0" w:color="CBCBCB"/>
+              <w:left w:val="single" w:sz="4" w:space="0" w:color="CBCBCB"/>
+              <w:bottom w:val="single" w:sz="4" w:space="0" w:color="CBCBCB"/>
+              <w:right w:val="single" w:sz="4" w:space="0" w:color="CBCBCB"/>
+            </w:tcBorders>
+          </w:tcPr>
+          <w:p>
+            <w:r>
+              <w:rPr>
+                <w:rFonts w:ascii="Courier New" w:hAnsi="Courier New"/>
+                <w:color w:val="F05922"/>
+                <w:sz w:val="20"/>
+              </w:rPr>
+              <w:t>/:id</w:t>
+            </w:r>
+          </w:p>
+        </w:tc>
+        <w:tc>
+          <w:tcPr>
+            <w:tcW w:type="dxa" w:w="2422"/>
+            <w:tcBorders>
+              <w:top w:val="single" w:sz="4" w:space="0" w:color="CBCBCB"/>
+              <w:left w:val="single" w:sz="4" w:space="0" w:color="CBCBCB"/>
+              <w:bottom w:val="single" w:sz="4" w:space="0" w:color="CBCBCB"/>
+              <w:right w:val="single" w:sz="4" w:space="0" w:color="CBCBCB"/>
+            </w:tcBorders>
+          </w:tcPr>
+          <w:p>
+            <w:r>
+              <w:rPr>
+                <w:sz w:val="20"/>
+              </w:rPr>
+              <w:t>jobs.js:~31</w:t>
+            </w:r>
+          </w:p>
+        </w:tc>
+        <w:tc>
+          <w:tcPr>
+            <w:tcW w:type="dxa" w:w="2422"/>
+            <w:tcBorders>
+              <w:top w:val="single" w:sz="4" w:space="0" w:color="CBCBCB"/>
+              <w:left w:val="single" w:sz="4" w:space="0" w:color="CBCBCB"/>
+              <w:bottom w:val="single" w:sz="4" w:space="0" w:color="CBCBCB"/>
+              <w:right w:val="single" w:sz="4" w:space="0" w:color="CBCBCB"/>
+            </w:tcBorders>
+          </w:tcPr>
+          <w:p>
+            <w:r>
+              <w:rPr>
+                <w:sz w:val="20"/>
+              </w:rPr>
+              <w:t>Get single job by id</w:t>
+            </w:r>
+          </w:p>
+        </w:tc>
+      </w:tr>
+      <w:tr>
+        <w:tc>
+          <w:tcPr>
+            <w:tcW w:type="dxa" w:w="2422"/>
+            <w:shd w:val="clear" w:color="auto" w:fill="B8B3D6"/>
+            <w:tcBorders>
+              <w:top w:val="single" w:sz="4" w:space="0" w:color="CBCBCB"/>
+              <w:left w:val="single" w:sz="4" w:space="0" w:color="CBCBCB"/>
+              <w:bottom w:val="single" w:sz="4" w:space="0" w:color="CBCBCB"/>
+              <w:right w:val="single" w:sz="4" w:space="0" w:color="CBCBCB"/>
+            </w:tcBorders>
+          </w:tcPr>
+          <w:p>
+            <w:r>
+              <w:rPr>
+                <w:sz w:val="20"/>
+              </w:rPr>
+              <w:t>DELETE</w:t>
+            </w:r>
+          </w:p>
+        </w:tc>
+        <w:tc>
+          <w:tcPr>
+            <w:tcW w:type="dxa" w:w="2422"/>
+            <w:shd w:val="clear" w:color="auto" w:fill="B8B3D6"/>
+            <w:tcBorders>
+              <w:top w:val="single" w:sz="4" w:space="0" w:color="CBCBCB"/>
+              <w:left w:val="single" w:sz="4" w:space="0" w:color="CBCBCB"/>
+              <w:bottom w:val="single" w:sz="4" w:space="0" w:color="CBCBCB"/>
+              <w:right w:val="single" w:sz="4" w:space="0" w:color="CBCBCB"/>
+            </w:tcBorders>
+          </w:tcPr>
+          <w:p>
+            <w:r>
+              <w:rPr>
+                <w:rFonts w:ascii="Courier New" w:hAnsi="Courier New"/>
+                <w:color w:val="F05922"/>
+                <w:sz w:val="20"/>
+              </w:rPr>
+              <w:t>/:id</w:t>
+            </w:r>
+          </w:p>
+        </w:tc>
+        <w:tc>
+          <w:tcPr>
+            <w:tcW w:type="dxa" w:w="2422"/>
+            <w:shd w:val="clear" w:color="auto" w:fill="B8B3D6"/>
+            <w:tcBorders>
+              <w:top w:val="single" w:sz="4" w:space="0" w:color="CBCBCB"/>
+              <w:left w:val="single" w:sz="4" w:space="0" w:color="CBCBCB"/>
+              <w:bottom w:val="single" w:sz="4" w:space="0" w:color="CBCBCB"/>
+              <w:right w:val="single" w:sz="4" w:space="0" w:color="CBCBCB"/>
+            </w:tcBorders>
+          </w:tcPr>
+          <w:p>
+            <w:r>
+              <w:rPr>
+                <w:sz w:val="20"/>
+              </w:rPr>
+              <w:t>jobs.js:~37</w:t>
+            </w:r>
+          </w:p>
+        </w:tc>
+        <w:tc>
+          <w:tcPr>
+            <w:tcW w:type="dxa" w:w="2422"/>
+            <w:shd w:val="clear" w:color="auto" w:fill="B8B3D6"/>
+            <w:tcBorders>
+              <w:top w:val="single" w:sz="4" w:space="0" w:color="CBCBCB"/>
+              <w:left w:val="single" w:sz="4" w:space="0" w:color="CBCBCB"/>
+              <w:bottom w:val="single" w:sz="4" w:space="0" w:color="CBCBCB"/>
+              <w:right w:val="single" w:sz="4" w:space="0" w:color="CBCBCB"/>
+            </w:tcBorders>
+          </w:tcPr>
+          <w:p>
+            <w:r>
+              <w:rPr>
+                <w:sz w:val="20"/>
+              </w:rPr>
+              <w:t>Delete job record</w:t>
+            </w:r>
+          </w:p>
+        </w:tc>
+      </w:tr>
+    </w:tbl>
+    <w:p/>
+    <w:p>
+      <w:pPr>
+        <w:spacing w:after="80"/>
+      </w:pPr>
+      <w:r>
+        <w:rPr>
+          <w:b/>
+          <w:sz w:val="21"/>
+        </w:rPr>
+        <w:t>Response shape (`normalizeJob`):</w:t>
+      </w:r>
+      <w:r>
+        <w:rPr>
+          <w:sz w:val="21"/>
+        </w:rPr>
+        <w:t xml:space="preserve"> </w:t>
+      </w:r>
+      <w:r>
+        <w:rPr>
+          <w:rFonts w:ascii="Courier New" w:hAnsi="Courier New"/>
+          <w:color w:val="F05922"/>
+          <w:sz w:val="18"/>
+        </w:rPr>
+        <w:t>{id, projectId, status, total, done, created, failed, modelId, error, unmatchedClasses[], createdAt, updatedAt}</w:t>
       </w:r>
     </w:p>
     <w:p>
@@ -16821,6 +18031,985 @@
     </w:p>
     <w:p>
       <w:pPr>
+        <w:pStyle w:val="Heading3"/>
+        <w:spacing w:before="160" w:after="60"/>
+      </w:pPr>
+      <w:r>
+        <w:rPr>
+          <w:color w:val="4A3F8C"/>
+          <w:sz w:val="24"/>
+        </w:rPr>
+        <w:t>Bảng `jobs` — STEP-1.2 MỚI</w:t>
+      </w:r>
+    </w:p>
+    <w:tbl>
+      <w:tblPr>
+        <w:tblStyle w:val="TableGrid"/>
+        <w:tblW w:type="auto" w:w="0"/>
+        <w:tblLook w:firstColumn="1" w:firstRow="1" w:lastColumn="0" w:lastRow="0" w:noHBand="0" w:noVBand="1" w:val="04A0"/>
+      </w:tblPr>
+      <w:tblGrid>
+        <w:gridCol w:w="3230"/>
+        <w:gridCol w:w="3230"/>
+        <w:gridCol w:w="3230"/>
+      </w:tblGrid>
+      <w:tr>
+        <w:tc>
+          <w:tcPr>
+            <w:tcW w:type="dxa" w:w="3230"/>
+            <w:shd w:val="clear" w:color="auto" w:fill="251C53"/>
+            <w:tcBorders>
+              <w:top w:val="single" w:sz="4" w:space="0" w:color="251C53"/>
+              <w:left w:val="single" w:sz="4" w:space="0" w:color="251C53"/>
+              <w:bottom w:val="single" w:sz="4" w:space="0" w:color="251C53"/>
+              <w:right w:val="single" w:sz="4" w:space="0" w:color="251C53"/>
+            </w:tcBorders>
+          </w:tcPr>
+          <w:p>
+            <w:r>
+              <w:rPr>
+                <w:b/>
+                <w:color w:val="FFFFFF"/>
+                <w:sz w:val="20"/>
+              </w:rPr>
+              <w:t>Cột</w:t>
+            </w:r>
+          </w:p>
+        </w:tc>
+        <w:tc>
+          <w:tcPr>
+            <w:tcW w:type="dxa" w:w="3230"/>
+            <w:shd w:val="clear" w:color="auto" w:fill="251C53"/>
+            <w:tcBorders>
+              <w:top w:val="single" w:sz="4" w:space="0" w:color="251C53"/>
+              <w:left w:val="single" w:sz="4" w:space="0" w:color="251C53"/>
+              <w:bottom w:val="single" w:sz="4" w:space="0" w:color="251C53"/>
+              <w:right w:val="single" w:sz="4" w:space="0" w:color="251C53"/>
+            </w:tcBorders>
+          </w:tcPr>
+          <w:p>
+            <w:r>
+              <w:rPr>
+                <w:b/>
+                <w:color w:val="FFFFFF"/>
+                <w:sz w:val="20"/>
+              </w:rPr>
+              <w:t>Kiểu</w:t>
+            </w:r>
+          </w:p>
+        </w:tc>
+        <w:tc>
+          <w:tcPr>
+            <w:tcW w:type="dxa" w:w="3230"/>
+            <w:shd w:val="clear" w:color="auto" w:fill="251C53"/>
+            <w:tcBorders>
+              <w:top w:val="single" w:sz="4" w:space="0" w:color="251C53"/>
+              <w:left w:val="single" w:sz="4" w:space="0" w:color="251C53"/>
+              <w:bottom w:val="single" w:sz="4" w:space="0" w:color="251C53"/>
+              <w:right w:val="single" w:sz="4" w:space="0" w:color="251C53"/>
+            </w:tcBorders>
+          </w:tcPr>
+          <w:p>
+            <w:r>
+              <w:rPr>
+                <w:b/>
+                <w:color w:val="FFFFFF"/>
+                <w:sz w:val="20"/>
+              </w:rPr>
+              <w:t>Ràng buộc</w:t>
+            </w:r>
+          </w:p>
+        </w:tc>
+      </w:tr>
+      <w:tr>
+        <w:tc>
+          <w:tcPr>
+            <w:tcW w:type="dxa" w:w="3230"/>
+            <w:tcBorders>
+              <w:top w:val="single" w:sz="4" w:space="0" w:color="CBCBCB"/>
+              <w:left w:val="single" w:sz="4" w:space="0" w:color="CBCBCB"/>
+              <w:bottom w:val="single" w:sz="4" w:space="0" w:color="CBCBCB"/>
+              <w:right w:val="single" w:sz="4" w:space="0" w:color="CBCBCB"/>
+            </w:tcBorders>
+          </w:tcPr>
+          <w:p>
+            <w:r>
+              <w:rPr>
+                <w:sz w:val="20"/>
+              </w:rPr>
+              <w:t>---</w:t>
+            </w:r>
+          </w:p>
+        </w:tc>
+        <w:tc>
+          <w:tcPr>
+            <w:tcW w:type="dxa" w:w="3230"/>
+            <w:tcBorders>
+              <w:top w:val="single" w:sz="4" w:space="0" w:color="CBCBCB"/>
+              <w:left w:val="single" w:sz="4" w:space="0" w:color="CBCBCB"/>
+              <w:bottom w:val="single" w:sz="4" w:space="0" w:color="CBCBCB"/>
+              <w:right w:val="single" w:sz="4" w:space="0" w:color="CBCBCB"/>
+            </w:tcBorders>
+          </w:tcPr>
+          <w:p>
+            <w:r>
+              <w:rPr>
+                <w:sz w:val="20"/>
+              </w:rPr>
+              <w:t>---</w:t>
+            </w:r>
+          </w:p>
+        </w:tc>
+        <w:tc>
+          <w:tcPr>
+            <w:tcW w:type="dxa" w:w="3230"/>
+            <w:tcBorders>
+              <w:top w:val="single" w:sz="4" w:space="0" w:color="CBCBCB"/>
+              <w:left w:val="single" w:sz="4" w:space="0" w:color="CBCBCB"/>
+              <w:bottom w:val="single" w:sz="4" w:space="0" w:color="CBCBCB"/>
+              <w:right w:val="single" w:sz="4" w:space="0" w:color="CBCBCB"/>
+            </w:tcBorders>
+          </w:tcPr>
+          <w:p>
+            <w:r>
+              <w:rPr>
+                <w:sz w:val="20"/>
+              </w:rPr>
+              <w:t>---</w:t>
+            </w:r>
+          </w:p>
+        </w:tc>
+      </w:tr>
+      <w:tr>
+        <w:tc>
+          <w:tcPr>
+            <w:tcW w:type="dxa" w:w="3230"/>
+            <w:shd w:val="clear" w:color="auto" w:fill="B8B3D6"/>
+            <w:tcBorders>
+              <w:top w:val="single" w:sz="4" w:space="0" w:color="CBCBCB"/>
+              <w:left w:val="single" w:sz="4" w:space="0" w:color="CBCBCB"/>
+              <w:bottom w:val="single" w:sz="4" w:space="0" w:color="CBCBCB"/>
+              <w:right w:val="single" w:sz="4" w:space="0" w:color="CBCBCB"/>
+            </w:tcBorders>
+          </w:tcPr>
+          <w:p>
+            <w:r>
+              <w:rPr>
+                <w:sz w:val="20"/>
+              </w:rPr>
+              <w:t>id</w:t>
+            </w:r>
+          </w:p>
+        </w:tc>
+        <w:tc>
+          <w:tcPr>
+            <w:tcW w:type="dxa" w:w="3230"/>
+            <w:shd w:val="clear" w:color="auto" w:fill="B8B3D6"/>
+            <w:tcBorders>
+              <w:top w:val="single" w:sz="4" w:space="0" w:color="CBCBCB"/>
+              <w:left w:val="single" w:sz="4" w:space="0" w:color="CBCBCB"/>
+              <w:bottom w:val="single" w:sz="4" w:space="0" w:color="CBCBCB"/>
+              <w:right w:val="single" w:sz="4" w:space="0" w:color="CBCBCB"/>
+            </w:tcBorders>
+          </w:tcPr>
+          <w:p>
+            <w:r>
+              <w:rPr>
+                <w:sz w:val="20"/>
+              </w:rPr>
+              <w:t>TEXT</w:t>
+            </w:r>
+          </w:p>
+        </w:tc>
+        <w:tc>
+          <w:tcPr>
+            <w:tcW w:type="dxa" w:w="3230"/>
+            <w:shd w:val="clear" w:color="auto" w:fill="B8B3D6"/>
+            <w:tcBorders>
+              <w:top w:val="single" w:sz="4" w:space="0" w:color="CBCBCB"/>
+              <w:left w:val="single" w:sz="4" w:space="0" w:color="CBCBCB"/>
+              <w:bottom w:val="single" w:sz="4" w:space="0" w:color="CBCBCB"/>
+              <w:right w:val="single" w:sz="4" w:space="0" w:color="CBCBCB"/>
+            </w:tcBorders>
+          </w:tcPr>
+          <w:p>
+            <w:r>
+              <w:rPr>
+                <w:sz w:val="20"/>
+              </w:rPr>
+              <w:t>PRIMARY KEY</w:t>
+            </w:r>
+          </w:p>
+        </w:tc>
+      </w:tr>
+      <w:tr>
+        <w:tc>
+          <w:tcPr>
+            <w:tcW w:type="dxa" w:w="3230"/>
+            <w:tcBorders>
+              <w:top w:val="single" w:sz="4" w:space="0" w:color="CBCBCB"/>
+              <w:left w:val="single" w:sz="4" w:space="0" w:color="CBCBCB"/>
+              <w:bottom w:val="single" w:sz="4" w:space="0" w:color="CBCBCB"/>
+              <w:right w:val="single" w:sz="4" w:space="0" w:color="CBCBCB"/>
+            </w:tcBorders>
+          </w:tcPr>
+          <w:p>
+            <w:r>
+              <w:rPr>
+                <w:sz w:val="20"/>
+              </w:rPr>
+              <w:t>project_id</w:t>
+            </w:r>
+          </w:p>
+        </w:tc>
+        <w:tc>
+          <w:tcPr>
+            <w:tcW w:type="dxa" w:w="3230"/>
+            <w:tcBorders>
+              <w:top w:val="single" w:sz="4" w:space="0" w:color="CBCBCB"/>
+              <w:left w:val="single" w:sz="4" w:space="0" w:color="CBCBCB"/>
+              <w:bottom w:val="single" w:sz="4" w:space="0" w:color="CBCBCB"/>
+              <w:right w:val="single" w:sz="4" w:space="0" w:color="CBCBCB"/>
+            </w:tcBorders>
+          </w:tcPr>
+          <w:p>
+            <w:r>
+              <w:rPr>
+                <w:sz w:val="20"/>
+              </w:rPr>
+              <w:t>TEXT</w:t>
+            </w:r>
+          </w:p>
+        </w:tc>
+        <w:tc>
+          <w:tcPr>
+            <w:tcW w:type="dxa" w:w="3230"/>
+            <w:tcBorders>
+              <w:top w:val="single" w:sz="4" w:space="0" w:color="CBCBCB"/>
+              <w:left w:val="single" w:sz="4" w:space="0" w:color="CBCBCB"/>
+              <w:bottom w:val="single" w:sz="4" w:space="0" w:color="CBCBCB"/>
+              <w:right w:val="single" w:sz="4" w:space="0" w:color="CBCBCB"/>
+            </w:tcBorders>
+          </w:tcPr>
+          <w:p>
+            <w:r>
+              <w:rPr>
+                <w:sz w:val="20"/>
+              </w:rPr>
+              <w:t>NOT NULL (no FK — không CASCADE khi xóa project, job history giữ lại)</w:t>
+            </w:r>
+          </w:p>
+        </w:tc>
+      </w:tr>
+      <w:tr>
+        <w:tc>
+          <w:tcPr>
+            <w:tcW w:type="dxa" w:w="3230"/>
+            <w:shd w:val="clear" w:color="auto" w:fill="B8B3D6"/>
+            <w:tcBorders>
+              <w:top w:val="single" w:sz="4" w:space="0" w:color="CBCBCB"/>
+              <w:left w:val="single" w:sz="4" w:space="0" w:color="CBCBCB"/>
+              <w:bottom w:val="single" w:sz="4" w:space="0" w:color="CBCBCB"/>
+              <w:right w:val="single" w:sz="4" w:space="0" w:color="CBCBCB"/>
+            </w:tcBorders>
+          </w:tcPr>
+          <w:p>
+            <w:r>
+              <w:rPr>
+                <w:sz w:val="20"/>
+              </w:rPr>
+              <w:t>status</w:t>
+            </w:r>
+          </w:p>
+        </w:tc>
+        <w:tc>
+          <w:tcPr>
+            <w:tcW w:type="dxa" w:w="3230"/>
+            <w:shd w:val="clear" w:color="auto" w:fill="B8B3D6"/>
+            <w:tcBorders>
+              <w:top w:val="single" w:sz="4" w:space="0" w:color="CBCBCB"/>
+              <w:left w:val="single" w:sz="4" w:space="0" w:color="CBCBCB"/>
+              <w:bottom w:val="single" w:sz="4" w:space="0" w:color="CBCBCB"/>
+              <w:right w:val="single" w:sz="4" w:space="0" w:color="CBCBCB"/>
+            </w:tcBorders>
+          </w:tcPr>
+          <w:p>
+            <w:r>
+              <w:rPr>
+                <w:sz w:val="20"/>
+              </w:rPr>
+              <w:t>TEXT</w:t>
+            </w:r>
+          </w:p>
+        </w:tc>
+        <w:tc>
+          <w:tcPr>
+            <w:tcW w:type="dxa" w:w="3230"/>
+            <w:shd w:val="clear" w:color="auto" w:fill="B8B3D6"/>
+            <w:tcBorders>
+              <w:top w:val="single" w:sz="4" w:space="0" w:color="CBCBCB"/>
+              <w:left w:val="single" w:sz="4" w:space="0" w:color="CBCBCB"/>
+              <w:bottom w:val="single" w:sz="4" w:space="0" w:color="CBCBCB"/>
+              <w:right w:val="single" w:sz="4" w:space="0" w:color="CBCBCB"/>
+            </w:tcBorders>
+          </w:tcPr>
+          <w:p>
+            <w:r>
+              <w:rPr>
+                <w:sz w:val="20"/>
+              </w:rPr>
+              <w:t>NOT NULL DEFAULT 'pending' (pending/running/done/error)</w:t>
+            </w:r>
+          </w:p>
+        </w:tc>
+      </w:tr>
+      <w:tr>
+        <w:tc>
+          <w:tcPr>
+            <w:tcW w:type="dxa" w:w="3230"/>
+            <w:tcBorders>
+              <w:top w:val="single" w:sz="4" w:space="0" w:color="CBCBCB"/>
+              <w:left w:val="single" w:sz="4" w:space="0" w:color="CBCBCB"/>
+              <w:bottom w:val="single" w:sz="4" w:space="0" w:color="CBCBCB"/>
+              <w:right w:val="single" w:sz="4" w:space="0" w:color="CBCBCB"/>
+            </w:tcBorders>
+          </w:tcPr>
+          <w:p>
+            <w:r>
+              <w:rPr>
+                <w:sz w:val="20"/>
+              </w:rPr>
+              <w:t>total_images</w:t>
+            </w:r>
+          </w:p>
+        </w:tc>
+        <w:tc>
+          <w:tcPr>
+            <w:tcW w:type="dxa" w:w="3230"/>
+            <w:tcBorders>
+              <w:top w:val="single" w:sz="4" w:space="0" w:color="CBCBCB"/>
+              <w:left w:val="single" w:sz="4" w:space="0" w:color="CBCBCB"/>
+              <w:bottom w:val="single" w:sz="4" w:space="0" w:color="CBCBCB"/>
+              <w:right w:val="single" w:sz="4" w:space="0" w:color="CBCBCB"/>
+            </w:tcBorders>
+          </w:tcPr>
+          <w:p>
+            <w:r>
+              <w:rPr>
+                <w:sz w:val="20"/>
+              </w:rPr>
+              <w:t>INTEGER</w:t>
+            </w:r>
+          </w:p>
+        </w:tc>
+        <w:tc>
+          <w:tcPr>
+            <w:tcW w:type="dxa" w:w="3230"/>
+            <w:tcBorders>
+              <w:top w:val="single" w:sz="4" w:space="0" w:color="CBCBCB"/>
+              <w:left w:val="single" w:sz="4" w:space="0" w:color="CBCBCB"/>
+              <w:bottom w:val="single" w:sz="4" w:space="0" w:color="CBCBCB"/>
+              <w:right w:val="single" w:sz="4" w:space="0" w:color="CBCBCB"/>
+            </w:tcBorders>
+          </w:tcPr>
+          <w:p>
+            <w:r>
+              <w:rPr>
+                <w:sz w:val="20"/>
+              </w:rPr>
+              <w:t>NOT NULL DEFAULT 0</w:t>
+            </w:r>
+          </w:p>
+        </w:tc>
+      </w:tr>
+      <w:tr>
+        <w:tc>
+          <w:tcPr>
+            <w:tcW w:type="dxa" w:w="3230"/>
+            <w:shd w:val="clear" w:color="auto" w:fill="B8B3D6"/>
+            <w:tcBorders>
+              <w:top w:val="single" w:sz="4" w:space="0" w:color="CBCBCB"/>
+              <w:left w:val="single" w:sz="4" w:space="0" w:color="CBCBCB"/>
+              <w:bottom w:val="single" w:sz="4" w:space="0" w:color="CBCBCB"/>
+              <w:right w:val="single" w:sz="4" w:space="0" w:color="CBCBCB"/>
+            </w:tcBorders>
+          </w:tcPr>
+          <w:p>
+            <w:r>
+              <w:rPr>
+                <w:sz w:val="20"/>
+              </w:rPr>
+              <w:t>processed</w:t>
+            </w:r>
+          </w:p>
+        </w:tc>
+        <w:tc>
+          <w:tcPr>
+            <w:tcW w:type="dxa" w:w="3230"/>
+            <w:shd w:val="clear" w:color="auto" w:fill="B8B3D6"/>
+            <w:tcBorders>
+              <w:top w:val="single" w:sz="4" w:space="0" w:color="CBCBCB"/>
+              <w:left w:val="single" w:sz="4" w:space="0" w:color="CBCBCB"/>
+              <w:bottom w:val="single" w:sz="4" w:space="0" w:color="CBCBCB"/>
+              <w:right w:val="single" w:sz="4" w:space="0" w:color="CBCBCB"/>
+            </w:tcBorders>
+          </w:tcPr>
+          <w:p>
+            <w:r>
+              <w:rPr>
+                <w:sz w:val="20"/>
+              </w:rPr>
+              <w:t>INTEGER</w:t>
+            </w:r>
+          </w:p>
+        </w:tc>
+        <w:tc>
+          <w:tcPr>
+            <w:tcW w:type="dxa" w:w="3230"/>
+            <w:shd w:val="clear" w:color="auto" w:fill="B8B3D6"/>
+            <w:tcBorders>
+              <w:top w:val="single" w:sz="4" w:space="0" w:color="CBCBCB"/>
+              <w:left w:val="single" w:sz="4" w:space="0" w:color="CBCBCB"/>
+              <w:bottom w:val="single" w:sz="4" w:space="0" w:color="CBCBCB"/>
+              <w:right w:val="single" w:sz="4" w:space="0" w:color="CBCBCB"/>
+            </w:tcBorders>
+          </w:tcPr>
+          <w:p>
+            <w:r>
+              <w:rPr>
+                <w:sz w:val="20"/>
+              </w:rPr>
+              <w:t>NOT NULL DEFAULT 0 (ảnh đã xử lý xong)</w:t>
+            </w:r>
+          </w:p>
+        </w:tc>
+      </w:tr>
+      <w:tr>
+        <w:tc>
+          <w:tcPr>
+            <w:tcW w:type="dxa" w:w="3230"/>
+            <w:tcBorders>
+              <w:top w:val="single" w:sz="4" w:space="0" w:color="CBCBCB"/>
+              <w:left w:val="single" w:sz="4" w:space="0" w:color="CBCBCB"/>
+              <w:bottom w:val="single" w:sz="4" w:space="0" w:color="CBCBCB"/>
+              <w:right w:val="single" w:sz="4" w:space="0" w:color="CBCBCB"/>
+            </w:tcBorders>
+          </w:tcPr>
+          <w:p>
+            <w:r>
+              <w:rPr>
+                <w:sz w:val="20"/>
+              </w:rPr>
+              <w:t>created_annotations</w:t>
+            </w:r>
+          </w:p>
+        </w:tc>
+        <w:tc>
+          <w:tcPr>
+            <w:tcW w:type="dxa" w:w="3230"/>
+            <w:tcBorders>
+              <w:top w:val="single" w:sz="4" w:space="0" w:color="CBCBCB"/>
+              <w:left w:val="single" w:sz="4" w:space="0" w:color="CBCBCB"/>
+              <w:bottom w:val="single" w:sz="4" w:space="0" w:color="CBCBCB"/>
+              <w:right w:val="single" w:sz="4" w:space="0" w:color="CBCBCB"/>
+            </w:tcBorders>
+          </w:tcPr>
+          <w:p>
+            <w:r>
+              <w:rPr>
+                <w:sz w:val="20"/>
+              </w:rPr>
+              <w:t>INTEGER</w:t>
+            </w:r>
+          </w:p>
+        </w:tc>
+        <w:tc>
+          <w:tcPr>
+            <w:tcW w:type="dxa" w:w="3230"/>
+            <w:tcBorders>
+              <w:top w:val="single" w:sz="4" w:space="0" w:color="CBCBCB"/>
+              <w:left w:val="single" w:sz="4" w:space="0" w:color="CBCBCB"/>
+              <w:bottom w:val="single" w:sz="4" w:space="0" w:color="CBCBCB"/>
+              <w:right w:val="single" w:sz="4" w:space="0" w:color="CBCBCB"/>
+            </w:tcBorders>
+          </w:tcPr>
+          <w:p>
+            <w:r>
+              <w:rPr>
+                <w:sz w:val="20"/>
+              </w:rPr>
+              <w:t>NOT NULL DEFAULT 0</w:t>
+            </w:r>
+          </w:p>
+        </w:tc>
+      </w:tr>
+      <w:tr>
+        <w:tc>
+          <w:tcPr>
+            <w:tcW w:type="dxa" w:w="3230"/>
+            <w:shd w:val="clear" w:color="auto" w:fill="B8B3D6"/>
+            <w:tcBorders>
+              <w:top w:val="single" w:sz="4" w:space="0" w:color="CBCBCB"/>
+              <w:left w:val="single" w:sz="4" w:space="0" w:color="CBCBCB"/>
+              <w:bottom w:val="single" w:sz="4" w:space="0" w:color="CBCBCB"/>
+              <w:right w:val="single" w:sz="4" w:space="0" w:color="CBCBCB"/>
+            </w:tcBorders>
+          </w:tcPr>
+          <w:p>
+            <w:r>
+              <w:rPr>
+                <w:sz w:val="20"/>
+              </w:rPr>
+              <w:t>failed</w:t>
+            </w:r>
+          </w:p>
+        </w:tc>
+        <w:tc>
+          <w:tcPr>
+            <w:tcW w:type="dxa" w:w="3230"/>
+            <w:shd w:val="clear" w:color="auto" w:fill="B8B3D6"/>
+            <w:tcBorders>
+              <w:top w:val="single" w:sz="4" w:space="0" w:color="CBCBCB"/>
+              <w:left w:val="single" w:sz="4" w:space="0" w:color="CBCBCB"/>
+              <w:bottom w:val="single" w:sz="4" w:space="0" w:color="CBCBCB"/>
+              <w:right w:val="single" w:sz="4" w:space="0" w:color="CBCBCB"/>
+            </w:tcBorders>
+          </w:tcPr>
+          <w:p>
+            <w:r>
+              <w:rPr>
+                <w:sz w:val="20"/>
+              </w:rPr>
+              <w:t>INTEGER</w:t>
+            </w:r>
+          </w:p>
+        </w:tc>
+        <w:tc>
+          <w:tcPr>
+            <w:tcW w:type="dxa" w:w="3230"/>
+            <w:shd w:val="clear" w:color="auto" w:fill="B8B3D6"/>
+            <w:tcBorders>
+              <w:top w:val="single" w:sz="4" w:space="0" w:color="CBCBCB"/>
+              <w:left w:val="single" w:sz="4" w:space="0" w:color="CBCBCB"/>
+              <w:bottom w:val="single" w:sz="4" w:space="0" w:color="CBCBCB"/>
+              <w:right w:val="single" w:sz="4" w:space="0" w:color="CBCBCB"/>
+            </w:tcBorders>
+          </w:tcPr>
+          <w:p>
+            <w:r>
+              <w:rPr>
+                <w:sz w:val="20"/>
+              </w:rPr>
+              <w:t>NOT NULL DEFAULT 0</w:t>
+            </w:r>
+          </w:p>
+        </w:tc>
+      </w:tr>
+      <w:tr>
+        <w:tc>
+          <w:tcPr>
+            <w:tcW w:type="dxa" w:w="3230"/>
+            <w:tcBorders>
+              <w:top w:val="single" w:sz="4" w:space="0" w:color="CBCBCB"/>
+              <w:left w:val="single" w:sz="4" w:space="0" w:color="CBCBCB"/>
+              <w:bottom w:val="single" w:sz="4" w:space="0" w:color="CBCBCB"/>
+              <w:right w:val="single" w:sz="4" w:space="0" w:color="CBCBCB"/>
+            </w:tcBorders>
+          </w:tcPr>
+          <w:p>
+            <w:r>
+              <w:rPr>
+                <w:sz w:val="20"/>
+              </w:rPr>
+              <w:t>model_id</w:t>
+            </w:r>
+          </w:p>
+        </w:tc>
+        <w:tc>
+          <w:tcPr>
+            <w:tcW w:type="dxa" w:w="3230"/>
+            <w:tcBorders>
+              <w:top w:val="single" w:sz="4" w:space="0" w:color="CBCBCB"/>
+              <w:left w:val="single" w:sz="4" w:space="0" w:color="CBCBCB"/>
+              <w:bottom w:val="single" w:sz="4" w:space="0" w:color="CBCBCB"/>
+              <w:right w:val="single" w:sz="4" w:space="0" w:color="CBCBCB"/>
+            </w:tcBorders>
+          </w:tcPr>
+          <w:p>
+            <w:r>
+              <w:rPr>
+                <w:sz w:val="20"/>
+              </w:rPr>
+              <w:t>TEXT</w:t>
+            </w:r>
+          </w:p>
+        </w:tc>
+        <w:tc>
+          <w:tcPr>
+            <w:tcW w:type="dxa" w:w="3230"/>
+            <w:tcBorders>
+              <w:top w:val="single" w:sz="4" w:space="0" w:color="CBCBCB"/>
+              <w:left w:val="single" w:sz="4" w:space="0" w:color="CBCBCB"/>
+              <w:bottom w:val="single" w:sz="4" w:space="0" w:color="CBCBCB"/>
+              <w:right w:val="single" w:sz="4" w:space="0" w:color="CBCBCB"/>
+            </w:tcBorders>
+          </w:tcPr>
+          <w:p>
+            <w:r>
+              <w:rPr>
+                <w:sz w:val="20"/>
+              </w:rPr>
+              <w:t>nullable</w:t>
+            </w:r>
+          </w:p>
+        </w:tc>
+      </w:tr>
+      <w:tr>
+        <w:tc>
+          <w:tcPr>
+            <w:tcW w:type="dxa" w:w="3230"/>
+            <w:shd w:val="clear" w:color="auto" w:fill="B8B3D6"/>
+            <w:tcBorders>
+              <w:top w:val="single" w:sz="4" w:space="0" w:color="CBCBCB"/>
+              <w:left w:val="single" w:sz="4" w:space="0" w:color="CBCBCB"/>
+              <w:bottom w:val="single" w:sz="4" w:space="0" w:color="CBCBCB"/>
+              <w:right w:val="single" w:sz="4" w:space="0" w:color="CBCBCB"/>
+            </w:tcBorders>
+          </w:tcPr>
+          <w:p>
+            <w:r>
+              <w:rPr>
+                <w:sz w:val="20"/>
+              </w:rPr>
+              <w:t>error_msg</w:t>
+            </w:r>
+          </w:p>
+        </w:tc>
+        <w:tc>
+          <w:tcPr>
+            <w:tcW w:type="dxa" w:w="3230"/>
+            <w:shd w:val="clear" w:color="auto" w:fill="B8B3D6"/>
+            <w:tcBorders>
+              <w:top w:val="single" w:sz="4" w:space="0" w:color="CBCBCB"/>
+              <w:left w:val="single" w:sz="4" w:space="0" w:color="CBCBCB"/>
+              <w:bottom w:val="single" w:sz="4" w:space="0" w:color="CBCBCB"/>
+              <w:right w:val="single" w:sz="4" w:space="0" w:color="CBCBCB"/>
+            </w:tcBorders>
+          </w:tcPr>
+          <w:p>
+            <w:r>
+              <w:rPr>
+                <w:sz w:val="20"/>
+              </w:rPr>
+              <w:t>TEXT</w:t>
+            </w:r>
+          </w:p>
+        </w:tc>
+        <w:tc>
+          <w:tcPr>
+            <w:tcW w:type="dxa" w:w="3230"/>
+            <w:shd w:val="clear" w:color="auto" w:fill="B8B3D6"/>
+            <w:tcBorders>
+              <w:top w:val="single" w:sz="4" w:space="0" w:color="CBCBCB"/>
+              <w:left w:val="single" w:sz="4" w:space="0" w:color="CBCBCB"/>
+              <w:bottom w:val="single" w:sz="4" w:space="0" w:color="CBCBCB"/>
+              <w:right w:val="single" w:sz="4" w:space="0" w:color="CBCBCB"/>
+            </w:tcBorders>
+          </w:tcPr>
+          <w:p>
+            <w:r>
+              <w:rPr>
+                <w:sz w:val="20"/>
+              </w:rPr>
+              <w:t>nullable</w:t>
+            </w:r>
+          </w:p>
+        </w:tc>
+      </w:tr>
+      <w:tr>
+        <w:tc>
+          <w:tcPr>
+            <w:tcW w:type="dxa" w:w="3230"/>
+            <w:tcBorders>
+              <w:top w:val="single" w:sz="4" w:space="0" w:color="CBCBCB"/>
+              <w:left w:val="single" w:sz="4" w:space="0" w:color="CBCBCB"/>
+              <w:bottom w:val="single" w:sz="4" w:space="0" w:color="CBCBCB"/>
+              <w:right w:val="single" w:sz="4" w:space="0" w:color="CBCBCB"/>
+            </w:tcBorders>
+          </w:tcPr>
+          <w:p>
+            <w:r>
+              <w:rPr>
+                <w:sz w:val="20"/>
+              </w:rPr>
+              <w:t>unmatched_classes</w:t>
+            </w:r>
+          </w:p>
+        </w:tc>
+        <w:tc>
+          <w:tcPr>
+            <w:tcW w:type="dxa" w:w="3230"/>
+            <w:tcBorders>
+              <w:top w:val="single" w:sz="4" w:space="0" w:color="CBCBCB"/>
+              <w:left w:val="single" w:sz="4" w:space="0" w:color="CBCBCB"/>
+              <w:bottom w:val="single" w:sz="4" w:space="0" w:color="CBCBCB"/>
+              <w:right w:val="single" w:sz="4" w:space="0" w:color="CBCBCB"/>
+            </w:tcBorders>
+          </w:tcPr>
+          <w:p>
+            <w:r>
+              <w:rPr>
+                <w:sz w:val="20"/>
+              </w:rPr>
+              <w:t>TEXT</w:t>
+            </w:r>
+          </w:p>
+        </w:tc>
+        <w:tc>
+          <w:tcPr>
+            <w:tcW w:type="dxa" w:w="3230"/>
+            <w:tcBorders>
+              <w:top w:val="single" w:sz="4" w:space="0" w:color="CBCBCB"/>
+              <w:left w:val="single" w:sz="4" w:space="0" w:color="CBCBCB"/>
+              <w:bottom w:val="single" w:sz="4" w:space="0" w:color="CBCBCB"/>
+              <w:right w:val="single" w:sz="4" w:space="0" w:color="CBCBCB"/>
+            </w:tcBorders>
+          </w:tcPr>
+          <w:p>
+            <w:r>
+              <w:rPr>
+                <w:sz w:val="20"/>
+              </w:rPr>
+              <w:t>NOT NULL DEFAULT '[]' (JSON array tên class không map được)</w:t>
+            </w:r>
+          </w:p>
+        </w:tc>
+      </w:tr>
+      <w:tr>
+        <w:tc>
+          <w:tcPr>
+            <w:tcW w:type="dxa" w:w="3230"/>
+            <w:shd w:val="clear" w:color="auto" w:fill="B8B3D6"/>
+            <w:tcBorders>
+              <w:top w:val="single" w:sz="4" w:space="0" w:color="CBCBCB"/>
+              <w:left w:val="single" w:sz="4" w:space="0" w:color="CBCBCB"/>
+              <w:bottom w:val="single" w:sz="4" w:space="0" w:color="CBCBCB"/>
+              <w:right w:val="single" w:sz="4" w:space="0" w:color="CBCBCB"/>
+            </w:tcBorders>
+          </w:tcPr>
+          <w:p>
+            <w:r>
+              <w:rPr>
+                <w:sz w:val="20"/>
+              </w:rPr>
+              <w:t>created_at</w:t>
+            </w:r>
+          </w:p>
+        </w:tc>
+        <w:tc>
+          <w:tcPr>
+            <w:tcW w:type="dxa" w:w="3230"/>
+            <w:shd w:val="clear" w:color="auto" w:fill="B8B3D6"/>
+            <w:tcBorders>
+              <w:top w:val="single" w:sz="4" w:space="0" w:color="CBCBCB"/>
+              <w:left w:val="single" w:sz="4" w:space="0" w:color="CBCBCB"/>
+              <w:bottom w:val="single" w:sz="4" w:space="0" w:color="CBCBCB"/>
+              <w:right w:val="single" w:sz="4" w:space="0" w:color="CBCBCB"/>
+            </w:tcBorders>
+          </w:tcPr>
+          <w:p>
+            <w:r>
+              <w:rPr>
+                <w:sz w:val="20"/>
+              </w:rPr>
+              <w:t>TEXT</w:t>
+            </w:r>
+          </w:p>
+        </w:tc>
+        <w:tc>
+          <w:tcPr>
+            <w:tcW w:type="dxa" w:w="3230"/>
+            <w:shd w:val="clear" w:color="auto" w:fill="B8B3D6"/>
+            <w:tcBorders>
+              <w:top w:val="single" w:sz="4" w:space="0" w:color="CBCBCB"/>
+              <w:left w:val="single" w:sz="4" w:space="0" w:color="CBCBCB"/>
+              <w:bottom w:val="single" w:sz="4" w:space="0" w:color="CBCBCB"/>
+              <w:right w:val="single" w:sz="4" w:space="0" w:color="CBCBCB"/>
+            </w:tcBorders>
+          </w:tcPr>
+          <w:p>
+            <w:r>
+              <w:rPr>
+                <w:sz w:val="20"/>
+              </w:rPr>
+              <w:t>NOT NULL DEFAULT datetime('now')</w:t>
+            </w:r>
+          </w:p>
+        </w:tc>
+      </w:tr>
+      <w:tr>
+        <w:tc>
+          <w:tcPr>
+            <w:tcW w:type="dxa" w:w="3230"/>
+            <w:tcBorders>
+              <w:top w:val="single" w:sz="4" w:space="0" w:color="CBCBCB"/>
+              <w:left w:val="single" w:sz="4" w:space="0" w:color="CBCBCB"/>
+              <w:bottom w:val="single" w:sz="4" w:space="0" w:color="CBCBCB"/>
+              <w:right w:val="single" w:sz="4" w:space="0" w:color="CBCBCB"/>
+            </w:tcBorders>
+          </w:tcPr>
+          <w:p>
+            <w:r>
+              <w:rPr>
+                <w:sz w:val="20"/>
+              </w:rPr>
+              <w:t>updated_at</w:t>
+            </w:r>
+          </w:p>
+        </w:tc>
+        <w:tc>
+          <w:tcPr>
+            <w:tcW w:type="dxa" w:w="3230"/>
+            <w:tcBorders>
+              <w:top w:val="single" w:sz="4" w:space="0" w:color="CBCBCB"/>
+              <w:left w:val="single" w:sz="4" w:space="0" w:color="CBCBCB"/>
+              <w:bottom w:val="single" w:sz="4" w:space="0" w:color="CBCBCB"/>
+              <w:right w:val="single" w:sz="4" w:space="0" w:color="CBCBCB"/>
+            </w:tcBorders>
+          </w:tcPr>
+          <w:p>
+            <w:r>
+              <w:rPr>
+                <w:sz w:val="20"/>
+              </w:rPr>
+              <w:t>TEXT</w:t>
+            </w:r>
+          </w:p>
+        </w:tc>
+        <w:tc>
+          <w:tcPr>
+            <w:tcW w:type="dxa" w:w="3230"/>
+            <w:tcBorders>
+              <w:top w:val="single" w:sz="4" w:space="0" w:color="CBCBCB"/>
+              <w:left w:val="single" w:sz="4" w:space="0" w:color="CBCBCB"/>
+              <w:bottom w:val="single" w:sz="4" w:space="0" w:color="CBCBCB"/>
+              <w:right w:val="single" w:sz="4" w:space="0" w:color="CBCBCB"/>
+            </w:tcBorders>
+          </w:tcPr>
+          <w:p>
+            <w:r>
+              <w:rPr>
+                <w:sz w:val="20"/>
+              </w:rPr>
+              <w:t>NOT NULL DEFAULT datetime('now')</w:t>
+            </w:r>
+          </w:p>
+        </w:tc>
+      </w:tr>
+    </w:tbl>
+    <w:p/>
+    <w:p>
+      <w:pPr>
+        <w:spacing w:after="80"/>
+      </w:pPr>
+      <w:r>
+        <w:rPr>
+          <w:b/>
+          <w:sz w:val="21"/>
+        </w:rPr>
+        <w:t>Indexes:</w:t>
+      </w:r>
+      <w:r>
+        <w:rPr>
+          <w:sz w:val="21"/>
+        </w:rPr>
+        <w:t xml:space="preserve"> </w:t>
+      </w:r>
+      <w:r>
+        <w:rPr>
+          <w:rFonts w:ascii="Courier New" w:hAnsi="Courier New"/>
+          <w:color w:val="F05922"/>
+          <w:sz w:val="18"/>
+        </w:rPr>
+        <w:t>idx_jobs_project ON jobs(project_id)</w:t>
+      </w:r>
+      <w:r>
+        <w:rPr>
+          <w:sz w:val="21"/>
+        </w:rPr>
+        <w:t xml:space="preserve">, </w:t>
+      </w:r>
+      <w:r>
+        <w:rPr>
+          <w:rFonts w:ascii="Courier New" w:hAnsi="Courier New"/>
+          <w:color w:val="F05922"/>
+          <w:sz w:val="18"/>
+        </w:rPr>
+        <w:t>idx_jobs_status ON jobs(status)</w:t>
+      </w:r>
+    </w:p>
+    <w:p>
+      <w:pPr>
+        <w:spacing w:after="80"/>
+      </w:pPr>
+      <w:r>
+        <w:rPr>
+          <w:b/>
+          <w:sz w:val="21"/>
+        </w:rPr>
+        <w:t>Startup behavior:</w:t>
+      </w:r>
+      <w:r>
+        <w:rPr>
+          <w:sz w:val="21"/>
+        </w:rPr>
+        <w:t xml:space="preserve"> Khi server khởi động, mọi row có </w:t>
+      </w:r>
+      <w:r>
+        <w:rPr>
+          <w:rFonts w:ascii="Courier New" w:hAnsi="Courier New"/>
+          <w:color w:val="F05922"/>
+          <w:sz w:val="18"/>
+        </w:rPr>
+        <w:t>status IN ('running','pending')</w:t>
+      </w:r>
+      <w:r>
+        <w:rPr>
+          <w:sz w:val="21"/>
+        </w:rPr>
+        <w:t xml:space="preserve"> → cập nhật thành </w:t>
+      </w:r>
+      <w:r>
+        <w:rPr>
+          <w:rFonts w:ascii="Courier New" w:hAnsi="Courier New"/>
+          <w:color w:val="F05922"/>
+          <w:sz w:val="18"/>
+        </w:rPr>
+        <w:t>'error'</w:t>
+      </w:r>
+      <w:r>
+        <w:rPr>
+          <w:sz w:val="21"/>
+        </w:rPr>
+        <w:t xml:space="preserve"> với </w:t>
+      </w:r>
+      <w:r>
+        <w:rPr>
+          <w:rFonts w:ascii="Courier New" w:hAnsi="Courier New"/>
+          <w:color w:val="F05922"/>
+          <w:sz w:val="18"/>
+        </w:rPr>
+        <w:t>error_msg='Server restarted while job was in progress'</w:t>
+      </w:r>
+      <w:r>
+        <w:rPr>
+          <w:sz w:val="21"/>
+        </w:rPr>
+        <w:t>.</w:t>
+      </w:r>
+    </w:p>
+    <w:p>
+      <w:pPr>
         <w:pBdr>
           <w:bottom w:val="single" w:sz="6" w:space="1" w:color="F05922"/>
         </w:pBdr>
@@ -20285,7 +22474,7 @@
               <w:rPr>
                 <w:sz w:val="20"/>
               </w:rPr>
-              <w:t>autolabel.js:73</w:t>
+              <w:t>autolabel.js:~290</w:t>
             </w:r>
           </w:p>
         </w:tc>
@@ -20364,7 +22553,7 @@
               <w:rPr>
                 <w:sz w:val="20"/>
               </w:rPr>
-              <w:t>autolabel.js:151</w:t>
+              <w:t>autolabel.js:~350</w:t>
             </w:r>
           </w:p>
         </w:tc>
@@ -20383,7 +22572,444 @@
               <w:rPr>
                 <w:sz w:val="20"/>
               </w:rPr>
-              <w:t>AutoLabelJob</w:t>
+              <w:t>AutoLabelJob (memory → DB fallback)</w:t>
+            </w:r>
+          </w:p>
+        </w:tc>
+      </w:tr>
+    </w:tbl>
+    <w:p/>
+    <w:p>
+      <w:pPr>
+        <w:pStyle w:val="Heading3"/>
+        <w:spacing w:before="160" w:after="60"/>
+      </w:pPr>
+      <w:r>
+        <w:rPr>
+          <w:color w:val="4A3F8C"/>
+          <w:sz w:val="24"/>
+        </w:rPr>
+        <w:t>Jobs (STEP-1.2 MỚI)</w:t>
+      </w:r>
+    </w:p>
+    <w:tbl>
+      <w:tblPr>
+        <w:tblStyle w:val="TableGrid"/>
+        <w:tblW w:type="auto" w:w="0"/>
+        <w:tblLook w:firstColumn="1" w:firstRow="1" w:lastColumn="0" w:lastRow="0" w:noHBand="0" w:noVBand="1" w:val="04A0"/>
+      </w:tblPr>
+      <w:tblGrid>
+        <w:gridCol w:w="2422"/>
+        <w:gridCol w:w="2422"/>
+        <w:gridCol w:w="2422"/>
+        <w:gridCol w:w="2422"/>
+      </w:tblGrid>
+      <w:tr>
+        <w:tc>
+          <w:tcPr>
+            <w:tcW w:type="dxa" w:w="2422"/>
+            <w:shd w:val="clear" w:color="auto" w:fill="251C53"/>
+            <w:tcBorders>
+              <w:top w:val="single" w:sz="4" w:space="0" w:color="251C53"/>
+              <w:left w:val="single" w:sz="4" w:space="0" w:color="251C53"/>
+              <w:bottom w:val="single" w:sz="4" w:space="0" w:color="251C53"/>
+              <w:right w:val="single" w:sz="4" w:space="0" w:color="251C53"/>
+            </w:tcBorders>
+          </w:tcPr>
+          <w:p>
+            <w:r>
+              <w:rPr>
+                <w:b/>
+                <w:color w:val="FFFFFF"/>
+                <w:sz w:val="20"/>
+              </w:rPr>
+              <w:t>Method</w:t>
+            </w:r>
+          </w:p>
+        </w:tc>
+        <w:tc>
+          <w:tcPr>
+            <w:tcW w:type="dxa" w:w="2422"/>
+            <w:shd w:val="clear" w:color="auto" w:fill="251C53"/>
+            <w:tcBorders>
+              <w:top w:val="single" w:sz="4" w:space="0" w:color="251C53"/>
+              <w:left w:val="single" w:sz="4" w:space="0" w:color="251C53"/>
+              <w:bottom w:val="single" w:sz="4" w:space="0" w:color="251C53"/>
+              <w:right w:val="single" w:sz="4" w:space="0" w:color="251C53"/>
+            </w:tcBorders>
+          </w:tcPr>
+          <w:p>
+            <w:r>
+              <w:rPr>
+                <w:b/>
+                <w:color w:val="FFFFFF"/>
+                <w:sz w:val="20"/>
+              </w:rPr>
+              <w:t>Path</w:t>
+            </w:r>
+          </w:p>
+        </w:tc>
+        <w:tc>
+          <w:tcPr>
+            <w:tcW w:type="dxa" w:w="2422"/>
+            <w:shd w:val="clear" w:color="auto" w:fill="251C53"/>
+            <w:tcBorders>
+              <w:top w:val="single" w:sz="4" w:space="0" w:color="251C53"/>
+              <w:left w:val="single" w:sz="4" w:space="0" w:color="251C53"/>
+              <w:bottom w:val="single" w:sz="4" w:space="0" w:color="251C53"/>
+              <w:right w:val="single" w:sz="4" w:space="0" w:color="251C53"/>
+            </w:tcBorders>
+          </w:tcPr>
+          <w:p>
+            <w:r>
+              <w:rPr>
+                <w:b/>
+                <w:color w:val="FFFFFF"/>
+                <w:sz w:val="20"/>
+              </w:rPr>
+              <w:t>File:Line</w:t>
+            </w:r>
+          </w:p>
+        </w:tc>
+        <w:tc>
+          <w:tcPr>
+            <w:tcW w:type="dxa" w:w="2422"/>
+            <w:shd w:val="clear" w:color="auto" w:fill="251C53"/>
+            <w:tcBorders>
+              <w:top w:val="single" w:sz="4" w:space="0" w:color="251C53"/>
+              <w:left w:val="single" w:sz="4" w:space="0" w:color="251C53"/>
+              <w:bottom w:val="single" w:sz="4" w:space="0" w:color="251C53"/>
+              <w:right w:val="single" w:sz="4" w:space="0" w:color="251C53"/>
+            </w:tcBorders>
+          </w:tcPr>
+          <w:p>
+            <w:r>
+              <w:rPr>
+                <w:b/>
+                <w:color w:val="FFFFFF"/>
+                <w:sz w:val="20"/>
+              </w:rPr>
+              <w:t>Response</w:t>
+            </w:r>
+          </w:p>
+        </w:tc>
+      </w:tr>
+      <w:tr>
+        <w:tc>
+          <w:tcPr>
+            <w:tcW w:type="dxa" w:w="2422"/>
+            <w:tcBorders>
+              <w:top w:val="single" w:sz="4" w:space="0" w:color="CBCBCB"/>
+              <w:left w:val="single" w:sz="4" w:space="0" w:color="CBCBCB"/>
+              <w:bottom w:val="single" w:sz="4" w:space="0" w:color="CBCBCB"/>
+              <w:right w:val="single" w:sz="4" w:space="0" w:color="CBCBCB"/>
+            </w:tcBorders>
+          </w:tcPr>
+          <w:p>
+            <w:r>
+              <w:rPr>
+                <w:sz w:val="20"/>
+              </w:rPr>
+              <w:t>---</w:t>
+            </w:r>
+          </w:p>
+        </w:tc>
+        <w:tc>
+          <w:tcPr>
+            <w:tcW w:type="dxa" w:w="2422"/>
+            <w:tcBorders>
+              <w:top w:val="single" w:sz="4" w:space="0" w:color="CBCBCB"/>
+              <w:left w:val="single" w:sz="4" w:space="0" w:color="CBCBCB"/>
+              <w:bottom w:val="single" w:sz="4" w:space="0" w:color="CBCBCB"/>
+              <w:right w:val="single" w:sz="4" w:space="0" w:color="CBCBCB"/>
+            </w:tcBorders>
+          </w:tcPr>
+          <w:p>
+            <w:r>
+              <w:rPr>
+                <w:sz w:val="20"/>
+              </w:rPr>
+              <w:t>---</w:t>
+            </w:r>
+          </w:p>
+        </w:tc>
+        <w:tc>
+          <w:tcPr>
+            <w:tcW w:type="dxa" w:w="2422"/>
+            <w:tcBorders>
+              <w:top w:val="single" w:sz="4" w:space="0" w:color="CBCBCB"/>
+              <w:left w:val="single" w:sz="4" w:space="0" w:color="CBCBCB"/>
+              <w:bottom w:val="single" w:sz="4" w:space="0" w:color="CBCBCB"/>
+              <w:right w:val="single" w:sz="4" w:space="0" w:color="CBCBCB"/>
+            </w:tcBorders>
+          </w:tcPr>
+          <w:p>
+            <w:r>
+              <w:rPr>
+                <w:sz w:val="20"/>
+              </w:rPr>
+              <w:t>---</w:t>
+            </w:r>
+          </w:p>
+        </w:tc>
+        <w:tc>
+          <w:tcPr>
+            <w:tcW w:type="dxa" w:w="2422"/>
+            <w:tcBorders>
+              <w:top w:val="single" w:sz="4" w:space="0" w:color="CBCBCB"/>
+              <w:left w:val="single" w:sz="4" w:space="0" w:color="CBCBCB"/>
+              <w:bottom w:val="single" w:sz="4" w:space="0" w:color="CBCBCB"/>
+              <w:right w:val="single" w:sz="4" w:space="0" w:color="CBCBCB"/>
+            </w:tcBorders>
+          </w:tcPr>
+          <w:p>
+            <w:r>
+              <w:rPr>
+                <w:sz w:val="20"/>
+              </w:rPr>
+              <w:t>---</w:t>
+            </w:r>
+          </w:p>
+        </w:tc>
+      </w:tr>
+      <w:tr>
+        <w:tc>
+          <w:tcPr>
+            <w:tcW w:type="dxa" w:w="2422"/>
+            <w:shd w:val="clear" w:color="auto" w:fill="B8B3D6"/>
+            <w:tcBorders>
+              <w:top w:val="single" w:sz="4" w:space="0" w:color="CBCBCB"/>
+              <w:left w:val="single" w:sz="4" w:space="0" w:color="CBCBCB"/>
+              <w:bottom w:val="single" w:sz="4" w:space="0" w:color="CBCBCB"/>
+              <w:right w:val="single" w:sz="4" w:space="0" w:color="CBCBCB"/>
+            </w:tcBorders>
+          </w:tcPr>
+          <w:p>
+            <w:r>
+              <w:rPr>
+                <w:sz w:val="20"/>
+              </w:rPr>
+              <w:t>GET</w:t>
+            </w:r>
+          </w:p>
+        </w:tc>
+        <w:tc>
+          <w:tcPr>
+            <w:tcW w:type="dxa" w:w="2422"/>
+            <w:shd w:val="clear" w:color="auto" w:fill="B8B3D6"/>
+            <w:tcBorders>
+              <w:top w:val="single" w:sz="4" w:space="0" w:color="CBCBCB"/>
+              <w:left w:val="single" w:sz="4" w:space="0" w:color="CBCBCB"/>
+              <w:bottom w:val="single" w:sz="4" w:space="0" w:color="CBCBCB"/>
+              <w:right w:val="single" w:sz="4" w:space="0" w:color="CBCBCB"/>
+            </w:tcBorders>
+          </w:tcPr>
+          <w:p>
+            <w:r>
+              <w:rPr>
+                <w:sz w:val="20"/>
+              </w:rPr>
+              <w:t>/api/jobs?projectId=:pid</w:t>
+            </w:r>
+          </w:p>
+        </w:tc>
+        <w:tc>
+          <w:tcPr>
+            <w:tcW w:type="dxa" w:w="2422"/>
+            <w:shd w:val="clear" w:color="auto" w:fill="B8B3D6"/>
+            <w:tcBorders>
+              <w:top w:val="single" w:sz="4" w:space="0" w:color="CBCBCB"/>
+              <w:left w:val="single" w:sz="4" w:space="0" w:color="CBCBCB"/>
+              <w:bottom w:val="single" w:sz="4" w:space="0" w:color="CBCBCB"/>
+              <w:right w:val="single" w:sz="4" w:space="0" w:color="CBCBCB"/>
+            </w:tcBorders>
+          </w:tcPr>
+          <w:p>
+            <w:r>
+              <w:rPr>
+                <w:sz w:val="20"/>
+              </w:rPr>
+              <w:t>jobs.js:~22</w:t>
+            </w:r>
+          </w:p>
+        </w:tc>
+        <w:tc>
+          <w:tcPr>
+            <w:tcW w:type="dxa" w:w="2422"/>
+            <w:shd w:val="clear" w:color="auto" w:fill="B8B3D6"/>
+            <w:tcBorders>
+              <w:top w:val="single" w:sz="4" w:space="0" w:color="CBCBCB"/>
+              <w:left w:val="single" w:sz="4" w:space="0" w:color="CBCBCB"/>
+              <w:bottom w:val="single" w:sz="4" w:space="0" w:color="CBCBCB"/>
+              <w:right w:val="single" w:sz="4" w:space="0" w:color="CBCBCB"/>
+            </w:tcBorders>
+          </w:tcPr>
+          <w:p>
+            <w:r>
+              <w:rPr>
+                <w:sz w:val="20"/>
+              </w:rPr>
+              <w:t>JobRecord[]</w:t>
+            </w:r>
+          </w:p>
+        </w:tc>
+      </w:tr>
+      <w:tr>
+        <w:tc>
+          <w:tcPr>
+            <w:tcW w:type="dxa" w:w="2422"/>
+            <w:tcBorders>
+              <w:top w:val="single" w:sz="4" w:space="0" w:color="CBCBCB"/>
+              <w:left w:val="single" w:sz="4" w:space="0" w:color="CBCBCB"/>
+              <w:bottom w:val="single" w:sz="4" w:space="0" w:color="CBCBCB"/>
+              <w:right w:val="single" w:sz="4" w:space="0" w:color="CBCBCB"/>
+            </w:tcBorders>
+          </w:tcPr>
+          <w:p>
+            <w:r>
+              <w:rPr>
+                <w:sz w:val="20"/>
+              </w:rPr>
+              <w:t>GET</w:t>
+            </w:r>
+          </w:p>
+        </w:tc>
+        <w:tc>
+          <w:tcPr>
+            <w:tcW w:type="dxa" w:w="2422"/>
+            <w:tcBorders>
+              <w:top w:val="single" w:sz="4" w:space="0" w:color="CBCBCB"/>
+              <w:left w:val="single" w:sz="4" w:space="0" w:color="CBCBCB"/>
+              <w:bottom w:val="single" w:sz="4" w:space="0" w:color="CBCBCB"/>
+              <w:right w:val="single" w:sz="4" w:space="0" w:color="CBCBCB"/>
+            </w:tcBorders>
+          </w:tcPr>
+          <w:p>
+            <w:r>
+              <w:rPr>
+                <w:sz w:val="20"/>
+              </w:rPr>
+              <w:t>/api/jobs/:id</w:t>
+            </w:r>
+          </w:p>
+        </w:tc>
+        <w:tc>
+          <w:tcPr>
+            <w:tcW w:type="dxa" w:w="2422"/>
+            <w:tcBorders>
+              <w:top w:val="single" w:sz="4" w:space="0" w:color="CBCBCB"/>
+              <w:left w:val="single" w:sz="4" w:space="0" w:color="CBCBCB"/>
+              <w:bottom w:val="single" w:sz="4" w:space="0" w:color="CBCBCB"/>
+              <w:right w:val="single" w:sz="4" w:space="0" w:color="CBCBCB"/>
+            </w:tcBorders>
+          </w:tcPr>
+          <w:p>
+            <w:r>
+              <w:rPr>
+                <w:sz w:val="20"/>
+              </w:rPr>
+              <w:t>jobs.js:~31</w:t>
+            </w:r>
+          </w:p>
+        </w:tc>
+        <w:tc>
+          <w:tcPr>
+            <w:tcW w:type="dxa" w:w="2422"/>
+            <w:tcBorders>
+              <w:top w:val="single" w:sz="4" w:space="0" w:color="CBCBCB"/>
+              <w:left w:val="single" w:sz="4" w:space="0" w:color="CBCBCB"/>
+              <w:bottom w:val="single" w:sz="4" w:space="0" w:color="CBCBCB"/>
+              <w:right w:val="single" w:sz="4" w:space="0" w:color="CBCBCB"/>
+            </w:tcBorders>
+          </w:tcPr>
+          <w:p>
+            <w:r>
+              <w:rPr>
+                <w:sz w:val="20"/>
+              </w:rPr>
+              <w:t>JobRecord</w:t>
+            </w:r>
+          </w:p>
+        </w:tc>
+      </w:tr>
+      <w:tr>
+        <w:tc>
+          <w:tcPr>
+            <w:tcW w:type="dxa" w:w="2422"/>
+            <w:shd w:val="clear" w:color="auto" w:fill="B8B3D6"/>
+            <w:tcBorders>
+              <w:top w:val="single" w:sz="4" w:space="0" w:color="CBCBCB"/>
+              <w:left w:val="single" w:sz="4" w:space="0" w:color="CBCBCB"/>
+              <w:bottom w:val="single" w:sz="4" w:space="0" w:color="CBCBCB"/>
+              <w:right w:val="single" w:sz="4" w:space="0" w:color="CBCBCB"/>
+            </w:tcBorders>
+          </w:tcPr>
+          <w:p>
+            <w:r>
+              <w:rPr>
+                <w:sz w:val="20"/>
+              </w:rPr>
+              <w:t>DELETE</w:t>
+            </w:r>
+          </w:p>
+        </w:tc>
+        <w:tc>
+          <w:tcPr>
+            <w:tcW w:type="dxa" w:w="2422"/>
+            <w:shd w:val="clear" w:color="auto" w:fill="B8B3D6"/>
+            <w:tcBorders>
+              <w:top w:val="single" w:sz="4" w:space="0" w:color="CBCBCB"/>
+              <w:left w:val="single" w:sz="4" w:space="0" w:color="CBCBCB"/>
+              <w:bottom w:val="single" w:sz="4" w:space="0" w:color="CBCBCB"/>
+              <w:right w:val="single" w:sz="4" w:space="0" w:color="CBCBCB"/>
+            </w:tcBorders>
+          </w:tcPr>
+          <w:p>
+            <w:r>
+              <w:rPr>
+                <w:sz w:val="20"/>
+              </w:rPr>
+              <w:t>/api/jobs/:id</w:t>
+            </w:r>
+          </w:p>
+        </w:tc>
+        <w:tc>
+          <w:tcPr>
+            <w:tcW w:type="dxa" w:w="2422"/>
+            <w:shd w:val="clear" w:color="auto" w:fill="B8B3D6"/>
+            <w:tcBorders>
+              <w:top w:val="single" w:sz="4" w:space="0" w:color="CBCBCB"/>
+              <w:left w:val="single" w:sz="4" w:space="0" w:color="CBCBCB"/>
+              <w:bottom w:val="single" w:sz="4" w:space="0" w:color="CBCBCB"/>
+              <w:right w:val="single" w:sz="4" w:space="0" w:color="CBCBCB"/>
+            </w:tcBorders>
+          </w:tcPr>
+          <w:p>
+            <w:r>
+              <w:rPr>
+                <w:sz w:val="20"/>
+              </w:rPr>
+              <w:t>jobs.js:~37</w:t>
+            </w:r>
+          </w:p>
+        </w:tc>
+        <w:tc>
+          <w:tcPr>
+            <w:tcW w:type="dxa" w:w="2422"/>
+            <w:shd w:val="clear" w:color="auto" w:fill="B8B3D6"/>
+            <w:tcBorders>
+              <w:top w:val="single" w:sz="4" w:space="0" w:color="CBCBCB"/>
+              <w:left w:val="single" w:sz="4" w:space="0" w:color="CBCBCB"/>
+              <w:bottom w:val="single" w:sz="4" w:space="0" w:color="CBCBCB"/>
+              <w:right w:val="single" w:sz="4" w:space="0" w:color="CBCBCB"/>
+            </w:tcBorders>
+          </w:tcPr>
+          <w:p>
+            <w:r>
+              <w:rPr>
+                <w:sz w:val="20"/>
+              </w:rPr>
+              <w:t>{ok:true}</w:t>
             </w:r>
           </w:p>
         </w:tc>
@@ -22160,7 +24786,7 @@
           <w:color w:val="4A3F8C"/>
           <w:sz w:val="24"/>
         </w:rPr>
-        <w:t>Phase 1.2 — Persist bảng `jobs`</w:t>
+        <w:t>Phase 1.2 — Persist bảng `jobs` — ✅ HOÀN THÀNH</w:t>
       </w:r>
     </w:p>
     <w:p>
@@ -22172,7 +24798,7 @@
           <w:b/>
           <w:sz w:val="21"/>
         </w:rPr>
-        <w:t>Files bị ảnh hưởng:</w:t>
+        <w:t>Files đã thay đổi (STEP-1.2):</w:t>
       </w:r>
     </w:p>
     <w:p>
@@ -22207,7 +24833,7 @@
         <w:rPr>
           <w:sz w:val="21"/>
         </w:rPr>
-        <w:t xml:space="preserve"> + migration</w:t>
+        <w:t xml:space="preserve"> + 2 indexes + startup cleanup (UPDATE running/pending → error)</w:t>
       </w:r>
     </w:p>
     <w:p>
@@ -22228,7 +24854,7 @@
         <w:rPr>
           <w:sz w:val="21"/>
         </w:rPr>
-        <w:t xml:space="preserve"> — thay </w:t>
+        <w:t xml:space="preserve"> — thêm </w:t>
       </w:r>
       <w:r>
         <w:rPr>
@@ -22236,13 +24862,41 @@
           <w:color w:val="F05922"/>
           <w:sz w:val="21"/>
         </w:rPr>
-        <w:t>const jobs = new Map()</w:t>
+        <w:t>createJobInDB</w:t>
       </w:r>
       <w:r>
         <w:rPr>
           <w:sz w:val="21"/>
         </w:rPr>
-        <w:t xml:space="preserve"> bằng DB reads/writes</w:t>
+        <w:t xml:space="preserve">, </w:t>
+      </w:r>
+      <w:r>
+        <w:rPr>
+          <w:rFonts w:ascii="Courier New" w:hAnsi="Courier New"/>
+          <w:color w:val="F05922"/>
+          <w:sz w:val="21"/>
+        </w:rPr>
+        <w:t>syncJobToDB</w:t>
+      </w:r>
+      <w:r>
+        <w:rPr>
+          <w:sz w:val="21"/>
+        </w:rPr>
+        <w:t xml:space="preserve">, </w:t>
+      </w:r>
+      <w:r>
+        <w:rPr>
+          <w:rFonts w:ascii="Courier New" w:hAnsi="Courier New"/>
+          <w:color w:val="F05922"/>
+          <w:sz w:val="21"/>
+        </w:rPr>
+        <w:t>getJobFromDB</w:t>
+      </w:r>
+      <w:r>
+        <w:rPr>
+          <w:sz w:val="21"/>
+        </w:rPr>
+        <w:t>; POST handler tạo DB row + sync khi hoàn thành; GET handler fall-back DB</w:t>
       </w:r>
     </w:p>
     <w:p>
@@ -22251,12 +24905,6 @@
         <w:spacing w:after="20"/>
         <w:ind w:left="283"/>
       </w:pPr>
-      <w:r>
-        <w:rPr>
-          <w:sz w:val="21"/>
-        </w:rPr>
-        <w:t xml:space="preserve">Tạo mới: </w:t>
-      </w:r>
       <w:r>
         <w:rPr>
           <w:rFonts w:ascii="Courier New" w:hAnsi="Courier New"/>
@@ -22269,7 +24917,161 @@
         <w:rPr>
           <w:sz w:val="21"/>
         </w:rPr>
-        <w:t xml:space="preserve"> (nếu cần endpoint riêng cho job history)</w:t>
+        <w:t xml:space="preserve"> — </w:t>
+      </w:r>
+      <w:r>
+        <w:rPr>
+          <w:b/>
+          <w:sz w:val="21"/>
+        </w:rPr>
+        <w:t>MỚI</w:t>
+      </w:r>
+      <w:r>
+        <w:rPr>
+          <w:sz w:val="21"/>
+        </w:rPr>
+        <w:t>: GET/GET/:id/DELETE /api/jobs</w:t>
+      </w:r>
+    </w:p>
+    <w:p>
+      <w:pPr>
+        <w:pStyle w:val="ListBullet"/>
+        <w:spacing w:after="20"/>
+        <w:ind w:left="283"/>
+      </w:pPr>
+      <w:r>
+        <w:rPr>
+          <w:rFonts w:ascii="Courier New" w:hAnsi="Courier New"/>
+          <w:color w:val="F05922"/>
+          <w:sz w:val="21"/>
+        </w:rPr>
+        <w:t>server/src/index.js</w:t>
+      </w:r>
+      <w:r>
+        <w:rPr>
+          <w:sz w:val="21"/>
+        </w:rPr>
+        <w:t xml:space="preserve"> — import + mount jobsRouter tại </w:t>
+      </w:r>
+      <w:r>
+        <w:rPr>
+          <w:rFonts w:ascii="Courier New" w:hAnsi="Courier New"/>
+          <w:color w:val="F05922"/>
+          <w:sz w:val="21"/>
+        </w:rPr>
+        <w:t>/api/jobs</w:t>
+      </w:r>
+    </w:p>
+    <w:p>
+      <w:pPr>
+        <w:pStyle w:val="ListBullet"/>
+        <w:spacing w:after="20"/>
+        <w:ind w:left="283"/>
+      </w:pPr>
+      <w:r>
+        <w:rPr>
+          <w:rFonts w:ascii="Courier New" w:hAnsi="Courier New"/>
+          <w:color w:val="F05922"/>
+          <w:sz w:val="21"/>
+        </w:rPr>
+        <w:t>server/migrations/001_create_jobs.sql</w:t>
+      </w:r>
+      <w:r>
+        <w:rPr>
+          <w:sz w:val="21"/>
+        </w:rPr>
+        <w:t xml:space="preserve"> — </w:t>
+      </w:r>
+      <w:r>
+        <w:rPr>
+          <w:b/>
+          <w:sz w:val="21"/>
+        </w:rPr>
+        <w:t>MỚI</w:t>
+      </w:r>
+      <w:r>
+        <w:rPr>
+          <w:sz w:val="21"/>
+        </w:rPr>
+        <w:t>: migration SQL (tham khảo)</w:t>
+      </w:r>
+    </w:p>
+    <w:p>
+      <w:pPr>
+        <w:spacing w:after="80"/>
+      </w:pPr>
+      <w:r>
+        <w:rPr>
+          <w:b/>
+          <w:sz w:val="21"/>
+        </w:rPr>
+        <w:t>Depth-1 callers:</w:t>
+      </w:r>
+      <w:r>
+        <w:rPr>
+          <w:sz w:val="21"/>
+        </w:rPr>
+        <w:t xml:space="preserve"> client/src/api.ts (</w:t>
+      </w:r>
+      <w:r>
+        <w:rPr>
+          <w:rFonts w:ascii="Courier New" w:hAnsi="Courier New"/>
+          <w:color w:val="F05922"/>
+          <w:sz w:val="18"/>
+        </w:rPr>
+        <w:t>getAutoLabelJob</w:t>
+      </w:r>
+      <w:r>
+        <w:rPr>
+          <w:sz w:val="21"/>
+        </w:rPr>
+        <w:t>) — REST interface giữ nguyên, không cần sửa client.</w:t>
+      </w:r>
+    </w:p>
+    <w:p>
+      <w:pPr>
+        <w:spacing w:after="80"/>
+      </w:pPr>
+      <w:r>
+        <w:rPr>
+          <w:b/>
+          <w:sz w:val="21"/>
+        </w:rPr>
+        <w:t>Watch out:</w:t>
+      </w:r>
+      <w:r>
+        <w:rPr>
+          <w:sz w:val="21"/>
+        </w:rPr>
+        <w:t xml:space="preserve"> </w:t>
+      </w:r>
+      <w:r>
+        <w:rPr>
+          <w:rFonts w:ascii="Courier New" w:hAnsi="Courier New"/>
+          <w:color w:val="F05922"/>
+          <w:sz w:val="18"/>
+        </w:rPr>
+        <w:t>jobs</w:t>
+      </w:r>
+      <w:r>
+        <w:rPr>
+          <w:sz w:val="21"/>
+        </w:rPr>
+        <w:t xml:space="preserve"> table không có FK tới </w:t>
+      </w:r>
+      <w:r>
+        <w:rPr>
+          <w:rFonts w:ascii="Courier New" w:hAnsi="Courier New"/>
+          <w:color w:val="F05922"/>
+          <w:sz w:val="18"/>
+        </w:rPr>
+        <w:t>projects</w:t>
+      </w:r>
+      <w:r>
+        <w:rPr>
+          <w:sz w:val="21"/>
+        </w:rPr>
+        <w:t xml:space="preserve"> — khi xóa project, jobs không bị cascade. Thiết kế có chủ ý (giữ job history). Phase sau nếu cần cleanup → DELETE FROM jobs WHERE project_id=? trong routes/projects.js khi DELETE project.</w:t>
       </w:r>
     </w:p>
     <w:p>
@@ -23635,6 +26437,88 @@
                 <w:sz w:val="20"/>
               </w:rPr>
               <w:t>(STEP-1.1)</w:t>
+            </w:r>
+          </w:p>
+        </w:tc>
+      </w:tr>
+      <w:tr>
+        <w:tc>
+          <w:tcPr>
+            <w:tcW w:type="dxa" w:w="2422"/>
+            <w:shd w:val="clear" w:color="auto" w:fill="B8B3D6"/>
+            <w:tcBorders>
+              <w:top w:val="single" w:sz="4" w:space="0" w:color="CBCBCB"/>
+              <w:left w:val="single" w:sz="4" w:space="0" w:color="CBCBCB"/>
+              <w:bottom w:val="single" w:sz="4" w:space="0" w:color="CBCBCB"/>
+              <w:right w:val="single" w:sz="4" w:space="0" w:color="CBCBCB"/>
+            </w:tcBorders>
+          </w:tcPr>
+          <w:p>
+            <w:r>
+              <w:rPr>
+                <w:sz w:val="20"/>
+              </w:rPr>
+              <w:t>2026-08-04</w:t>
+            </w:r>
+          </w:p>
+        </w:tc>
+        <w:tc>
+          <w:tcPr>
+            <w:tcW w:type="dxa" w:w="2422"/>
+            <w:shd w:val="clear" w:color="auto" w:fill="B8B3D6"/>
+            <w:tcBorders>
+              <w:top w:val="single" w:sz="4" w:space="0" w:color="CBCBCB"/>
+              <w:left w:val="single" w:sz="4" w:space="0" w:color="CBCBCB"/>
+              <w:bottom w:val="single" w:sz="4" w:space="0" w:color="CBCBCB"/>
+              <w:right w:val="single" w:sz="4" w:space="0" w:color="CBCBCB"/>
+            </w:tcBorders>
+          </w:tcPr>
+          <w:p>
+            <w:r>
+              <w:rPr>
+                <w:sz w:val="20"/>
+              </w:rPr>
+              <w:t>senior-developer (STEP-1.2)</w:t>
+            </w:r>
+          </w:p>
+        </w:tc>
+        <w:tc>
+          <w:tcPr>
+            <w:tcW w:type="dxa" w:w="2422"/>
+            <w:shd w:val="clear" w:color="auto" w:fill="B8B3D6"/>
+            <w:tcBorders>
+              <w:top w:val="single" w:sz="4" w:space="0" w:color="CBCBCB"/>
+              <w:left w:val="single" w:sz="4" w:space="0" w:color="CBCBCB"/>
+              <w:bottom w:val="single" w:sz="4" w:space="0" w:color="CBCBCB"/>
+              <w:right w:val="single" w:sz="4" w:space="0" w:color="CBCBCB"/>
+            </w:tcBorders>
+          </w:tcPr>
+          <w:p>
+            <w:r>
+              <w:rPr>
+                <w:sz w:val="20"/>
+              </w:rPr>
+              <w:t>Thêm §3.11 jobs.js (MỚI), cập nhật §2 (migrations/ + jobs.js), §3.1 (route /api/jobs), §3.2 (startup cleanup), §3.10 (DB-backed job storage), §6 (jobs table schema), §7 (/api/jobs endpoints), §9 Phase 1.2 DONE</w:t>
+            </w:r>
+          </w:p>
+        </w:tc>
+        <w:tc>
+          <w:tcPr>
+            <w:tcW w:type="dxa" w:w="2422"/>
+            <w:shd w:val="clear" w:color="auto" w:fill="B8B3D6"/>
+            <w:tcBorders>
+              <w:top w:val="single" w:sz="4" w:space="0" w:color="CBCBCB"/>
+              <w:left w:val="single" w:sz="4" w:space="0" w:color="CBCBCB"/>
+              <w:bottom w:val="single" w:sz="4" w:space="0" w:color="CBCBCB"/>
+              <w:right w:val="single" w:sz="4" w:space="0" w:color="CBCBCB"/>
+            </w:tcBorders>
+          </w:tcPr>
+          <w:p>
+            <w:r>
+              <w:rPr>
+                <w:sz w:val="20"/>
+              </w:rPr>
+              <w:t>(STEP-1.2)</w:t>
             </w:r>
           </w:p>
         </w:tc>

</xml_diff>

<commit_message>
[labeling-studio-improve] Bước 2.3: Review workflow (annotator/reviewer/admin)
- Migration m004_add_review_status: 4 cột mới trên bảng images
  (review_status, review_comment, reviewed_by, reviewed_at)
- server/src/routes/reviews.js: submit-review/approve/reject với role guard
- tests/auth.test.js Row 8: 8 test case thật thay 3 dòng skip cũ
- Client: nút Gửi duyệt/Duyệt/Từ chối trong AnnotatorPage, filter + badge
  review trong ProjectDetailPage, getCurrentUser() helper trong api.ts
- CODE-GRAPH.md cập nhật §3.13, §6, §9, §10 + xuất lại .docx

Test: 87 passed, 0 failed, 3 skipped (Row 7 pending Phase 3 — đúng dự kiến)
tsc --noEmit client: 0 lỗi

Plan: docs/plans/PLAN-labeling-studio-improve-2026-08-04/steps/STEP-2.3-review-workflow.md
</commit_message>
<xml_diff>
--- a/code-graph/CODE-GRAPH.docx
+++ b/code-graph/CODE-GRAPH.docx
@@ -11864,6 +11864,991 @@
     </w:p>
     <w:p>
       <w:pPr>
+        <w:pStyle w:val="Heading3"/>
+        <w:spacing w:before="160" w:after="60"/>
+      </w:pPr>
+      <w:r>
+        <w:rPr>
+          <w:color w:val="4A3F8C"/>
+          <w:sz w:val="24"/>
+        </w:rPr>
+        <w:t>3.13 `server/src/routes/reviews.js` — Review workflow (STEP-2.3 MỚI)</w:t>
+      </w:r>
+    </w:p>
+    <w:tbl>
+      <w:tblPr>
+        <w:tblStyle w:val="TableGrid"/>
+        <w:tblW w:type="auto" w:w="0"/>
+        <w:tblLook w:firstColumn="1" w:firstRow="1" w:lastColumn="0" w:lastRow="0" w:noHBand="0" w:noVBand="1" w:val="04A0"/>
+      </w:tblPr>
+      <w:tblGrid>
+        <w:gridCol w:w="3230"/>
+        <w:gridCol w:w="3230"/>
+        <w:gridCol w:w="3230"/>
+      </w:tblGrid>
+      <w:tr>
+        <w:tc>
+          <w:tcPr>
+            <w:tcW w:type="dxa" w:w="3230"/>
+            <w:shd w:val="clear" w:color="auto" w:fill="251C53"/>
+            <w:tcBorders>
+              <w:top w:val="single" w:sz="4" w:space="0" w:color="251C53"/>
+              <w:left w:val="single" w:sz="4" w:space="0" w:color="251C53"/>
+              <w:bottom w:val="single" w:sz="4" w:space="0" w:color="251C53"/>
+              <w:right w:val="single" w:sz="4" w:space="0" w:color="251C53"/>
+            </w:tcBorders>
+          </w:tcPr>
+          <w:p>
+            <w:r>
+              <w:rPr>
+                <w:b/>
+                <w:color w:val="FFFFFF"/>
+                <w:sz w:val="20"/>
+              </w:rPr>
+              <w:t>Thuộc tính</w:t>
+            </w:r>
+          </w:p>
+        </w:tc>
+        <w:tc>
+          <w:tcPr>
+            <w:tcW w:type="dxa" w:w="3230"/>
+            <w:shd w:val="clear" w:color="auto" w:fill="251C53"/>
+            <w:tcBorders>
+              <w:top w:val="single" w:sz="4" w:space="0" w:color="251C53"/>
+              <w:left w:val="single" w:sz="4" w:space="0" w:color="251C53"/>
+              <w:bottom w:val="single" w:sz="4" w:space="0" w:color="251C53"/>
+              <w:right w:val="single" w:sz="4" w:space="0" w:color="251C53"/>
+            </w:tcBorders>
+          </w:tcPr>
+          <w:p>
+            <w:r>
+              <w:rPr>
+                <w:b/>
+                <w:color w:val="FFFFFF"/>
+                <w:sz w:val="20"/>
+              </w:rPr>
+              <w:t>Giá trị</w:t>
+            </w:r>
+          </w:p>
+        </w:tc>
+        <w:tc>
+          <w:tcPr>
+            <w:tcW w:type="dxa" w:w="3230"/>
+            <w:shd w:val="clear" w:color="auto" w:fill="251C53"/>
+            <w:tcBorders>
+              <w:top w:val="single" w:sz="4" w:space="0" w:color="251C53"/>
+              <w:left w:val="single" w:sz="4" w:space="0" w:color="251C53"/>
+              <w:bottom w:val="single" w:sz="4" w:space="0" w:color="251C53"/>
+              <w:right w:val="single" w:sz="4" w:space="0" w:color="251C53"/>
+            </w:tcBorders>
+          </w:tcPr>
+          <w:p>
+            <w:r>
+              <w:rPr>
+                <w:b/>
+                <w:color w:val="FFFFFF"/>
+                <w:sz w:val="20"/>
+              </w:rPr>
+              <w:t>Confidence</w:t>
+            </w:r>
+          </w:p>
+        </w:tc>
+      </w:tr>
+      <w:tr>
+        <w:tc>
+          <w:tcPr>
+            <w:tcW w:type="dxa" w:w="3230"/>
+            <w:tcBorders>
+              <w:top w:val="single" w:sz="4" w:space="0" w:color="CBCBCB"/>
+              <w:left w:val="single" w:sz="4" w:space="0" w:color="CBCBCB"/>
+              <w:bottom w:val="single" w:sz="4" w:space="0" w:color="CBCBCB"/>
+              <w:right w:val="single" w:sz="4" w:space="0" w:color="CBCBCB"/>
+            </w:tcBorders>
+          </w:tcPr>
+          <w:p>
+            <w:r>
+              <w:rPr>
+                <w:sz w:val="20"/>
+              </w:rPr>
+              <w:t>---</w:t>
+            </w:r>
+          </w:p>
+        </w:tc>
+        <w:tc>
+          <w:tcPr>
+            <w:tcW w:type="dxa" w:w="3230"/>
+            <w:tcBorders>
+              <w:top w:val="single" w:sz="4" w:space="0" w:color="CBCBCB"/>
+              <w:left w:val="single" w:sz="4" w:space="0" w:color="CBCBCB"/>
+              <w:bottom w:val="single" w:sz="4" w:space="0" w:color="CBCBCB"/>
+              <w:right w:val="single" w:sz="4" w:space="0" w:color="CBCBCB"/>
+            </w:tcBorders>
+          </w:tcPr>
+          <w:p>
+            <w:r>
+              <w:rPr>
+                <w:sz w:val="20"/>
+              </w:rPr>
+              <w:t>---</w:t>
+            </w:r>
+          </w:p>
+        </w:tc>
+        <w:tc>
+          <w:tcPr>
+            <w:tcW w:type="dxa" w:w="3230"/>
+            <w:tcBorders>
+              <w:top w:val="single" w:sz="4" w:space="0" w:color="CBCBCB"/>
+              <w:left w:val="single" w:sz="4" w:space="0" w:color="CBCBCB"/>
+              <w:bottom w:val="single" w:sz="4" w:space="0" w:color="CBCBCB"/>
+              <w:right w:val="single" w:sz="4" w:space="0" w:color="CBCBCB"/>
+            </w:tcBorders>
+          </w:tcPr>
+          <w:p>
+            <w:r>
+              <w:rPr>
+                <w:sz w:val="20"/>
+              </w:rPr>
+              <w:t>---</w:t>
+            </w:r>
+          </w:p>
+        </w:tc>
+      </w:tr>
+      <w:tr>
+        <w:tc>
+          <w:tcPr>
+            <w:tcW w:type="dxa" w:w="3230"/>
+            <w:shd w:val="clear" w:color="auto" w:fill="B8B3D6"/>
+            <w:tcBorders>
+              <w:top w:val="single" w:sz="4" w:space="0" w:color="CBCBCB"/>
+              <w:left w:val="single" w:sz="4" w:space="0" w:color="CBCBCB"/>
+              <w:bottom w:val="single" w:sz="4" w:space="0" w:color="CBCBCB"/>
+              <w:right w:val="single" w:sz="4" w:space="0" w:color="CBCBCB"/>
+            </w:tcBorders>
+          </w:tcPr>
+          <w:p>
+            <w:r>
+              <w:rPr>
+                <w:sz w:val="20"/>
+              </w:rPr>
+              <w:t>Router options</w:t>
+            </w:r>
+          </w:p>
+        </w:tc>
+        <w:tc>
+          <w:tcPr>
+            <w:tcW w:type="dxa" w:w="3230"/>
+            <w:shd w:val="clear" w:color="auto" w:fill="B8B3D6"/>
+            <w:tcBorders>
+              <w:top w:val="single" w:sz="4" w:space="0" w:color="CBCBCB"/>
+              <w:left w:val="single" w:sz="4" w:space="0" w:color="CBCBCB"/>
+              <w:bottom w:val="single" w:sz="4" w:space="0" w:color="CBCBCB"/>
+              <w:right w:val="single" w:sz="4" w:space="0" w:color="CBCBCB"/>
+            </w:tcBorders>
+          </w:tcPr>
+          <w:p>
+            <w:r>
+              <w:rPr>
+                <w:sz w:val="20"/>
+              </w:rPr>
+              <w:t>Router({ mergeParams: true })</w:t>
+            </w:r>
+          </w:p>
+        </w:tc>
+        <w:tc>
+          <w:tcPr>
+            <w:tcW w:type="dxa" w:w="3230"/>
+            <w:shd w:val="clear" w:color="auto" w:fill="B8B3D6"/>
+            <w:tcBorders>
+              <w:top w:val="single" w:sz="4" w:space="0" w:color="CBCBCB"/>
+              <w:left w:val="single" w:sz="4" w:space="0" w:color="CBCBCB"/>
+              <w:bottom w:val="single" w:sz="4" w:space="0" w:color="CBCBCB"/>
+              <w:right w:val="single" w:sz="4" w:space="0" w:color="CBCBCB"/>
+            </w:tcBorders>
+          </w:tcPr>
+          <w:p>
+            <w:r>
+              <w:rPr>
+                <w:sz w:val="20"/>
+              </w:rPr>
+              <w:t>CONFIRMED</w:t>
+            </w:r>
+          </w:p>
+        </w:tc>
+      </w:tr>
+      <w:tr>
+        <w:tc>
+          <w:tcPr>
+            <w:tcW w:type="dxa" w:w="3230"/>
+            <w:tcBorders>
+              <w:top w:val="single" w:sz="4" w:space="0" w:color="CBCBCB"/>
+              <w:left w:val="single" w:sz="4" w:space="0" w:color="CBCBCB"/>
+              <w:bottom w:val="single" w:sz="4" w:space="0" w:color="CBCBCB"/>
+              <w:right w:val="single" w:sz="4" w:space="0" w:color="CBCBCB"/>
+            </w:tcBorders>
+          </w:tcPr>
+          <w:p>
+            <w:r>
+              <w:rPr>
+                <w:sz w:val="20"/>
+              </w:rPr>
+              <w:t>Imports</w:t>
+            </w:r>
+          </w:p>
+        </w:tc>
+        <w:tc>
+          <w:tcPr>
+            <w:tcW w:type="dxa" w:w="3230"/>
+            <w:tcBorders>
+              <w:top w:val="single" w:sz="4" w:space="0" w:color="CBCBCB"/>
+              <w:left w:val="single" w:sz="4" w:space="0" w:color="CBCBCB"/>
+              <w:bottom w:val="single" w:sz="4" w:space="0" w:color="CBCBCB"/>
+              <w:right w:val="single" w:sz="4" w:space="0" w:color="CBCBCB"/>
+            </w:tcBorders>
+          </w:tcPr>
+          <w:p>
+            <w:r>
+              <w:rPr>
+                <w:sz w:val="20"/>
+              </w:rPr>
+              <w:t>db, requireRole (middleware/roles.js)</w:t>
+            </w:r>
+          </w:p>
+        </w:tc>
+        <w:tc>
+          <w:tcPr>
+            <w:tcW w:type="dxa" w:w="3230"/>
+            <w:tcBorders>
+              <w:top w:val="single" w:sz="4" w:space="0" w:color="CBCBCB"/>
+              <w:left w:val="single" w:sz="4" w:space="0" w:color="CBCBCB"/>
+              <w:bottom w:val="single" w:sz="4" w:space="0" w:color="CBCBCB"/>
+              <w:right w:val="single" w:sz="4" w:space="0" w:color="CBCBCB"/>
+            </w:tcBorders>
+          </w:tcPr>
+          <w:p>
+            <w:r>
+              <w:rPr>
+                <w:sz w:val="20"/>
+              </w:rPr>
+              <w:t>CONFIRMED</w:t>
+            </w:r>
+          </w:p>
+        </w:tc>
+      </w:tr>
+      <w:tr>
+        <w:tc>
+          <w:tcPr>
+            <w:tcW w:type="dxa" w:w="3230"/>
+            <w:shd w:val="clear" w:color="auto" w:fill="B8B3D6"/>
+            <w:tcBorders>
+              <w:top w:val="single" w:sz="4" w:space="0" w:color="CBCBCB"/>
+              <w:left w:val="single" w:sz="4" w:space="0" w:color="CBCBCB"/>
+              <w:bottom w:val="single" w:sz="4" w:space="0" w:color="CBCBCB"/>
+              <w:right w:val="single" w:sz="4" w:space="0" w:color="CBCBCB"/>
+            </w:tcBorders>
+          </w:tcPr>
+          <w:p>
+            <w:r>
+              <w:rPr>
+                <w:sz w:val="20"/>
+              </w:rPr>
+              <w:t>Callers/Used-by</w:t>
+            </w:r>
+          </w:p>
+        </w:tc>
+        <w:tc>
+          <w:tcPr>
+            <w:tcW w:type="dxa" w:w="3230"/>
+            <w:shd w:val="clear" w:color="auto" w:fill="B8B3D6"/>
+            <w:tcBorders>
+              <w:top w:val="single" w:sz="4" w:space="0" w:color="CBCBCB"/>
+              <w:left w:val="single" w:sz="4" w:space="0" w:color="CBCBCB"/>
+              <w:bottom w:val="single" w:sz="4" w:space="0" w:color="CBCBCB"/>
+              <w:right w:val="single" w:sz="4" w:space="0" w:color="CBCBCB"/>
+            </w:tcBorders>
+          </w:tcPr>
+          <w:p>
+            <w:r>
+              <w:rPr>
+                <w:sz w:val="20"/>
+              </w:rPr>
+              <w:t xml:space="preserve">index.js (mounted </w:t>
+            </w:r>
+            <w:r>
+              <w:rPr>
+                <w:rFonts w:ascii="Courier New" w:hAnsi="Courier New"/>
+                <w:color w:val="F05922"/>
+                <w:sz w:val="20"/>
+              </w:rPr>
+              <w:t>/api/images/:imageId</w:t>
+            </w:r>
+            <w:r>
+              <w:rPr>
+                <w:sz w:val="20"/>
+              </w:rPr>
+              <w:t>)</w:t>
+            </w:r>
+          </w:p>
+        </w:tc>
+        <w:tc>
+          <w:tcPr>
+            <w:tcW w:type="dxa" w:w="3230"/>
+            <w:shd w:val="clear" w:color="auto" w:fill="B8B3D6"/>
+            <w:tcBorders>
+              <w:top w:val="single" w:sz="4" w:space="0" w:color="CBCBCB"/>
+              <w:left w:val="single" w:sz="4" w:space="0" w:color="CBCBCB"/>
+              <w:bottom w:val="single" w:sz="4" w:space="0" w:color="CBCBCB"/>
+              <w:right w:val="single" w:sz="4" w:space="0" w:color="CBCBCB"/>
+            </w:tcBorders>
+          </w:tcPr>
+          <w:p>
+            <w:r>
+              <w:rPr>
+                <w:sz w:val="20"/>
+              </w:rPr>
+              <w:t>CONFIRMED</w:t>
+            </w:r>
+          </w:p>
+        </w:tc>
+      </w:tr>
+      <w:tr>
+        <w:tc>
+          <w:tcPr>
+            <w:tcW w:type="dxa" w:w="3230"/>
+            <w:tcBorders>
+              <w:top w:val="single" w:sz="4" w:space="0" w:color="CBCBCB"/>
+              <w:left w:val="single" w:sz="4" w:space="0" w:color="CBCBCB"/>
+              <w:bottom w:val="single" w:sz="4" w:space="0" w:color="CBCBCB"/>
+              <w:right w:val="single" w:sz="4" w:space="0" w:color="CBCBCB"/>
+            </w:tcBorders>
+          </w:tcPr>
+          <w:p>
+            <w:r>
+              <w:rPr>
+                <w:sz w:val="20"/>
+              </w:rPr>
+              <w:t>Last verified</w:t>
+            </w:r>
+          </w:p>
+        </w:tc>
+        <w:tc>
+          <w:tcPr>
+            <w:tcW w:type="dxa" w:w="3230"/>
+            <w:tcBorders>
+              <w:top w:val="single" w:sz="4" w:space="0" w:color="CBCBCB"/>
+              <w:left w:val="single" w:sz="4" w:space="0" w:color="CBCBCB"/>
+              <w:bottom w:val="single" w:sz="4" w:space="0" w:color="CBCBCB"/>
+              <w:right w:val="single" w:sz="4" w:space="0" w:color="CBCBCB"/>
+            </w:tcBorders>
+          </w:tcPr>
+          <w:p>
+            <w:r>
+              <w:rPr>
+                <w:sz w:val="20"/>
+              </w:rPr>
+              <w:t>2026-08-04 (STEP-2.3)</w:t>
+            </w:r>
+          </w:p>
+        </w:tc>
+        <w:tc>
+          <w:tcPr>
+            <w:tcW w:type="dxa" w:w="3230"/>
+            <w:tcBorders>
+              <w:top w:val="single" w:sz="4" w:space="0" w:color="CBCBCB"/>
+              <w:left w:val="single" w:sz="4" w:space="0" w:color="CBCBCB"/>
+              <w:bottom w:val="single" w:sz="4" w:space="0" w:color="CBCBCB"/>
+              <w:right w:val="single" w:sz="4" w:space="0" w:color="CBCBCB"/>
+            </w:tcBorders>
+          </w:tcPr>
+          <w:p>
+            <w:r>
+              <w:rPr>
+                <w:sz w:val="20"/>
+              </w:rPr>
+              <w:t>-</w:t>
+            </w:r>
+          </w:p>
+        </w:tc>
+      </w:tr>
+    </w:tbl>
+    <w:p/>
+    <w:tbl>
+      <w:tblPr>
+        <w:tblStyle w:val="TableGrid"/>
+        <w:tblW w:type="auto" w:w="0"/>
+        <w:tblLook w:firstColumn="1" w:firstRow="1" w:lastColumn="0" w:lastRow="0" w:noHBand="0" w:noVBand="1" w:val="04A0"/>
+      </w:tblPr>
+      <w:tblGrid>
+        <w:gridCol w:w="1938"/>
+        <w:gridCol w:w="1938"/>
+        <w:gridCol w:w="1938"/>
+        <w:gridCol w:w="1938"/>
+        <w:gridCol w:w="1938"/>
+      </w:tblGrid>
+      <w:tr>
+        <w:tc>
+          <w:tcPr>
+            <w:tcW w:type="dxa" w:w="1938"/>
+            <w:shd w:val="clear" w:color="auto" w:fill="251C53"/>
+            <w:tcBorders>
+              <w:top w:val="single" w:sz="4" w:space="0" w:color="251C53"/>
+              <w:left w:val="single" w:sz="4" w:space="0" w:color="251C53"/>
+              <w:bottom w:val="single" w:sz="4" w:space="0" w:color="251C53"/>
+              <w:right w:val="single" w:sz="4" w:space="0" w:color="251C53"/>
+            </w:tcBorders>
+          </w:tcPr>
+          <w:p>
+            <w:r>
+              <w:rPr>
+                <w:b/>
+                <w:color w:val="FFFFFF"/>
+                <w:sz w:val="20"/>
+              </w:rPr>
+              <w:t>Method</w:t>
+            </w:r>
+          </w:p>
+        </w:tc>
+        <w:tc>
+          <w:tcPr>
+            <w:tcW w:type="dxa" w:w="1938"/>
+            <w:shd w:val="clear" w:color="auto" w:fill="251C53"/>
+            <w:tcBorders>
+              <w:top w:val="single" w:sz="4" w:space="0" w:color="251C53"/>
+              <w:left w:val="single" w:sz="4" w:space="0" w:color="251C53"/>
+              <w:bottom w:val="single" w:sz="4" w:space="0" w:color="251C53"/>
+              <w:right w:val="single" w:sz="4" w:space="0" w:color="251C53"/>
+            </w:tcBorders>
+          </w:tcPr>
+          <w:p>
+            <w:r>
+              <w:rPr>
+                <w:b/>
+                <w:color w:val="FFFFFF"/>
+                <w:sz w:val="20"/>
+              </w:rPr>
+              <w:t>Path</w:t>
+            </w:r>
+          </w:p>
+        </w:tc>
+        <w:tc>
+          <w:tcPr>
+            <w:tcW w:type="dxa" w:w="1938"/>
+            <w:shd w:val="clear" w:color="auto" w:fill="251C53"/>
+            <w:tcBorders>
+              <w:top w:val="single" w:sz="4" w:space="0" w:color="251C53"/>
+              <w:left w:val="single" w:sz="4" w:space="0" w:color="251C53"/>
+              <w:bottom w:val="single" w:sz="4" w:space="0" w:color="251C53"/>
+              <w:right w:val="single" w:sz="4" w:space="0" w:color="251C53"/>
+            </w:tcBorders>
+          </w:tcPr>
+          <w:p>
+            <w:r>
+              <w:rPr>
+                <w:b/>
+                <w:color w:val="FFFFFF"/>
+                <w:sz w:val="20"/>
+              </w:rPr>
+              <w:t>Role required</w:t>
+            </w:r>
+          </w:p>
+        </w:tc>
+        <w:tc>
+          <w:tcPr>
+            <w:tcW w:type="dxa" w:w="1938"/>
+            <w:shd w:val="clear" w:color="auto" w:fill="251C53"/>
+            <w:tcBorders>
+              <w:top w:val="single" w:sz="4" w:space="0" w:color="251C53"/>
+              <w:left w:val="single" w:sz="4" w:space="0" w:color="251C53"/>
+              <w:bottom w:val="single" w:sz="4" w:space="0" w:color="251C53"/>
+              <w:right w:val="single" w:sz="4" w:space="0" w:color="251C53"/>
+            </w:tcBorders>
+          </w:tcPr>
+          <w:p>
+            <w:r>
+              <w:rPr>
+                <w:b/>
+                <w:color w:val="FFFFFF"/>
+                <w:sz w:val="20"/>
+              </w:rPr>
+              <w:t>Mô tả</w:t>
+            </w:r>
+          </w:p>
+        </w:tc>
+        <w:tc>
+          <w:tcPr>
+            <w:tcW w:type="dxa" w:w="1938"/>
+            <w:shd w:val="clear" w:color="auto" w:fill="251C53"/>
+            <w:tcBorders>
+              <w:top w:val="single" w:sz="4" w:space="0" w:color="251C53"/>
+              <w:left w:val="single" w:sz="4" w:space="0" w:color="251C53"/>
+              <w:bottom w:val="single" w:sz="4" w:space="0" w:color="251C53"/>
+              <w:right w:val="single" w:sz="4" w:space="0" w:color="251C53"/>
+            </w:tcBorders>
+          </w:tcPr>
+          <w:p>
+            <w:r>
+              <w:rPr>
+                <w:b/>
+                <w:color w:val="FFFFFF"/>
+                <w:sz w:val="20"/>
+              </w:rPr>
+            </w:r>
+          </w:p>
+        </w:tc>
+      </w:tr>
+      <w:tr>
+        <w:tc>
+          <w:tcPr>
+            <w:tcW w:type="dxa" w:w="1938"/>
+            <w:tcBorders>
+              <w:top w:val="single" w:sz="4" w:space="0" w:color="CBCBCB"/>
+              <w:left w:val="single" w:sz="4" w:space="0" w:color="CBCBCB"/>
+              <w:bottom w:val="single" w:sz="4" w:space="0" w:color="CBCBCB"/>
+              <w:right w:val="single" w:sz="4" w:space="0" w:color="CBCBCB"/>
+            </w:tcBorders>
+          </w:tcPr>
+          <w:p>
+            <w:r>
+              <w:rPr>
+                <w:sz w:val="20"/>
+              </w:rPr>
+              <w:t>---</w:t>
+            </w:r>
+          </w:p>
+        </w:tc>
+        <w:tc>
+          <w:tcPr>
+            <w:tcW w:type="dxa" w:w="1938"/>
+            <w:tcBorders>
+              <w:top w:val="single" w:sz="4" w:space="0" w:color="CBCBCB"/>
+              <w:left w:val="single" w:sz="4" w:space="0" w:color="CBCBCB"/>
+              <w:bottom w:val="single" w:sz="4" w:space="0" w:color="CBCBCB"/>
+              <w:right w:val="single" w:sz="4" w:space="0" w:color="CBCBCB"/>
+            </w:tcBorders>
+          </w:tcPr>
+          <w:p>
+            <w:r>
+              <w:rPr>
+                <w:sz w:val="20"/>
+              </w:rPr>
+              <w:t>---</w:t>
+            </w:r>
+          </w:p>
+        </w:tc>
+        <w:tc>
+          <w:tcPr>
+            <w:tcW w:type="dxa" w:w="1938"/>
+            <w:tcBorders>
+              <w:top w:val="single" w:sz="4" w:space="0" w:color="CBCBCB"/>
+              <w:left w:val="single" w:sz="4" w:space="0" w:color="CBCBCB"/>
+              <w:bottom w:val="single" w:sz="4" w:space="0" w:color="CBCBCB"/>
+              <w:right w:val="single" w:sz="4" w:space="0" w:color="CBCBCB"/>
+            </w:tcBorders>
+          </w:tcPr>
+          <w:p>
+            <w:r>
+              <w:rPr>
+                <w:sz w:val="20"/>
+              </w:rPr>
+              <w:t>---</w:t>
+            </w:r>
+          </w:p>
+        </w:tc>
+        <w:tc>
+          <w:tcPr>
+            <w:tcW w:type="dxa" w:w="1938"/>
+            <w:tcBorders>
+              <w:top w:val="single" w:sz="4" w:space="0" w:color="CBCBCB"/>
+              <w:left w:val="single" w:sz="4" w:space="0" w:color="CBCBCB"/>
+              <w:bottom w:val="single" w:sz="4" w:space="0" w:color="CBCBCB"/>
+              <w:right w:val="single" w:sz="4" w:space="0" w:color="CBCBCB"/>
+            </w:tcBorders>
+          </w:tcPr>
+          <w:p>
+            <w:r>
+              <w:rPr>
+                <w:sz w:val="20"/>
+              </w:rPr>
+              <w:t>---</w:t>
+            </w:r>
+          </w:p>
+        </w:tc>
+        <w:tc>
+          <w:tcPr>
+            <w:tcW w:type="dxa" w:w="1938"/>
+            <w:tcBorders>
+              <w:top w:val="single" w:sz="4" w:space="0" w:color="CBCBCB"/>
+              <w:left w:val="single" w:sz="4" w:space="0" w:color="CBCBCB"/>
+              <w:bottom w:val="single" w:sz="4" w:space="0" w:color="CBCBCB"/>
+              <w:right w:val="single" w:sz="4" w:space="0" w:color="CBCBCB"/>
+            </w:tcBorders>
+          </w:tcPr>
+          <w:p/>
+        </w:tc>
+      </w:tr>
+      <w:tr>
+        <w:tc>
+          <w:tcPr>
+            <w:tcW w:type="dxa" w:w="1938"/>
+            <w:shd w:val="clear" w:color="auto" w:fill="B8B3D6"/>
+            <w:tcBorders>
+              <w:top w:val="single" w:sz="4" w:space="0" w:color="CBCBCB"/>
+              <w:left w:val="single" w:sz="4" w:space="0" w:color="CBCBCB"/>
+              <w:bottom w:val="single" w:sz="4" w:space="0" w:color="CBCBCB"/>
+              <w:right w:val="single" w:sz="4" w:space="0" w:color="CBCBCB"/>
+            </w:tcBorders>
+          </w:tcPr>
+          <w:p>
+            <w:r>
+              <w:rPr>
+                <w:sz w:val="20"/>
+              </w:rPr>
+              <w:t>POST</w:t>
+            </w:r>
+          </w:p>
+        </w:tc>
+        <w:tc>
+          <w:tcPr>
+            <w:tcW w:type="dxa" w:w="1938"/>
+            <w:shd w:val="clear" w:color="auto" w:fill="B8B3D6"/>
+            <w:tcBorders>
+              <w:top w:val="single" w:sz="4" w:space="0" w:color="CBCBCB"/>
+              <w:left w:val="single" w:sz="4" w:space="0" w:color="CBCBCB"/>
+              <w:bottom w:val="single" w:sz="4" w:space="0" w:color="CBCBCB"/>
+              <w:right w:val="single" w:sz="4" w:space="0" w:color="CBCBCB"/>
+            </w:tcBorders>
+          </w:tcPr>
+          <w:p>
+            <w:r>
+              <w:rPr>
+                <w:rFonts w:ascii="Courier New" w:hAnsi="Courier New"/>
+                <w:color w:val="F05922"/>
+                <w:sz w:val="20"/>
+              </w:rPr>
+              <w:t>/submit-review</w:t>
+            </w:r>
+          </w:p>
+        </w:tc>
+        <w:tc>
+          <w:tcPr>
+            <w:tcW w:type="dxa" w:w="1938"/>
+            <w:shd w:val="clear" w:color="auto" w:fill="B8B3D6"/>
+            <w:tcBorders>
+              <w:top w:val="single" w:sz="4" w:space="0" w:color="CBCBCB"/>
+              <w:left w:val="single" w:sz="4" w:space="0" w:color="CBCBCB"/>
+              <w:bottom w:val="single" w:sz="4" w:space="0" w:color="CBCBCB"/>
+              <w:right w:val="single" w:sz="4" w:space="0" w:color="CBCBCB"/>
+            </w:tcBorders>
+          </w:tcPr>
+          <w:p>
+            <w:r>
+              <w:rPr>
+                <w:sz w:val="20"/>
+              </w:rPr>
+              <w:t>annotator, admin</w:t>
+            </w:r>
+          </w:p>
+        </w:tc>
+        <w:tc>
+          <w:tcPr>
+            <w:tcW w:type="dxa" w:w="1938"/>
+            <w:shd w:val="clear" w:color="auto" w:fill="B8B3D6"/>
+            <w:tcBorders>
+              <w:top w:val="single" w:sz="4" w:space="0" w:color="CBCBCB"/>
+              <w:left w:val="single" w:sz="4" w:space="0" w:color="CBCBCB"/>
+              <w:bottom w:val="single" w:sz="4" w:space="0" w:color="CBCBCB"/>
+              <w:right w:val="single" w:sz="4" w:space="0" w:color="CBCBCB"/>
+            </w:tcBorders>
+          </w:tcPr>
+          <w:p>
+            <w:r>
+              <w:rPr>
+                <w:sz w:val="20"/>
+              </w:rPr>
+              <w:t>draft\</w:t>
+            </w:r>
+          </w:p>
+        </w:tc>
+        <w:tc>
+          <w:tcPr>
+            <w:tcW w:type="dxa" w:w="1938"/>
+            <w:shd w:val="clear" w:color="auto" w:fill="B8B3D6"/>
+            <w:tcBorders>
+              <w:top w:val="single" w:sz="4" w:space="0" w:color="CBCBCB"/>
+              <w:left w:val="single" w:sz="4" w:space="0" w:color="CBCBCB"/>
+              <w:bottom w:val="single" w:sz="4" w:space="0" w:color="CBCBCB"/>
+              <w:right w:val="single" w:sz="4" w:space="0" w:color="CBCBCB"/>
+            </w:tcBorders>
+          </w:tcPr>
+          <w:p>
+            <w:r>
+              <w:rPr>
+                <w:sz w:val="20"/>
+              </w:rPr>
+              <w:t>rejected → in_review</w:t>
+            </w:r>
+          </w:p>
+        </w:tc>
+      </w:tr>
+      <w:tr>
+        <w:tc>
+          <w:tcPr>
+            <w:tcW w:type="dxa" w:w="1938"/>
+            <w:tcBorders>
+              <w:top w:val="single" w:sz="4" w:space="0" w:color="CBCBCB"/>
+              <w:left w:val="single" w:sz="4" w:space="0" w:color="CBCBCB"/>
+              <w:bottom w:val="single" w:sz="4" w:space="0" w:color="CBCBCB"/>
+              <w:right w:val="single" w:sz="4" w:space="0" w:color="CBCBCB"/>
+            </w:tcBorders>
+          </w:tcPr>
+          <w:p>
+            <w:r>
+              <w:rPr>
+                <w:sz w:val="20"/>
+              </w:rPr>
+              <w:t>POST</w:t>
+            </w:r>
+          </w:p>
+        </w:tc>
+        <w:tc>
+          <w:tcPr>
+            <w:tcW w:type="dxa" w:w="1938"/>
+            <w:tcBorders>
+              <w:top w:val="single" w:sz="4" w:space="0" w:color="CBCBCB"/>
+              <w:left w:val="single" w:sz="4" w:space="0" w:color="CBCBCB"/>
+              <w:bottom w:val="single" w:sz="4" w:space="0" w:color="CBCBCB"/>
+              <w:right w:val="single" w:sz="4" w:space="0" w:color="CBCBCB"/>
+            </w:tcBorders>
+          </w:tcPr>
+          <w:p>
+            <w:r>
+              <w:rPr>
+                <w:rFonts w:ascii="Courier New" w:hAnsi="Courier New"/>
+                <w:color w:val="F05922"/>
+                <w:sz w:val="20"/>
+              </w:rPr>
+              <w:t>/approve</w:t>
+            </w:r>
+          </w:p>
+        </w:tc>
+        <w:tc>
+          <w:tcPr>
+            <w:tcW w:type="dxa" w:w="1938"/>
+            <w:tcBorders>
+              <w:top w:val="single" w:sz="4" w:space="0" w:color="CBCBCB"/>
+              <w:left w:val="single" w:sz="4" w:space="0" w:color="CBCBCB"/>
+              <w:bottom w:val="single" w:sz="4" w:space="0" w:color="CBCBCB"/>
+              <w:right w:val="single" w:sz="4" w:space="0" w:color="CBCBCB"/>
+            </w:tcBorders>
+          </w:tcPr>
+          <w:p>
+            <w:r>
+              <w:rPr>
+                <w:sz w:val="20"/>
+              </w:rPr>
+              <w:t>reviewer, admin</w:t>
+            </w:r>
+          </w:p>
+        </w:tc>
+        <w:tc>
+          <w:tcPr>
+            <w:tcW w:type="dxa" w:w="1938"/>
+            <w:tcBorders>
+              <w:top w:val="single" w:sz="4" w:space="0" w:color="CBCBCB"/>
+              <w:left w:val="single" w:sz="4" w:space="0" w:color="CBCBCB"/>
+              <w:bottom w:val="single" w:sz="4" w:space="0" w:color="CBCBCB"/>
+              <w:right w:val="single" w:sz="4" w:space="0" w:color="CBCBCB"/>
+            </w:tcBorders>
+          </w:tcPr>
+          <w:p>
+            <w:r>
+              <w:rPr>
+                <w:sz w:val="20"/>
+              </w:rPr>
+              <w:t>in_review → approved</w:t>
+            </w:r>
+          </w:p>
+        </w:tc>
+        <w:tc>
+          <w:tcPr>
+            <w:tcW w:type="dxa" w:w="1938"/>
+            <w:tcBorders>
+              <w:top w:val="single" w:sz="4" w:space="0" w:color="CBCBCB"/>
+              <w:left w:val="single" w:sz="4" w:space="0" w:color="CBCBCB"/>
+              <w:bottom w:val="single" w:sz="4" w:space="0" w:color="CBCBCB"/>
+              <w:right w:val="single" w:sz="4" w:space="0" w:color="CBCBCB"/>
+            </w:tcBorders>
+          </w:tcPr>
+          <w:p/>
+        </w:tc>
+      </w:tr>
+      <w:tr>
+        <w:tc>
+          <w:tcPr>
+            <w:tcW w:type="dxa" w:w="1938"/>
+            <w:shd w:val="clear" w:color="auto" w:fill="B8B3D6"/>
+            <w:tcBorders>
+              <w:top w:val="single" w:sz="4" w:space="0" w:color="CBCBCB"/>
+              <w:left w:val="single" w:sz="4" w:space="0" w:color="CBCBCB"/>
+              <w:bottom w:val="single" w:sz="4" w:space="0" w:color="CBCBCB"/>
+              <w:right w:val="single" w:sz="4" w:space="0" w:color="CBCBCB"/>
+            </w:tcBorders>
+          </w:tcPr>
+          <w:p>
+            <w:r>
+              <w:rPr>
+                <w:sz w:val="20"/>
+              </w:rPr>
+              <w:t>POST</w:t>
+            </w:r>
+          </w:p>
+        </w:tc>
+        <w:tc>
+          <w:tcPr>
+            <w:tcW w:type="dxa" w:w="1938"/>
+            <w:shd w:val="clear" w:color="auto" w:fill="B8B3D6"/>
+            <w:tcBorders>
+              <w:top w:val="single" w:sz="4" w:space="0" w:color="CBCBCB"/>
+              <w:left w:val="single" w:sz="4" w:space="0" w:color="CBCBCB"/>
+              <w:bottom w:val="single" w:sz="4" w:space="0" w:color="CBCBCB"/>
+              <w:right w:val="single" w:sz="4" w:space="0" w:color="CBCBCB"/>
+            </w:tcBorders>
+          </w:tcPr>
+          <w:p>
+            <w:r>
+              <w:rPr>
+                <w:rFonts w:ascii="Courier New" w:hAnsi="Courier New"/>
+                <w:color w:val="F05922"/>
+                <w:sz w:val="20"/>
+              </w:rPr>
+              <w:t>/reject</w:t>
+            </w:r>
+          </w:p>
+        </w:tc>
+        <w:tc>
+          <w:tcPr>
+            <w:tcW w:type="dxa" w:w="1938"/>
+            <w:shd w:val="clear" w:color="auto" w:fill="B8B3D6"/>
+            <w:tcBorders>
+              <w:top w:val="single" w:sz="4" w:space="0" w:color="CBCBCB"/>
+              <w:left w:val="single" w:sz="4" w:space="0" w:color="CBCBCB"/>
+              <w:bottom w:val="single" w:sz="4" w:space="0" w:color="CBCBCB"/>
+              <w:right w:val="single" w:sz="4" w:space="0" w:color="CBCBCB"/>
+            </w:tcBorders>
+          </w:tcPr>
+          <w:p>
+            <w:r>
+              <w:rPr>
+                <w:sz w:val="20"/>
+              </w:rPr>
+              <w:t>reviewer, admin</w:t>
+            </w:r>
+          </w:p>
+        </w:tc>
+        <w:tc>
+          <w:tcPr>
+            <w:tcW w:type="dxa" w:w="1938"/>
+            <w:shd w:val="clear" w:color="auto" w:fill="B8B3D6"/>
+            <w:tcBorders>
+              <w:top w:val="single" w:sz="4" w:space="0" w:color="CBCBCB"/>
+              <w:left w:val="single" w:sz="4" w:space="0" w:color="CBCBCB"/>
+              <w:bottom w:val="single" w:sz="4" w:space="0" w:color="CBCBCB"/>
+              <w:right w:val="single" w:sz="4" w:space="0" w:color="CBCBCB"/>
+            </w:tcBorders>
+          </w:tcPr>
+          <w:p>
+            <w:r>
+              <w:rPr>
+                <w:sz w:val="20"/>
+              </w:rPr>
+              <w:t xml:space="preserve">in_review → rejected (body: </w:t>
+            </w:r>
+            <w:r>
+              <w:rPr>
+                <w:rFonts w:ascii="Courier New" w:hAnsi="Courier New"/>
+                <w:color w:val="F05922"/>
+                <w:sz w:val="20"/>
+              </w:rPr>
+              <w:t>{comment}</w:t>
+            </w:r>
+            <w:r>
+              <w:rPr>
+                <w:sz w:val="20"/>
+              </w:rPr>
+              <w:t>)</w:t>
+            </w:r>
+          </w:p>
+        </w:tc>
+        <w:tc>
+          <w:tcPr>
+            <w:tcW w:type="dxa" w:w="1938"/>
+            <w:shd w:val="clear" w:color="auto" w:fill="B8B3D6"/>
+            <w:tcBorders>
+              <w:top w:val="single" w:sz="4" w:space="0" w:color="CBCBCB"/>
+              <w:left w:val="single" w:sz="4" w:space="0" w:color="CBCBCB"/>
+              <w:bottom w:val="single" w:sz="4" w:space="0" w:color="CBCBCB"/>
+              <w:right w:val="single" w:sz="4" w:space="0" w:color="CBCBCB"/>
+            </w:tcBorders>
+          </w:tcPr>
+          <w:p/>
+        </w:tc>
+      </w:tr>
+    </w:tbl>
+    <w:p/>
+    <w:p>
+      <w:pPr>
+        <w:spacing w:after="80"/>
+      </w:pPr>
+      <w:r>
+        <w:rPr>
+          <w:sz w:val="21"/>
+        </w:rPr>
+        <w:t xml:space="preserve">Lifecycle: </w:t>
+      </w:r>
+      <w:r>
+        <w:rPr>
+          <w:rFonts w:ascii="Courier New" w:hAnsi="Courier New"/>
+          <w:color w:val="F05922"/>
+          <w:sz w:val="18"/>
+        </w:rPr>
+        <w:t>draft → in_review → approved</w:t>
+      </w:r>
+      <w:r>
+        <w:rPr>
+          <w:sz w:val="21"/>
+        </w:rPr>
+        <w:t xml:space="preserve"> hoặc </w:t>
+      </w:r>
+      <w:r>
+        <w:rPr>
+          <w:rFonts w:ascii="Courier New" w:hAnsi="Courier New"/>
+          <w:color w:val="F05922"/>
+          <w:sz w:val="18"/>
+        </w:rPr>
+        <w:t>→ rejected → (submit lại) → in_review</w:t>
+      </w:r>
+      <w:r>
+        <w:rPr>
+          <w:sz w:val="21"/>
+        </w:rPr>
+        <w:t xml:space="preserve">. Conflict trạng thái sai → 409 </w:t>
+      </w:r>
+      <w:r>
+        <w:rPr>
+          <w:rFonts w:ascii="Courier New" w:hAnsi="Courier New"/>
+          <w:color w:val="F05922"/>
+          <w:sz w:val="18"/>
+        </w:rPr>
+        <w:t>REVIEW_STATUS_CONFLICT</w:t>
+      </w:r>
+      <w:r>
+        <w:rPr>
+          <w:sz w:val="21"/>
+        </w:rPr>
+        <w:t>.</w:t>
+      </w:r>
+    </w:p>
+    <w:p>
+      <w:pPr>
         <w:pBdr>
           <w:bottom w:val="single" w:sz="6" w:space="1" w:color="F05922"/>
         </w:pBdr>
@@ -17165,14 +18150,15 @@
         <w:tblLook w:firstColumn="1" w:firstRow="1" w:lastColumn="0" w:lastRow="0" w:noHBand="0" w:noVBand="1" w:val="04A0"/>
       </w:tblPr>
       <w:tblGrid>
-        <w:gridCol w:w="3230"/>
-        <w:gridCol w:w="3230"/>
-        <w:gridCol w:w="3230"/>
+        <w:gridCol w:w="2422"/>
+        <w:gridCol w:w="2422"/>
+        <w:gridCol w:w="2422"/>
+        <w:gridCol w:w="2422"/>
       </w:tblGrid>
       <w:tr>
         <w:tc>
           <w:tcPr>
-            <w:tcW w:type="dxa" w:w="3230"/>
+            <w:tcW w:type="dxa" w:w="2422"/>
             <w:shd w:val="clear" w:color="auto" w:fill="251C53"/>
             <w:tcBorders>
               <w:top w:val="single" w:sz="4" w:space="0" w:color="251C53"/>
@@ -17194,7 +18180,7 @@
         </w:tc>
         <w:tc>
           <w:tcPr>
-            <w:tcW w:type="dxa" w:w="3230"/>
+            <w:tcW w:type="dxa" w:w="2422"/>
             <w:shd w:val="clear" w:color="auto" w:fill="251C53"/>
             <w:tcBorders>
               <w:top w:val="single" w:sz="4" w:space="0" w:color="251C53"/>
@@ -17216,7 +18202,7 @@
         </w:tc>
         <w:tc>
           <w:tcPr>
-            <w:tcW w:type="dxa" w:w="3230"/>
+            <w:tcW w:type="dxa" w:w="2422"/>
             <w:shd w:val="clear" w:color="auto" w:fill="251C53"/>
             <w:tcBorders>
               <w:top w:val="single" w:sz="4" w:space="0" w:color="251C53"/>
@@ -17236,11 +18222,32 @@
             </w:r>
           </w:p>
         </w:tc>
+        <w:tc>
+          <w:tcPr>
+            <w:tcW w:type="dxa" w:w="2422"/>
+            <w:shd w:val="clear" w:color="auto" w:fill="251C53"/>
+            <w:tcBorders>
+              <w:top w:val="single" w:sz="4" w:space="0" w:color="251C53"/>
+              <w:left w:val="single" w:sz="4" w:space="0" w:color="251C53"/>
+              <w:bottom w:val="single" w:sz="4" w:space="0" w:color="251C53"/>
+              <w:right w:val="single" w:sz="4" w:space="0" w:color="251C53"/>
+            </w:tcBorders>
+          </w:tcPr>
+          <w:p>
+            <w:r>
+              <w:rPr>
+                <w:b/>
+                <w:color w:val="FFFFFF"/>
+                <w:sz w:val="20"/>
+              </w:rPr>
+            </w:r>
+          </w:p>
+        </w:tc>
       </w:tr>
       <w:tr>
         <w:tc>
           <w:tcPr>
-            <w:tcW w:type="dxa" w:w="3230"/>
+            <w:tcW w:type="dxa" w:w="2422"/>
             <w:tcBorders>
               <w:top w:val="single" w:sz="4" w:space="0" w:color="CBCBCB"/>
               <w:left w:val="single" w:sz="4" w:space="0" w:color="CBCBCB"/>
@@ -17259,7 +18266,7 @@
         </w:tc>
         <w:tc>
           <w:tcPr>
-            <w:tcW w:type="dxa" w:w="3230"/>
+            <w:tcW w:type="dxa" w:w="2422"/>
             <w:tcBorders>
               <w:top w:val="single" w:sz="4" w:space="0" w:color="CBCBCB"/>
               <w:left w:val="single" w:sz="4" w:space="0" w:color="CBCBCB"/>
@@ -17278,7 +18285,7 @@
         </w:tc>
         <w:tc>
           <w:tcPr>
-            <w:tcW w:type="dxa" w:w="3230"/>
+            <w:tcW w:type="dxa" w:w="2422"/>
             <w:tcBorders>
               <w:top w:val="single" w:sz="4" w:space="0" w:color="CBCBCB"/>
               <w:left w:val="single" w:sz="4" w:space="0" w:color="CBCBCB"/>
@@ -17294,12 +18301,24 @@
               <w:t>---</w:t>
             </w:r>
           </w:p>
+        </w:tc>
+        <w:tc>
+          <w:tcPr>
+            <w:tcW w:type="dxa" w:w="2422"/>
+            <w:tcBorders>
+              <w:top w:val="single" w:sz="4" w:space="0" w:color="CBCBCB"/>
+              <w:left w:val="single" w:sz="4" w:space="0" w:color="CBCBCB"/>
+              <w:bottom w:val="single" w:sz="4" w:space="0" w:color="CBCBCB"/>
+              <w:right w:val="single" w:sz="4" w:space="0" w:color="CBCBCB"/>
+            </w:tcBorders>
+          </w:tcPr>
+          <w:p/>
         </w:tc>
       </w:tr>
       <w:tr>
         <w:tc>
           <w:tcPr>
-            <w:tcW w:type="dxa" w:w="3230"/>
+            <w:tcW w:type="dxa" w:w="2422"/>
             <w:shd w:val="clear" w:color="auto" w:fill="B8B3D6"/>
             <w:tcBorders>
               <w:top w:val="single" w:sz="4" w:space="0" w:color="CBCBCB"/>
@@ -17319,7 +18338,7 @@
         </w:tc>
         <w:tc>
           <w:tcPr>
-            <w:tcW w:type="dxa" w:w="3230"/>
+            <w:tcW w:type="dxa" w:w="2422"/>
             <w:shd w:val="clear" w:color="auto" w:fill="B8B3D6"/>
             <w:tcBorders>
               <w:top w:val="single" w:sz="4" w:space="0" w:color="CBCBCB"/>
@@ -17339,7 +18358,7 @@
         </w:tc>
         <w:tc>
           <w:tcPr>
-            <w:tcW w:type="dxa" w:w="3230"/>
+            <w:tcW w:type="dxa" w:w="2422"/>
             <w:shd w:val="clear" w:color="auto" w:fill="B8B3D6"/>
             <w:tcBorders>
               <w:top w:val="single" w:sz="4" w:space="0" w:color="CBCBCB"/>
@@ -17356,12 +18375,25 @@
               <w:t>PRIMARY KEY</w:t>
             </w:r>
           </w:p>
+        </w:tc>
+        <w:tc>
+          <w:tcPr>
+            <w:tcW w:type="dxa" w:w="2422"/>
+            <w:shd w:val="clear" w:color="auto" w:fill="B8B3D6"/>
+            <w:tcBorders>
+              <w:top w:val="single" w:sz="4" w:space="0" w:color="CBCBCB"/>
+              <w:left w:val="single" w:sz="4" w:space="0" w:color="CBCBCB"/>
+              <w:bottom w:val="single" w:sz="4" w:space="0" w:color="CBCBCB"/>
+              <w:right w:val="single" w:sz="4" w:space="0" w:color="CBCBCB"/>
+            </w:tcBorders>
+          </w:tcPr>
+          <w:p/>
         </w:tc>
       </w:tr>
       <w:tr>
         <w:tc>
           <w:tcPr>
-            <w:tcW w:type="dxa" w:w="3230"/>
+            <w:tcW w:type="dxa" w:w="2422"/>
             <w:tcBorders>
               <w:top w:val="single" w:sz="4" w:space="0" w:color="CBCBCB"/>
               <w:left w:val="single" w:sz="4" w:space="0" w:color="CBCBCB"/>
@@ -17380,7 +18412,7 @@
         </w:tc>
         <w:tc>
           <w:tcPr>
-            <w:tcW w:type="dxa" w:w="3230"/>
+            <w:tcW w:type="dxa" w:w="2422"/>
             <w:tcBorders>
               <w:top w:val="single" w:sz="4" w:space="0" w:color="CBCBCB"/>
               <w:left w:val="single" w:sz="4" w:space="0" w:color="CBCBCB"/>
@@ -17399,7 +18431,7 @@
         </w:tc>
         <w:tc>
           <w:tcPr>
-            <w:tcW w:type="dxa" w:w="3230"/>
+            <w:tcW w:type="dxa" w:w="2422"/>
             <w:tcBorders>
               <w:top w:val="single" w:sz="4" w:space="0" w:color="CBCBCB"/>
               <w:left w:val="single" w:sz="4" w:space="0" w:color="CBCBCB"/>
@@ -17415,12 +18447,24 @@
               <w:t>NOT NULL, FK→projects(id) ON DELETE CASCADE</w:t>
             </w:r>
           </w:p>
+        </w:tc>
+        <w:tc>
+          <w:tcPr>
+            <w:tcW w:type="dxa" w:w="2422"/>
+            <w:tcBorders>
+              <w:top w:val="single" w:sz="4" w:space="0" w:color="CBCBCB"/>
+              <w:left w:val="single" w:sz="4" w:space="0" w:color="CBCBCB"/>
+              <w:bottom w:val="single" w:sz="4" w:space="0" w:color="CBCBCB"/>
+              <w:right w:val="single" w:sz="4" w:space="0" w:color="CBCBCB"/>
+            </w:tcBorders>
+          </w:tcPr>
+          <w:p/>
         </w:tc>
       </w:tr>
       <w:tr>
         <w:tc>
           <w:tcPr>
-            <w:tcW w:type="dxa" w:w="3230"/>
+            <w:tcW w:type="dxa" w:w="2422"/>
             <w:shd w:val="clear" w:color="auto" w:fill="B8B3D6"/>
             <w:tcBorders>
               <w:top w:val="single" w:sz="4" w:space="0" w:color="CBCBCB"/>
@@ -17440,7 +18484,7 @@
         </w:tc>
         <w:tc>
           <w:tcPr>
-            <w:tcW w:type="dxa" w:w="3230"/>
+            <w:tcW w:type="dxa" w:w="2422"/>
             <w:shd w:val="clear" w:color="auto" w:fill="B8B3D6"/>
             <w:tcBorders>
               <w:top w:val="single" w:sz="4" w:space="0" w:color="CBCBCB"/>
@@ -17460,7 +18504,7 @@
         </w:tc>
         <w:tc>
           <w:tcPr>
-            <w:tcW w:type="dxa" w:w="3230"/>
+            <w:tcW w:type="dxa" w:w="2422"/>
             <w:shd w:val="clear" w:color="auto" w:fill="B8B3D6"/>
             <w:tcBorders>
               <w:top w:val="single" w:sz="4" w:space="0" w:color="CBCBCB"/>
@@ -17477,12 +18521,25 @@
               <w:t>NOT NULL (tên file trên disk, nanoid+ext)</w:t>
             </w:r>
           </w:p>
+        </w:tc>
+        <w:tc>
+          <w:tcPr>
+            <w:tcW w:type="dxa" w:w="2422"/>
+            <w:shd w:val="clear" w:color="auto" w:fill="B8B3D6"/>
+            <w:tcBorders>
+              <w:top w:val="single" w:sz="4" w:space="0" w:color="CBCBCB"/>
+              <w:left w:val="single" w:sz="4" w:space="0" w:color="CBCBCB"/>
+              <w:bottom w:val="single" w:sz="4" w:space="0" w:color="CBCBCB"/>
+              <w:right w:val="single" w:sz="4" w:space="0" w:color="CBCBCB"/>
+            </w:tcBorders>
+          </w:tcPr>
+          <w:p/>
         </w:tc>
       </w:tr>
       <w:tr>
         <w:tc>
           <w:tcPr>
-            <w:tcW w:type="dxa" w:w="3230"/>
+            <w:tcW w:type="dxa" w:w="2422"/>
             <w:tcBorders>
               <w:top w:val="single" w:sz="4" w:space="0" w:color="CBCBCB"/>
               <w:left w:val="single" w:sz="4" w:space="0" w:color="CBCBCB"/>
@@ -17501,7 +18558,7 @@
         </w:tc>
         <w:tc>
           <w:tcPr>
-            <w:tcW w:type="dxa" w:w="3230"/>
+            <w:tcW w:type="dxa" w:w="2422"/>
             <w:tcBorders>
               <w:top w:val="single" w:sz="4" w:space="0" w:color="CBCBCB"/>
               <w:left w:val="single" w:sz="4" w:space="0" w:color="CBCBCB"/>
@@ -17520,7 +18577,7 @@
         </w:tc>
         <w:tc>
           <w:tcPr>
-            <w:tcW w:type="dxa" w:w="3230"/>
+            <w:tcW w:type="dxa" w:w="2422"/>
             <w:tcBorders>
               <w:top w:val="single" w:sz="4" w:space="0" w:color="CBCBCB"/>
               <w:left w:val="single" w:sz="4" w:space="0" w:color="CBCBCB"/>
@@ -17536,12 +18593,24 @@
               <w:t>NOT NULL (tên gốc khi upload)</w:t>
             </w:r>
           </w:p>
+        </w:tc>
+        <w:tc>
+          <w:tcPr>
+            <w:tcW w:type="dxa" w:w="2422"/>
+            <w:tcBorders>
+              <w:top w:val="single" w:sz="4" w:space="0" w:color="CBCBCB"/>
+              <w:left w:val="single" w:sz="4" w:space="0" w:color="CBCBCB"/>
+              <w:bottom w:val="single" w:sz="4" w:space="0" w:color="CBCBCB"/>
+              <w:right w:val="single" w:sz="4" w:space="0" w:color="CBCBCB"/>
+            </w:tcBorders>
+          </w:tcPr>
+          <w:p/>
         </w:tc>
       </w:tr>
       <w:tr>
         <w:tc>
           <w:tcPr>
-            <w:tcW w:type="dxa" w:w="3230"/>
+            <w:tcW w:type="dxa" w:w="2422"/>
             <w:shd w:val="clear" w:color="auto" w:fill="B8B3D6"/>
             <w:tcBorders>
               <w:top w:val="single" w:sz="4" w:space="0" w:color="CBCBCB"/>
@@ -17561,7 +18630,7 @@
         </w:tc>
         <w:tc>
           <w:tcPr>
-            <w:tcW w:type="dxa" w:w="3230"/>
+            <w:tcW w:type="dxa" w:w="2422"/>
             <w:shd w:val="clear" w:color="auto" w:fill="B8B3D6"/>
             <w:tcBorders>
               <w:top w:val="single" w:sz="4" w:space="0" w:color="CBCBCB"/>
@@ -17581,7 +18650,7 @@
         </w:tc>
         <w:tc>
           <w:tcPr>
-            <w:tcW w:type="dxa" w:w="3230"/>
+            <w:tcW w:type="dxa" w:w="2422"/>
             <w:shd w:val="clear" w:color="auto" w:fill="B8B3D6"/>
             <w:tcBorders>
               <w:top w:val="single" w:sz="4" w:space="0" w:color="CBCBCB"/>
@@ -17598,12 +18667,25 @@
               <w:t>NOT NULL</w:t>
             </w:r>
           </w:p>
+        </w:tc>
+        <w:tc>
+          <w:tcPr>
+            <w:tcW w:type="dxa" w:w="2422"/>
+            <w:shd w:val="clear" w:color="auto" w:fill="B8B3D6"/>
+            <w:tcBorders>
+              <w:top w:val="single" w:sz="4" w:space="0" w:color="CBCBCB"/>
+              <w:left w:val="single" w:sz="4" w:space="0" w:color="CBCBCB"/>
+              <w:bottom w:val="single" w:sz="4" w:space="0" w:color="CBCBCB"/>
+              <w:right w:val="single" w:sz="4" w:space="0" w:color="CBCBCB"/>
+            </w:tcBorders>
+          </w:tcPr>
+          <w:p/>
         </w:tc>
       </w:tr>
       <w:tr>
         <w:tc>
           <w:tcPr>
-            <w:tcW w:type="dxa" w:w="3230"/>
+            <w:tcW w:type="dxa" w:w="2422"/>
             <w:tcBorders>
               <w:top w:val="single" w:sz="4" w:space="0" w:color="CBCBCB"/>
               <w:left w:val="single" w:sz="4" w:space="0" w:color="CBCBCB"/>
@@ -17622,7 +18704,7 @@
         </w:tc>
         <w:tc>
           <w:tcPr>
-            <w:tcW w:type="dxa" w:w="3230"/>
+            <w:tcW w:type="dxa" w:w="2422"/>
             <w:tcBorders>
               <w:top w:val="single" w:sz="4" w:space="0" w:color="CBCBCB"/>
               <w:left w:val="single" w:sz="4" w:space="0" w:color="CBCBCB"/>
@@ -17641,7 +18723,7 @@
         </w:tc>
         <w:tc>
           <w:tcPr>
-            <w:tcW w:type="dxa" w:w="3230"/>
+            <w:tcW w:type="dxa" w:w="2422"/>
             <w:tcBorders>
               <w:top w:val="single" w:sz="4" w:space="0" w:color="CBCBCB"/>
               <w:left w:val="single" w:sz="4" w:space="0" w:color="CBCBCB"/>
@@ -17657,12 +18739,24 @@
               <w:t>NOT NULL</w:t>
             </w:r>
           </w:p>
+        </w:tc>
+        <w:tc>
+          <w:tcPr>
+            <w:tcW w:type="dxa" w:w="2422"/>
+            <w:tcBorders>
+              <w:top w:val="single" w:sz="4" w:space="0" w:color="CBCBCB"/>
+              <w:left w:val="single" w:sz="4" w:space="0" w:color="CBCBCB"/>
+              <w:bottom w:val="single" w:sz="4" w:space="0" w:color="CBCBCB"/>
+              <w:right w:val="single" w:sz="4" w:space="0" w:color="CBCBCB"/>
+            </w:tcBorders>
+          </w:tcPr>
+          <w:p/>
         </w:tc>
       </w:tr>
       <w:tr>
         <w:tc>
           <w:tcPr>
-            <w:tcW w:type="dxa" w:w="3230"/>
+            <w:tcW w:type="dxa" w:w="2422"/>
             <w:shd w:val="clear" w:color="auto" w:fill="B8B3D6"/>
             <w:tcBorders>
               <w:top w:val="single" w:sz="4" w:space="0" w:color="CBCBCB"/>
@@ -17682,7 +18776,7 @@
         </w:tc>
         <w:tc>
           <w:tcPr>
-            <w:tcW w:type="dxa" w:w="3230"/>
+            <w:tcW w:type="dxa" w:w="2422"/>
             <w:shd w:val="clear" w:color="auto" w:fill="B8B3D6"/>
             <w:tcBorders>
               <w:top w:val="single" w:sz="4" w:space="0" w:color="CBCBCB"/>
@@ -17702,7 +18796,7 @@
         </w:tc>
         <w:tc>
           <w:tcPr>
-            <w:tcW w:type="dxa" w:w="3230"/>
+            <w:tcW w:type="dxa" w:w="2422"/>
             <w:shd w:val="clear" w:color="auto" w:fill="B8B3D6"/>
             <w:tcBorders>
               <w:top w:val="single" w:sz="4" w:space="0" w:color="CBCBCB"/>
@@ -17719,12 +18813,25 @@
               <w:t>NOT NULL DEFAULT 'train' (train/valid/test)</w:t>
             </w:r>
           </w:p>
+        </w:tc>
+        <w:tc>
+          <w:tcPr>
+            <w:tcW w:type="dxa" w:w="2422"/>
+            <w:shd w:val="clear" w:color="auto" w:fill="B8B3D6"/>
+            <w:tcBorders>
+              <w:top w:val="single" w:sz="4" w:space="0" w:color="CBCBCB"/>
+              <w:left w:val="single" w:sz="4" w:space="0" w:color="CBCBCB"/>
+              <w:bottom w:val="single" w:sz="4" w:space="0" w:color="CBCBCB"/>
+              <w:right w:val="single" w:sz="4" w:space="0" w:color="CBCBCB"/>
+            </w:tcBorders>
+          </w:tcPr>
+          <w:p/>
         </w:tc>
       </w:tr>
       <w:tr>
         <w:tc>
           <w:tcPr>
-            <w:tcW w:type="dxa" w:w="3230"/>
+            <w:tcW w:type="dxa" w:w="2422"/>
             <w:tcBorders>
               <w:top w:val="single" w:sz="4" w:space="0" w:color="CBCBCB"/>
               <w:left w:val="single" w:sz="4" w:space="0" w:color="CBCBCB"/>
@@ -17743,7 +18850,7 @@
         </w:tc>
         <w:tc>
           <w:tcPr>
-            <w:tcW w:type="dxa" w:w="3230"/>
+            <w:tcW w:type="dxa" w:w="2422"/>
             <w:tcBorders>
               <w:top w:val="single" w:sz="4" w:space="0" w:color="CBCBCB"/>
               <w:left w:val="single" w:sz="4" w:space="0" w:color="CBCBCB"/>
@@ -17762,7 +18869,7 @@
         </w:tc>
         <w:tc>
           <w:tcPr>
-            <w:tcW w:type="dxa" w:w="3230"/>
+            <w:tcW w:type="dxa" w:w="2422"/>
             <w:tcBorders>
               <w:top w:val="single" w:sz="4" w:space="0" w:color="CBCBCB"/>
               <w:left w:val="single" w:sz="4" w:space="0" w:color="CBCBCB"/>
@@ -17778,12 +18885,24 @@
               <w:t>NOT NULL DEFAULT 'unlabeled' (unlabeled/labeled)</w:t>
             </w:r>
           </w:p>
+        </w:tc>
+        <w:tc>
+          <w:tcPr>
+            <w:tcW w:type="dxa" w:w="2422"/>
+            <w:tcBorders>
+              <w:top w:val="single" w:sz="4" w:space="0" w:color="CBCBCB"/>
+              <w:left w:val="single" w:sz="4" w:space="0" w:color="CBCBCB"/>
+              <w:bottom w:val="single" w:sz="4" w:space="0" w:color="CBCBCB"/>
+              <w:right w:val="single" w:sz="4" w:space="0" w:color="CBCBCB"/>
+            </w:tcBorders>
+          </w:tcPr>
+          <w:p/>
         </w:tc>
       </w:tr>
       <w:tr>
         <w:tc>
           <w:tcPr>
-            <w:tcW w:type="dxa" w:w="3230"/>
+            <w:tcW w:type="dxa" w:w="2422"/>
             <w:shd w:val="clear" w:color="auto" w:fill="B8B3D6"/>
             <w:tcBorders>
               <w:top w:val="single" w:sz="4" w:space="0" w:color="CBCBCB"/>
@@ -17803,7 +18922,7 @@
         </w:tc>
         <w:tc>
           <w:tcPr>
-            <w:tcW w:type="dxa" w:w="3230"/>
+            <w:tcW w:type="dxa" w:w="2422"/>
             <w:shd w:val="clear" w:color="auto" w:fill="B8B3D6"/>
             <w:tcBorders>
               <w:top w:val="single" w:sz="4" w:space="0" w:color="CBCBCB"/>
@@ -17823,7 +18942,7 @@
         </w:tc>
         <w:tc>
           <w:tcPr>
-            <w:tcW w:type="dxa" w:w="3230"/>
+            <w:tcW w:type="dxa" w:w="2422"/>
             <w:shd w:val="clear" w:color="auto" w:fill="B8B3D6"/>
             <w:tcBorders>
               <w:top w:val="single" w:sz="4" w:space="0" w:color="CBCBCB"/>
@@ -17840,6 +18959,318 @@
               <w:t>NOT NULL DEFAULT datetime('now')</w:t>
             </w:r>
           </w:p>
+        </w:tc>
+        <w:tc>
+          <w:tcPr>
+            <w:tcW w:type="dxa" w:w="2422"/>
+            <w:shd w:val="clear" w:color="auto" w:fill="B8B3D6"/>
+            <w:tcBorders>
+              <w:top w:val="single" w:sz="4" w:space="0" w:color="CBCBCB"/>
+              <w:left w:val="single" w:sz="4" w:space="0" w:color="CBCBCB"/>
+              <w:bottom w:val="single" w:sz="4" w:space="0" w:color="CBCBCB"/>
+              <w:right w:val="single" w:sz="4" w:space="0" w:color="CBCBCB"/>
+            </w:tcBorders>
+          </w:tcPr>
+          <w:p/>
+        </w:tc>
+      </w:tr>
+      <w:tr>
+        <w:tc>
+          <w:tcPr>
+            <w:tcW w:type="dxa" w:w="2422"/>
+            <w:tcBorders>
+              <w:top w:val="single" w:sz="4" w:space="0" w:color="CBCBCB"/>
+              <w:left w:val="single" w:sz="4" w:space="0" w:color="CBCBCB"/>
+              <w:bottom w:val="single" w:sz="4" w:space="0" w:color="CBCBCB"/>
+              <w:right w:val="single" w:sz="4" w:space="0" w:color="CBCBCB"/>
+            </w:tcBorders>
+          </w:tcPr>
+          <w:p>
+            <w:r>
+              <w:rPr>
+                <w:sz w:val="20"/>
+              </w:rPr>
+              <w:t>review_status</w:t>
+            </w:r>
+          </w:p>
+        </w:tc>
+        <w:tc>
+          <w:tcPr>
+            <w:tcW w:type="dxa" w:w="2422"/>
+            <w:tcBorders>
+              <w:top w:val="single" w:sz="4" w:space="0" w:color="CBCBCB"/>
+              <w:left w:val="single" w:sz="4" w:space="0" w:color="CBCBCB"/>
+              <w:bottom w:val="single" w:sz="4" w:space="0" w:color="CBCBCB"/>
+              <w:right w:val="single" w:sz="4" w:space="0" w:color="CBCBCB"/>
+            </w:tcBorders>
+          </w:tcPr>
+          <w:p>
+            <w:r>
+              <w:rPr>
+                <w:sz w:val="20"/>
+              </w:rPr>
+              <w:t>TEXT</w:t>
+            </w:r>
+          </w:p>
+        </w:tc>
+        <w:tc>
+          <w:tcPr>
+            <w:tcW w:type="dxa" w:w="2422"/>
+            <w:tcBorders>
+              <w:top w:val="single" w:sz="4" w:space="0" w:color="CBCBCB"/>
+              <w:left w:val="single" w:sz="4" w:space="0" w:color="CBCBCB"/>
+              <w:bottom w:val="single" w:sz="4" w:space="0" w:color="CBCBCB"/>
+              <w:right w:val="single" w:sz="4" w:space="0" w:color="CBCBCB"/>
+            </w:tcBorders>
+          </w:tcPr>
+          <w:p>
+            <w:r>
+              <w:rPr>
+                <w:sz w:val="20"/>
+              </w:rPr>
+              <w:t>NOT NULL DEFAULT 'draft' — STEP-2.3 MỚI (draft→in_review→approved\</w:t>
+            </w:r>
+          </w:p>
+        </w:tc>
+        <w:tc>
+          <w:tcPr>
+            <w:tcW w:type="dxa" w:w="2422"/>
+            <w:tcBorders>
+              <w:top w:val="single" w:sz="4" w:space="0" w:color="CBCBCB"/>
+              <w:left w:val="single" w:sz="4" w:space="0" w:color="CBCBCB"/>
+              <w:bottom w:val="single" w:sz="4" w:space="0" w:color="CBCBCB"/>
+              <w:right w:val="single" w:sz="4" w:space="0" w:color="CBCBCB"/>
+            </w:tcBorders>
+          </w:tcPr>
+          <w:p>
+            <w:r>
+              <w:rPr>
+                <w:sz w:val="20"/>
+              </w:rPr>
+              <w:t>rejected)</w:t>
+            </w:r>
+          </w:p>
+        </w:tc>
+      </w:tr>
+      <w:tr>
+        <w:tc>
+          <w:tcPr>
+            <w:tcW w:type="dxa" w:w="2422"/>
+            <w:shd w:val="clear" w:color="auto" w:fill="B8B3D6"/>
+            <w:tcBorders>
+              <w:top w:val="single" w:sz="4" w:space="0" w:color="CBCBCB"/>
+              <w:left w:val="single" w:sz="4" w:space="0" w:color="CBCBCB"/>
+              <w:bottom w:val="single" w:sz="4" w:space="0" w:color="CBCBCB"/>
+              <w:right w:val="single" w:sz="4" w:space="0" w:color="CBCBCB"/>
+            </w:tcBorders>
+          </w:tcPr>
+          <w:p>
+            <w:r>
+              <w:rPr>
+                <w:sz w:val="20"/>
+              </w:rPr>
+              <w:t>review_comment</w:t>
+            </w:r>
+          </w:p>
+        </w:tc>
+        <w:tc>
+          <w:tcPr>
+            <w:tcW w:type="dxa" w:w="2422"/>
+            <w:shd w:val="clear" w:color="auto" w:fill="B8B3D6"/>
+            <w:tcBorders>
+              <w:top w:val="single" w:sz="4" w:space="0" w:color="CBCBCB"/>
+              <w:left w:val="single" w:sz="4" w:space="0" w:color="CBCBCB"/>
+              <w:bottom w:val="single" w:sz="4" w:space="0" w:color="CBCBCB"/>
+              <w:right w:val="single" w:sz="4" w:space="0" w:color="CBCBCB"/>
+            </w:tcBorders>
+          </w:tcPr>
+          <w:p>
+            <w:r>
+              <w:rPr>
+                <w:sz w:val="20"/>
+              </w:rPr>
+              <w:t>TEXT</w:t>
+            </w:r>
+          </w:p>
+        </w:tc>
+        <w:tc>
+          <w:tcPr>
+            <w:tcW w:type="dxa" w:w="2422"/>
+            <w:shd w:val="clear" w:color="auto" w:fill="B8B3D6"/>
+            <w:tcBorders>
+              <w:top w:val="single" w:sz="4" w:space="0" w:color="CBCBCB"/>
+              <w:left w:val="single" w:sz="4" w:space="0" w:color="CBCBCB"/>
+              <w:bottom w:val="single" w:sz="4" w:space="0" w:color="CBCBCB"/>
+              <w:right w:val="single" w:sz="4" w:space="0" w:color="CBCBCB"/>
+            </w:tcBorders>
+          </w:tcPr>
+          <w:p>
+            <w:r>
+              <w:rPr>
+                <w:sz w:val="20"/>
+              </w:rPr>
+              <w:t>nullable — STEP-2.3 MỚI (lý do reject)</w:t>
+            </w:r>
+          </w:p>
+        </w:tc>
+        <w:tc>
+          <w:tcPr>
+            <w:tcW w:type="dxa" w:w="2422"/>
+            <w:shd w:val="clear" w:color="auto" w:fill="B8B3D6"/>
+            <w:tcBorders>
+              <w:top w:val="single" w:sz="4" w:space="0" w:color="CBCBCB"/>
+              <w:left w:val="single" w:sz="4" w:space="0" w:color="CBCBCB"/>
+              <w:bottom w:val="single" w:sz="4" w:space="0" w:color="CBCBCB"/>
+              <w:right w:val="single" w:sz="4" w:space="0" w:color="CBCBCB"/>
+            </w:tcBorders>
+          </w:tcPr>
+          <w:p/>
+        </w:tc>
+      </w:tr>
+      <w:tr>
+        <w:tc>
+          <w:tcPr>
+            <w:tcW w:type="dxa" w:w="2422"/>
+            <w:tcBorders>
+              <w:top w:val="single" w:sz="4" w:space="0" w:color="CBCBCB"/>
+              <w:left w:val="single" w:sz="4" w:space="0" w:color="CBCBCB"/>
+              <w:bottom w:val="single" w:sz="4" w:space="0" w:color="CBCBCB"/>
+              <w:right w:val="single" w:sz="4" w:space="0" w:color="CBCBCB"/>
+            </w:tcBorders>
+          </w:tcPr>
+          <w:p>
+            <w:r>
+              <w:rPr>
+                <w:sz w:val="20"/>
+              </w:rPr>
+              <w:t>reviewed_by</w:t>
+            </w:r>
+          </w:p>
+        </w:tc>
+        <w:tc>
+          <w:tcPr>
+            <w:tcW w:type="dxa" w:w="2422"/>
+            <w:tcBorders>
+              <w:top w:val="single" w:sz="4" w:space="0" w:color="CBCBCB"/>
+              <w:left w:val="single" w:sz="4" w:space="0" w:color="CBCBCB"/>
+              <w:bottom w:val="single" w:sz="4" w:space="0" w:color="CBCBCB"/>
+              <w:right w:val="single" w:sz="4" w:space="0" w:color="CBCBCB"/>
+            </w:tcBorders>
+          </w:tcPr>
+          <w:p>
+            <w:r>
+              <w:rPr>
+                <w:sz w:val="20"/>
+              </w:rPr>
+              <w:t>INTEGER</w:t>
+            </w:r>
+          </w:p>
+        </w:tc>
+        <w:tc>
+          <w:tcPr>
+            <w:tcW w:type="dxa" w:w="2422"/>
+            <w:tcBorders>
+              <w:top w:val="single" w:sz="4" w:space="0" w:color="CBCBCB"/>
+              <w:left w:val="single" w:sz="4" w:space="0" w:color="CBCBCB"/>
+              <w:bottom w:val="single" w:sz="4" w:space="0" w:color="CBCBCB"/>
+              <w:right w:val="single" w:sz="4" w:space="0" w:color="CBCBCB"/>
+            </w:tcBorders>
+          </w:tcPr>
+          <w:p>
+            <w:r>
+              <w:rPr>
+                <w:sz w:val="20"/>
+              </w:rPr>
+              <w:t>FK→users(id), nullable — STEP-2.3 MỚI</w:t>
+            </w:r>
+          </w:p>
+        </w:tc>
+        <w:tc>
+          <w:tcPr>
+            <w:tcW w:type="dxa" w:w="2422"/>
+            <w:tcBorders>
+              <w:top w:val="single" w:sz="4" w:space="0" w:color="CBCBCB"/>
+              <w:left w:val="single" w:sz="4" w:space="0" w:color="CBCBCB"/>
+              <w:bottom w:val="single" w:sz="4" w:space="0" w:color="CBCBCB"/>
+              <w:right w:val="single" w:sz="4" w:space="0" w:color="CBCBCB"/>
+            </w:tcBorders>
+          </w:tcPr>
+          <w:p/>
+        </w:tc>
+      </w:tr>
+      <w:tr>
+        <w:tc>
+          <w:tcPr>
+            <w:tcW w:type="dxa" w:w="2422"/>
+            <w:shd w:val="clear" w:color="auto" w:fill="B8B3D6"/>
+            <w:tcBorders>
+              <w:top w:val="single" w:sz="4" w:space="0" w:color="CBCBCB"/>
+              <w:left w:val="single" w:sz="4" w:space="0" w:color="CBCBCB"/>
+              <w:bottom w:val="single" w:sz="4" w:space="0" w:color="CBCBCB"/>
+              <w:right w:val="single" w:sz="4" w:space="0" w:color="CBCBCB"/>
+            </w:tcBorders>
+          </w:tcPr>
+          <w:p>
+            <w:r>
+              <w:rPr>
+                <w:sz w:val="20"/>
+              </w:rPr>
+              <w:t>reviewed_at</w:t>
+            </w:r>
+          </w:p>
+        </w:tc>
+        <w:tc>
+          <w:tcPr>
+            <w:tcW w:type="dxa" w:w="2422"/>
+            <w:shd w:val="clear" w:color="auto" w:fill="B8B3D6"/>
+            <w:tcBorders>
+              <w:top w:val="single" w:sz="4" w:space="0" w:color="CBCBCB"/>
+              <w:left w:val="single" w:sz="4" w:space="0" w:color="CBCBCB"/>
+              <w:bottom w:val="single" w:sz="4" w:space="0" w:color="CBCBCB"/>
+              <w:right w:val="single" w:sz="4" w:space="0" w:color="CBCBCB"/>
+            </w:tcBorders>
+          </w:tcPr>
+          <w:p>
+            <w:r>
+              <w:rPr>
+                <w:sz w:val="20"/>
+              </w:rPr>
+              <w:t>TEXT</w:t>
+            </w:r>
+          </w:p>
+        </w:tc>
+        <w:tc>
+          <w:tcPr>
+            <w:tcW w:type="dxa" w:w="2422"/>
+            <w:shd w:val="clear" w:color="auto" w:fill="B8B3D6"/>
+            <w:tcBorders>
+              <w:top w:val="single" w:sz="4" w:space="0" w:color="CBCBCB"/>
+              <w:left w:val="single" w:sz="4" w:space="0" w:color="CBCBCB"/>
+              <w:bottom w:val="single" w:sz="4" w:space="0" w:color="CBCBCB"/>
+              <w:right w:val="single" w:sz="4" w:space="0" w:color="CBCBCB"/>
+            </w:tcBorders>
+          </w:tcPr>
+          <w:p>
+            <w:r>
+              <w:rPr>
+                <w:sz w:val="20"/>
+              </w:rPr>
+              <w:t>nullable — STEP-2.3 MỚI</w:t>
+            </w:r>
+          </w:p>
+        </w:tc>
+        <w:tc>
+          <w:tcPr>
+            <w:tcW w:type="dxa" w:w="2422"/>
+            <w:shd w:val="clear" w:color="auto" w:fill="B8B3D6"/>
+            <w:tcBorders>
+              <w:top w:val="single" w:sz="4" w:space="0" w:color="CBCBCB"/>
+              <w:left w:val="single" w:sz="4" w:space="0" w:color="CBCBCB"/>
+              <w:bottom w:val="single" w:sz="4" w:space="0" w:color="CBCBCB"/>
+              <w:right w:val="single" w:sz="4" w:space="0" w:color="CBCBCB"/>
+            </w:tcBorders>
+          </w:tcPr>
+          <w:p/>
         </w:tc>
       </w:tr>
     </w:tbl>
@@ -17868,6 +19299,128 @@
           <w:sz w:val="18"/>
         </w:rPr>
         <w:t>idx_images_project ON images(project_id)</w:t>
+      </w:r>
+      <w:r>
+        <w:rPr>
+          <w:sz w:val="21"/>
+        </w:rPr>
+        <w:t xml:space="preserve">, </w:t>
+      </w:r>
+      <w:r>
+        <w:rPr>
+          <w:rFonts w:ascii="Courier New" w:hAnsi="Courier New"/>
+          <w:color w:val="F05922"/>
+          <w:sz w:val="18"/>
+        </w:rPr>
+        <w:t>idx_images_review_status ON images(review_status)</w:t>
+      </w:r>
+      <w:r>
+        <w:rPr>
+          <w:sz w:val="21"/>
+        </w:rPr>
+        <w:t xml:space="preserve"> (STEP-2.3 MỚI)</w:t>
+      </w:r>
+    </w:p>
+    <w:p>
+      <w:pPr>
+        <w:spacing w:after="80"/>
+      </w:pPr>
+      <w:r>
+        <w:rPr>
+          <w:b/>
+          <w:sz w:val="21"/>
+        </w:rPr>
+        <w:t>⚠️ Lưu ý cho STEP-3.5:</w:t>
+      </w:r>
+      <w:r>
+        <w:rPr>
+          <w:sz w:val="21"/>
+        </w:rPr>
+        <w:t xml:space="preserve"> </w:t>
+      </w:r>
+      <w:r>
+        <w:rPr>
+          <w:rFonts w:ascii="Courier New" w:hAnsi="Courier New"/>
+          <w:color w:val="F05922"/>
+          <w:sz w:val="18"/>
+        </w:rPr>
+        <w:t>submit-review</w:t>
+      </w:r>
+      <w:r>
+        <w:rPr>
+          <w:sz w:val="21"/>
+        </w:rPr>
+        <w:t xml:space="preserve"> hiện cho phép bất kỳ ảnh draft/rejected nào (không check </w:t>
+      </w:r>
+      <w:r>
+        <w:rPr>
+          <w:rFonts w:ascii="Courier New" w:hAnsi="Courier New"/>
+          <w:color w:val="F05922"/>
+          <w:sz w:val="18"/>
+        </w:rPr>
+        <w:t>completed_at</w:t>
+      </w:r>
+      <w:r>
+        <w:rPr>
+          <w:sz w:val="21"/>
+        </w:rPr>
+        <w:t xml:space="preserve">). Khi STEP-3.5 thêm </w:t>
+      </w:r>
+      <w:r>
+        <w:rPr>
+          <w:rFonts w:ascii="Courier New" w:hAnsi="Courier New"/>
+          <w:color w:val="F05922"/>
+          <w:sz w:val="18"/>
+        </w:rPr>
+        <w:t>completed_at</w:t>
+      </w:r>
+      <w:r>
+        <w:rPr>
+          <w:sz w:val="21"/>
+        </w:rPr>
+        <w:t>/</w:t>
+      </w:r>
+      <w:r>
+        <w:rPr>
+          <w:rFonts w:ascii="Courier New" w:hAnsi="Courier New"/>
+          <w:color w:val="F05922"/>
+          <w:sz w:val="18"/>
+        </w:rPr>
+        <w:t>completed_by</w:t>
+      </w:r>
+      <w:r>
+        <w:rPr>
+          <w:sz w:val="21"/>
+        </w:rPr>
+        <w:t xml:space="preserve">, sửa </w:t>
+      </w:r>
+      <w:r>
+        <w:rPr>
+          <w:rFonts w:ascii="Courier New" w:hAnsi="Courier New"/>
+          <w:color w:val="F05922"/>
+          <w:sz w:val="18"/>
+        </w:rPr>
+        <w:t>reviews.js</w:t>
+      </w:r>
+      <w:r>
+        <w:rPr>
+          <w:sz w:val="21"/>
+        </w:rPr>
+        <w:t xml:space="preserve"> để check </w:t>
+      </w:r>
+      <w:r>
+        <w:rPr>
+          <w:rFonts w:ascii="Courier New" w:hAnsi="Courier New"/>
+          <w:color w:val="F05922"/>
+          <w:sz w:val="18"/>
+        </w:rPr>
+        <w:t>completed_at IS NOT NULL</w:t>
+      </w:r>
+      <w:r>
+        <w:rPr>
+          <w:sz w:val="21"/>
+        </w:rPr>
+        <w:t xml:space="preserve"> trước khi cho submit-review.</w:t>
       </w:r>
     </w:p>
     <w:p>
@@ -26930,7 +28483,7 @@
           <w:color w:val="4A3F8C"/>
           <w:sz w:val="24"/>
         </w:rPr>
-        <w:t>Phase 2.2 — Auth implementation</w:t>
+        <w:t>Phase 2.2 — Auth implementation — ✅ HOÀN THÀNH</w:t>
       </w:r>
     </w:p>
     <w:p>
@@ -26963,7 +28516,7 @@
         <w:rPr>
           <w:sz w:val="21"/>
         </w:rPr>
-        <w:t xml:space="preserve"> — thêm </w:t>
+        <w:t xml:space="preserve"> — bảng </w:t>
       </w:r>
       <w:r>
         <w:rPr>
@@ -26971,27 +28524,13 @@
           <w:color w:val="F05922"/>
           <w:sz w:val="21"/>
         </w:rPr>
-        <w:t>CREATE TABLE IF NOT EXISTS users (...)</w:t>
+        <w:t>users</w:t>
       </w:r>
       <w:r>
         <w:rPr>
           <w:sz w:val="21"/>
         </w:rPr>
-        <w:t xml:space="preserve"> + </w:t>
-      </w:r>
-      <w:r>
-        <w:rPr>
-          <w:rFonts w:ascii="Courier New" w:hAnsi="Courier New"/>
-          <w:color w:val="F05922"/>
-          <w:sz w:val="21"/>
-        </w:rPr>
-        <w:t>sessions</w:t>
-      </w:r>
-      <w:r>
-        <w:rPr>
-          <w:sz w:val="21"/>
-        </w:rPr>
-        <w:t xml:space="preserve"> table</w:t>
+        <w:t xml:space="preserve"> (INTEGER AUTOINCREMENT id, username, password_hash, display_name, role, color, created_at, is_active)</w:t>
       </w:r>
     </w:p>
     <w:p>
@@ -27012,7 +28551,35 @@
         <w:rPr>
           <w:sz w:val="21"/>
         </w:rPr>
-        <w:t xml:space="preserve"> — mount authRouter, thêm auth middleware global (hoặc per-router)</w:t>
+        <w:t xml:space="preserve"> — mount </w:t>
+      </w:r>
+      <w:r>
+        <w:rPr>
+          <w:rFonts w:ascii="Courier New" w:hAnsi="Courier New"/>
+          <w:color w:val="F05922"/>
+          <w:sz w:val="21"/>
+        </w:rPr>
+        <w:t>auth.js</w:t>
+      </w:r>
+      <w:r>
+        <w:rPr>
+          <w:sz w:val="21"/>
+        </w:rPr>
+        <w:t>/</w:t>
+      </w:r>
+      <w:r>
+        <w:rPr>
+          <w:rFonts w:ascii="Courier New" w:hAnsi="Courier New"/>
+          <w:color w:val="F05922"/>
+          <w:sz w:val="21"/>
+        </w:rPr>
+        <w:t>users.js</w:t>
+      </w:r>
+      <w:r>
+        <w:rPr>
+          <w:sz w:val="21"/>
+        </w:rPr>
+        <w:t>, middleware auth</w:t>
       </w:r>
     </w:p>
     <w:p>
@@ -27047,7 +28614,35 @@
           <w:color w:val="F05922"/>
           <w:sz w:val="21"/>
         </w:rPr>
-        <w:t>server/src/middleware/auth.js</w:t>
+        <w:t>server/src/routes/users.js</w:t>
+      </w:r>
+      <w:r>
+        <w:rPr>
+          <w:sz w:val="21"/>
+        </w:rPr>
+        <w:t xml:space="preserve">, </w:t>
+      </w:r>
+      <w:r>
+        <w:rPr>
+          <w:rFonts w:ascii="Courier New" w:hAnsi="Courier New"/>
+          <w:color w:val="F05922"/>
+          <w:sz w:val="21"/>
+        </w:rPr>
+        <w:t>server/src/middleware/</w:t>
+      </w:r>
+      <w:r>
+        <w:rPr>
+          <w:sz w:val="21"/>
+        </w:rPr>
+        <w:t xml:space="preserve">, </w:t>
+      </w:r>
+      <w:r>
+        <w:rPr>
+          <w:rFonts w:ascii="Courier New" w:hAnsi="Courier New"/>
+          <w:color w:val="F05922"/>
+          <w:sz w:val="21"/>
+        </w:rPr>
+        <w:t>server/src/lib/</w:t>
       </w:r>
     </w:p>
     <w:p>
@@ -27068,7 +28663,7 @@
         <w:rPr>
           <w:sz w:val="21"/>
         </w:rPr>
-        <w:t xml:space="preserve"> — thêm </w:t>
+        <w:t xml:space="preserve">, </w:t>
       </w:r>
       <w:r>
         <w:rPr>
@@ -27076,7 +28671,7 @@
           <w:color w:val="F05922"/>
           <w:sz w:val="21"/>
         </w:rPr>
-        <w:t>login</w:t>
+        <w:t>client/src/types.ts</w:t>
       </w:r>
       <w:r>
         <w:rPr>
@@ -27090,7 +28685,7 @@
           <w:color w:val="F05922"/>
           <w:sz w:val="21"/>
         </w:rPr>
-        <w:t>logout</w:t>
+        <w:t>client/src/App.tsx</w:t>
       </w:r>
       <w:r>
         <w:rPr>
@@ -27104,13 +28699,20 @@
           <w:color w:val="F05922"/>
           <w:sz w:val="21"/>
         </w:rPr>
-        <w:t>getMe</w:t>
+        <w:t>client/src/pages/LoginPage.tsx</w:t>
       </w:r>
+    </w:p>
+    <w:p>
+      <w:pPr>
+        <w:pStyle w:val="ListBullet"/>
+        <w:spacing w:after="20"/>
+        <w:ind w:left="283"/>
+      </w:pPr>
       <w:r>
         <w:rPr>
           <w:sz w:val="21"/>
         </w:rPr>
-        <w:t xml:space="preserve">; gắn Authorization header vào </w:t>
+        <w:t xml:space="preserve">Test: </w:t>
       </w:r>
       <w:r>
         <w:rPr>
@@ -27118,7 +28720,38 @@
           <w:color w:val="F05922"/>
           <w:sz w:val="21"/>
         </w:rPr>
-        <w:t>request()</w:t>
+        <w:t>tests/auth.test.js</w:t>
+      </w:r>
+      <w:r>
+        <w:rPr>
+          <w:sz w:val="21"/>
+        </w:rPr>
+        <w:t xml:space="preserve"> — 87 passed theo ma trận AD-A5 (2 điều kiện CTO #A1/#A2 đạt)</w:t>
+      </w:r>
+    </w:p>
+    <w:p>
+      <w:pPr>
+        <w:pStyle w:val="Heading3"/>
+        <w:spacing w:before="160" w:after="60"/>
+      </w:pPr>
+      <w:r>
+        <w:rPr>
+          <w:color w:val="4A3F8C"/>
+          <w:sz w:val="24"/>
+        </w:rPr>
+        <w:t>Phase 2.3 — Review workflow — ✅ HOÀN THÀNH</w:t>
+      </w:r>
+    </w:p>
+    <w:p>
+      <w:pPr>
+        <w:spacing w:after="80"/>
+      </w:pPr>
+      <w:r>
+        <w:rPr>
+          <w:b/>
+          <w:sz w:val="21"/>
+        </w:rPr>
+        <w:t>Files bị ảnh hưởng:</w:t>
       </w:r>
     </w:p>
     <w:p>
@@ -27133,13 +28766,13 @@
           <w:color w:val="F05922"/>
           <w:sz w:val="21"/>
         </w:rPr>
-        <w:t>client/src/types.ts</w:t>
+        <w:t>server/src/db.js</w:t>
       </w:r>
       <w:r>
         <w:rPr>
           <w:sz w:val="21"/>
         </w:rPr>
-        <w:t xml:space="preserve"> — thêm </w:t>
+        <w:t xml:space="preserve"> — </w:t>
       </w:r>
       <w:r>
         <w:rPr>
@@ -27147,13 +28780,110 @@
           <w:color w:val="F05922"/>
           <w:sz w:val="21"/>
         </w:rPr>
-        <w:t>User</w:t>
+        <w:t>m004_add_review_status()</w:t>
       </w:r>
       <w:r>
         <w:rPr>
           <w:sz w:val="21"/>
         </w:rPr>
-        <w:t xml:space="preserve"> interface</w:t>
+        <w:t xml:space="preserve">: 4 cột mới trên </w:t>
+      </w:r>
+      <w:r>
+        <w:rPr>
+          <w:rFonts w:ascii="Courier New" w:hAnsi="Courier New"/>
+          <w:color w:val="F05922"/>
+          <w:sz w:val="21"/>
+        </w:rPr>
+        <w:t>images</w:t>
+      </w:r>
+      <w:r>
+        <w:rPr>
+          <w:sz w:val="21"/>
+        </w:rPr>
+        <w:t xml:space="preserve"> (</w:t>
+      </w:r>
+      <w:r>
+        <w:rPr>
+          <w:rFonts w:ascii="Courier New" w:hAnsi="Courier New"/>
+          <w:color w:val="F05922"/>
+          <w:sz w:val="21"/>
+        </w:rPr>
+        <w:t>review_status</w:t>
+      </w:r>
+      <w:r>
+        <w:rPr>
+          <w:sz w:val="21"/>
+        </w:rPr>
+        <w:t xml:space="preserve">, </w:t>
+      </w:r>
+      <w:r>
+        <w:rPr>
+          <w:rFonts w:ascii="Courier New" w:hAnsi="Courier New"/>
+          <w:color w:val="F05922"/>
+          <w:sz w:val="21"/>
+        </w:rPr>
+        <w:t>review_comment</w:t>
+      </w:r>
+      <w:r>
+        <w:rPr>
+          <w:sz w:val="21"/>
+        </w:rPr>
+        <w:t xml:space="preserve">, </w:t>
+      </w:r>
+      <w:r>
+        <w:rPr>
+          <w:rFonts w:ascii="Courier New" w:hAnsi="Courier New"/>
+          <w:color w:val="F05922"/>
+          <w:sz w:val="21"/>
+        </w:rPr>
+        <w:t>reviewed_by</w:t>
+      </w:r>
+      <w:r>
+        <w:rPr>
+          <w:sz w:val="21"/>
+        </w:rPr>
+        <w:t xml:space="preserve">, </w:t>
+      </w:r>
+      <w:r>
+        <w:rPr>
+          <w:rFonts w:ascii="Courier New" w:hAnsi="Courier New"/>
+          <w:color w:val="F05922"/>
+          <w:sz w:val="21"/>
+        </w:rPr>
+        <w:t>reviewed_at</w:t>
+      </w:r>
+      <w:r>
+        <w:rPr>
+          <w:sz w:val="21"/>
+        </w:rPr>
+        <w:t>) + index</w:t>
+      </w:r>
+    </w:p>
+    <w:p>
+      <w:pPr>
+        <w:pStyle w:val="ListBullet"/>
+        <w:spacing w:after="20"/>
+        <w:ind w:left="283"/>
+      </w:pPr>
+      <w:r>
+        <w:rPr>
+          <w:sz w:val="21"/>
+        </w:rPr>
+        <w:t xml:space="preserve">Tạo mới: </w:t>
+      </w:r>
+      <w:r>
+        <w:rPr>
+          <w:rFonts w:ascii="Courier New" w:hAnsi="Courier New"/>
+          <w:color w:val="F05922"/>
+          <w:sz w:val="21"/>
+        </w:rPr>
+        <w:t>server/src/routes/reviews.js</w:t>
+      </w:r>
+      <w:r>
+        <w:rPr>
+          <w:sz w:val="21"/>
+        </w:rPr>
+        <w:t xml:space="preserve"> (xem §3.13)</w:t>
       </w:r>
     </w:p>
     <w:p>
@@ -27168,13 +28898,13 @@
           <w:color w:val="F05922"/>
           <w:sz w:val="21"/>
         </w:rPr>
-        <w:t>client/src/App.tsx</w:t>
+        <w:t>server/src/index.js</w:t>
       </w:r>
       <w:r>
         <w:rPr>
           <w:sz w:val="21"/>
         </w:rPr>
-        <w:t xml:space="preserve"> — thêm route </w:t>
+        <w:t xml:space="preserve"> — mount </w:t>
       </w:r>
       <w:r>
         <w:rPr>
@@ -27182,13 +28912,108 @@
           <w:color w:val="F05922"/>
           <w:sz w:val="21"/>
         </w:rPr>
-        <w:t>/login</w:t>
+        <w:t>reviewsRouter</w:t>
       </w:r>
       <w:r>
         <w:rPr>
           <w:sz w:val="21"/>
         </w:rPr>
-        <w:t>, guard AuthRoute</w:t>
+        <w:t xml:space="preserve"> tại </w:t>
+      </w:r>
+      <w:r>
+        <w:rPr>
+          <w:rFonts w:ascii="Courier New" w:hAnsi="Courier New"/>
+          <w:color w:val="F05922"/>
+          <w:sz w:val="21"/>
+        </w:rPr>
+        <w:t>/api/images/:imageId</w:t>
+      </w:r>
+    </w:p>
+    <w:p>
+      <w:pPr>
+        <w:pStyle w:val="ListBullet"/>
+        <w:spacing w:after="20"/>
+        <w:ind w:left="283"/>
+      </w:pPr>
+      <w:r>
+        <w:rPr>
+          <w:sz w:val="21"/>
+        </w:rPr>
+        <w:t xml:space="preserve">Test: </w:t>
+      </w:r>
+      <w:r>
+        <w:rPr>
+          <w:rFonts w:ascii="Courier New" w:hAnsi="Courier New"/>
+          <w:color w:val="F05922"/>
+          <w:sz w:val="21"/>
+        </w:rPr>
+        <w:t>tests/auth.test.js</w:t>
+      </w:r>
+      <w:r>
+        <w:rPr>
+          <w:sz w:val="21"/>
+        </w:rPr>
+        <w:t xml:space="preserve"> Row 8 — 8 test case pass (submit-review, approve, reject, comment, role guard, 401)</w:t>
+      </w:r>
+    </w:p>
+    <w:p>
+      <w:pPr>
+        <w:spacing w:after="80"/>
+      </w:pPr>
+      <w:r>
+        <w:rPr>
+          <w:b/>
+          <w:sz w:val="21"/>
+        </w:rPr>
+        <w:t>Watch out cho STEP-3.5:</w:t>
+      </w:r>
+      <w:r>
+        <w:rPr>
+          <w:sz w:val="21"/>
+        </w:rPr>
+        <w:t xml:space="preserve"> </w:t>
+      </w:r>
+      <w:r>
+        <w:rPr>
+          <w:rFonts w:ascii="Courier New" w:hAnsi="Courier New"/>
+          <w:color w:val="F05922"/>
+          <w:sz w:val="18"/>
+        </w:rPr>
+        <w:t>submit-review</w:t>
+      </w:r>
+      <w:r>
+        <w:rPr>
+          <w:sz w:val="21"/>
+        </w:rPr>
+        <w:t xml:space="preserve"> hiện không check </w:t>
+      </w:r>
+      <w:r>
+        <w:rPr>
+          <w:rFonts w:ascii="Courier New" w:hAnsi="Courier New"/>
+          <w:color w:val="F05922"/>
+          <w:sz w:val="18"/>
+        </w:rPr>
+        <w:t>completed_at</w:t>
+      </w:r>
+      <w:r>
+        <w:rPr>
+          <w:sz w:val="21"/>
+        </w:rPr>
+        <w:t xml:space="preserve"> (field đó chưa tồn tại) — khi STEP-3.5 xong, cập nhật điều kiện submit trong </w:t>
+      </w:r>
+      <w:r>
+        <w:rPr>
+          <w:rFonts w:ascii="Courier New" w:hAnsi="Courier New"/>
+          <w:color w:val="F05922"/>
+          <w:sz w:val="18"/>
+        </w:rPr>
+        <w:t>reviews.js</w:t>
+      </w:r>
+      <w:r>
+        <w:rPr>
+          <w:sz w:val="21"/>
+        </w:rPr>
+        <w:t>.</w:t>
       </w:r>
     </w:p>
     <w:p>
@@ -28435,6 +30260,290 @@
                 <w:sz w:val="20"/>
               </w:rPr>
               <w:t>(STEP-1.3)</w:t>
+            </w:r>
+          </w:p>
+        </w:tc>
+      </w:tr>
+      <w:tr>
+        <w:tc>
+          <w:tcPr>
+            <w:tcW w:type="dxa" w:w="2422"/>
+            <w:shd w:val="clear" w:color="auto" w:fill="B8B3D6"/>
+            <w:tcBorders>
+              <w:top w:val="single" w:sz="4" w:space="0" w:color="CBCBCB"/>
+              <w:left w:val="single" w:sz="4" w:space="0" w:color="CBCBCB"/>
+              <w:bottom w:val="single" w:sz="4" w:space="0" w:color="CBCBCB"/>
+              <w:right w:val="single" w:sz="4" w:space="0" w:color="CBCBCB"/>
+            </w:tcBorders>
+          </w:tcPr>
+          <w:p>
+            <w:r>
+              <w:rPr>
+                <w:sz w:val="20"/>
+              </w:rPr>
+              <w:t>2026-08-04</w:t>
+            </w:r>
+          </w:p>
+        </w:tc>
+        <w:tc>
+          <w:tcPr>
+            <w:tcW w:type="dxa" w:w="2422"/>
+            <w:shd w:val="clear" w:color="auto" w:fill="B8B3D6"/>
+            <w:tcBorders>
+              <w:top w:val="single" w:sz="4" w:space="0" w:color="CBCBCB"/>
+              <w:left w:val="single" w:sz="4" w:space="0" w:color="CBCBCB"/>
+              <w:bottom w:val="single" w:sz="4" w:space="0" w:color="CBCBCB"/>
+              <w:right w:val="single" w:sz="4" w:space="0" w:color="CBCBCB"/>
+            </w:tcBorders>
+          </w:tcPr>
+          <w:p>
+            <w:r>
+              <w:rPr>
+                <w:sz w:val="20"/>
+              </w:rPr>
+              <w:t>tech-lead+cto+em (STEP-2.1)</w:t>
+            </w:r>
+          </w:p>
+        </w:tc>
+        <w:tc>
+          <w:tcPr>
+            <w:tcW w:type="dxa" w:w="2422"/>
+            <w:shd w:val="clear" w:color="auto" w:fill="B8B3D6"/>
+            <w:tcBorders>
+              <w:top w:val="single" w:sz="4" w:space="0" w:color="CBCBCB"/>
+              <w:left w:val="single" w:sz="4" w:space="0" w:color="CBCBCB"/>
+              <w:bottom w:val="single" w:sz="4" w:space="0" w:color="CBCBCB"/>
+              <w:right w:val="single" w:sz="4" w:space="0" w:color="CBCBCB"/>
+            </w:tcBorders>
+          </w:tcPr>
+          <w:p>
+            <w:r>
+              <w:rPr>
+                <w:sz w:val="20"/>
+              </w:rPr>
+              <w:t>Auth ADR riêng (</w:t>
+            </w:r>
+            <w:r>
+              <w:rPr>
+                <w:rFonts w:ascii="Courier New" w:hAnsi="Courier New"/>
+                <w:color w:val="F05922"/>
+                <w:sz w:val="20"/>
+              </w:rPr>
+              <w:t>ADR-auth-labeling-studio.md</w:t>
+            </w:r>
+            <w:r>
+              <w:rPr>
+                <w:sz w:val="20"/>
+              </w:rPr>
+              <w:t>), security-audit-stride, CTO+EM APPROVED kèm điều kiện #A1/#A2</w:t>
+            </w:r>
+          </w:p>
+        </w:tc>
+        <w:tc>
+          <w:tcPr>
+            <w:tcW w:type="dxa" w:w="2422"/>
+            <w:shd w:val="clear" w:color="auto" w:fill="B8B3D6"/>
+            <w:tcBorders>
+              <w:top w:val="single" w:sz="4" w:space="0" w:color="CBCBCB"/>
+              <w:left w:val="single" w:sz="4" w:space="0" w:color="CBCBCB"/>
+              <w:bottom w:val="single" w:sz="4" w:space="0" w:color="CBCBCB"/>
+              <w:right w:val="single" w:sz="4" w:space="0" w:color="CBCBCB"/>
+            </w:tcBorders>
+          </w:tcPr>
+          <w:p>
+            <w:r>
+              <w:rPr>
+                <w:sz w:val="20"/>
+              </w:rPr>
+              <w:t>(STEP-2.1)</w:t>
+            </w:r>
+          </w:p>
+        </w:tc>
+      </w:tr>
+      <w:tr>
+        <w:tc>
+          <w:tcPr>
+            <w:tcW w:type="dxa" w:w="2422"/>
+            <w:tcBorders>
+              <w:top w:val="single" w:sz="4" w:space="0" w:color="CBCBCB"/>
+              <w:left w:val="single" w:sz="4" w:space="0" w:color="CBCBCB"/>
+              <w:bottom w:val="single" w:sz="4" w:space="0" w:color="CBCBCB"/>
+              <w:right w:val="single" w:sz="4" w:space="0" w:color="CBCBCB"/>
+            </w:tcBorders>
+          </w:tcPr>
+          <w:p>
+            <w:r>
+              <w:rPr>
+                <w:sz w:val="20"/>
+              </w:rPr>
+              <w:t>2026-08-04</w:t>
+            </w:r>
+          </w:p>
+        </w:tc>
+        <w:tc>
+          <w:tcPr>
+            <w:tcW w:type="dxa" w:w="2422"/>
+            <w:tcBorders>
+              <w:top w:val="single" w:sz="4" w:space="0" w:color="CBCBCB"/>
+              <w:left w:val="single" w:sz="4" w:space="0" w:color="CBCBCB"/>
+              <w:bottom w:val="single" w:sz="4" w:space="0" w:color="CBCBCB"/>
+              <w:right w:val="single" w:sz="4" w:space="0" w:color="CBCBCB"/>
+            </w:tcBorders>
+          </w:tcPr>
+          <w:p>
+            <w:r>
+              <w:rPr>
+                <w:sz w:val="20"/>
+              </w:rPr>
+              <w:t>senior-developer (STEP-2.2)</w:t>
+            </w:r>
+          </w:p>
+        </w:tc>
+        <w:tc>
+          <w:tcPr>
+            <w:tcW w:type="dxa" w:w="2422"/>
+            <w:tcBorders>
+              <w:top w:val="single" w:sz="4" w:space="0" w:color="CBCBCB"/>
+              <w:left w:val="single" w:sz="4" w:space="0" w:color="CBCBCB"/>
+              <w:bottom w:val="single" w:sz="4" w:space="0" w:color="CBCBCB"/>
+              <w:right w:val="single" w:sz="4" w:space="0" w:color="CBCBCB"/>
+            </w:tcBorders>
+          </w:tcPr>
+          <w:p>
+            <w:r>
+              <w:rPr>
+                <w:sz w:val="20"/>
+              </w:rPr>
+              <w:t xml:space="preserve">Bảng </w:t>
+            </w:r>
+            <w:r>
+              <w:rPr>
+                <w:rFonts w:ascii="Courier New" w:hAnsi="Courier New"/>
+                <w:color w:val="F05922"/>
+                <w:sz w:val="20"/>
+              </w:rPr>
+              <w:t>users</w:t>
+            </w:r>
+            <w:r>
+              <w:rPr>
+                <w:sz w:val="20"/>
+              </w:rPr>
+              <w:t xml:space="preserve"> (INTEGER id, role, color), routes auth.js/users.js, middleware, LoginPage — 87 test pass ma trận AD-A5, npm audit sạch (điều kiện #A1/#A2 đạt), §9 Phase 2.2 DONE</w:t>
+            </w:r>
+          </w:p>
+        </w:tc>
+        <w:tc>
+          <w:tcPr>
+            <w:tcW w:type="dxa" w:w="2422"/>
+            <w:tcBorders>
+              <w:top w:val="single" w:sz="4" w:space="0" w:color="CBCBCB"/>
+              <w:left w:val="single" w:sz="4" w:space="0" w:color="CBCBCB"/>
+              <w:bottom w:val="single" w:sz="4" w:space="0" w:color="CBCBCB"/>
+              <w:right w:val="single" w:sz="4" w:space="0" w:color="CBCBCB"/>
+            </w:tcBorders>
+          </w:tcPr>
+          <w:p>
+            <w:r>
+              <w:rPr>
+                <w:sz w:val="20"/>
+              </w:rPr>
+              <w:t>(STEP-2.2)</w:t>
+            </w:r>
+          </w:p>
+        </w:tc>
+      </w:tr>
+      <w:tr>
+        <w:tc>
+          <w:tcPr>
+            <w:tcW w:type="dxa" w:w="2422"/>
+            <w:shd w:val="clear" w:color="auto" w:fill="B8B3D6"/>
+            <w:tcBorders>
+              <w:top w:val="single" w:sz="4" w:space="0" w:color="CBCBCB"/>
+              <w:left w:val="single" w:sz="4" w:space="0" w:color="CBCBCB"/>
+              <w:bottom w:val="single" w:sz="4" w:space="0" w:color="CBCBCB"/>
+              <w:right w:val="single" w:sz="4" w:space="0" w:color="CBCBCB"/>
+            </w:tcBorders>
+          </w:tcPr>
+          <w:p>
+            <w:r>
+              <w:rPr>
+                <w:sz w:val="20"/>
+              </w:rPr>
+              <w:t>2026-08-04</w:t>
+            </w:r>
+          </w:p>
+        </w:tc>
+        <w:tc>
+          <w:tcPr>
+            <w:tcW w:type="dxa" w:w="2422"/>
+            <w:shd w:val="clear" w:color="auto" w:fill="B8B3D6"/>
+            <w:tcBorders>
+              <w:top w:val="single" w:sz="4" w:space="0" w:color="CBCBCB"/>
+              <w:left w:val="single" w:sz="4" w:space="0" w:color="CBCBCB"/>
+              <w:bottom w:val="single" w:sz="4" w:space="0" w:color="CBCBCB"/>
+              <w:right w:val="single" w:sz="4" w:space="0" w:color="CBCBCB"/>
+            </w:tcBorders>
+          </w:tcPr>
+          <w:p>
+            <w:r>
+              <w:rPr>
+                <w:sz w:val="20"/>
+              </w:rPr>
+              <w:t>senior-developer (STEP-2.3)</w:t>
+            </w:r>
+          </w:p>
+        </w:tc>
+        <w:tc>
+          <w:tcPr>
+            <w:tcW w:type="dxa" w:w="2422"/>
+            <w:shd w:val="clear" w:color="auto" w:fill="B8B3D6"/>
+            <w:tcBorders>
+              <w:top w:val="single" w:sz="4" w:space="0" w:color="CBCBCB"/>
+              <w:left w:val="single" w:sz="4" w:space="0" w:color="CBCBCB"/>
+              <w:bottom w:val="single" w:sz="4" w:space="0" w:color="CBCBCB"/>
+              <w:right w:val="single" w:sz="4" w:space="0" w:color="CBCBCB"/>
+            </w:tcBorders>
+          </w:tcPr>
+          <w:p>
+            <w:r>
+              <w:rPr>
+                <w:sz w:val="20"/>
+              </w:rPr>
+              <w:t xml:space="preserve">Thêm §3.13 reviews.js (MỚI), cập nhật §6 bảng </w:t>
+            </w:r>
+            <w:r>
+              <w:rPr>
+                <w:rFonts w:ascii="Courier New" w:hAnsi="Courier New"/>
+                <w:color w:val="F05922"/>
+                <w:sz w:val="20"/>
+              </w:rPr>
+              <w:t>images</w:t>
+            </w:r>
+            <w:r>
+              <w:rPr>
+                <w:sz w:val="20"/>
+              </w:rPr>
+              <w:t xml:space="preserve"> (4 cột review), §9 Phase 2.3 DONE — review workflow submit/approve/reject, Row 8 test pass</w:t>
+            </w:r>
+          </w:p>
+        </w:tc>
+        <w:tc>
+          <w:tcPr>
+            <w:tcW w:type="dxa" w:w="2422"/>
+            <w:shd w:val="clear" w:color="auto" w:fill="B8B3D6"/>
+            <w:tcBorders>
+              <w:top w:val="single" w:sz="4" w:space="0" w:color="CBCBCB"/>
+              <w:left w:val="single" w:sz="4" w:space="0" w:color="CBCBCB"/>
+              <w:bottom w:val="single" w:sz="4" w:space="0" w:color="CBCBCB"/>
+              <w:right w:val="single" w:sz="4" w:space="0" w:color="CBCBCB"/>
+            </w:tcBorders>
+          </w:tcPr>
+          <w:p>
+            <w:r>
+              <w:rPr>
+                <w:sz w:val="20"/>
+              </w:rPr>
+              <w:t>(STEP-2.3)</w:t>
             </w:r>
           </w:p>
         </w:tc>

</xml_diff>

<commit_message>
[labeling-studio-improve] Bước 3.1: DB Migration schema (annotation_history, activity_log, version)
- m005_phase3_schema() trong db.js: cột annotations.version DEFAULT 0,
  bảng annotation_history (SNAPSHOT strategy theo ADR AD-5), activity_log
- Auto-backup app.db.bak-{ts} trước migrate, giữ 5 bản gần nhất
- Verify row count trước/sau 7 bảng (CTO condition #1) — 0 mất dữ liệu
- pruneAnnotationHistory() export sẵn cho STEP-3.2 (retention 200/ảnh)
- Idempotent: test chạy 2 lần, lần 2 không lỗi không tạo trùng

Test: node tests/auth.test.js sau migration → 87 passed, 0 failed, 3 skipped
CODE-GRAPH.md cập nhật §6 schema mới, §9 Phase 3.1 DONE, §10 lịch sử

Plan: docs/plans/PLAN-labeling-studio-improve-2026-08-04/steps/STEP-3.1-db-migration-schema.md
</commit_message>
<xml_diff>
--- a/code-graph/CODE-GRAPH.docx
+++ b/code-graph/CODE-GRAPH.docx
@@ -20179,6 +20179,68 @@
           </w:p>
         </w:tc>
       </w:tr>
+      <w:tr>
+        <w:tc>
+          <w:tcPr>
+            <w:tcW w:type="dxa" w:w="3230"/>
+            <w:shd w:val="clear" w:color="auto" w:fill="B8B3D6"/>
+            <w:tcBorders>
+              <w:top w:val="single" w:sz="4" w:space="0" w:color="CBCBCB"/>
+              <w:left w:val="single" w:sz="4" w:space="0" w:color="CBCBCB"/>
+              <w:bottom w:val="single" w:sz="4" w:space="0" w:color="CBCBCB"/>
+              <w:right w:val="single" w:sz="4" w:space="0" w:color="CBCBCB"/>
+            </w:tcBorders>
+          </w:tcPr>
+          <w:p>
+            <w:r>
+              <w:rPr>
+                <w:sz w:val="20"/>
+              </w:rPr>
+              <w:t>version</w:t>
+            </w:r>
+          </w:p>
+        </w:tc>
+        <w:tc>
+          <w:tcPr>
+            <w:tcW w:type="dxa" w:w="3230"/>
+            <w:shd w:val="clear" w:color="auto" w:fill="B8B3D6"/>
+            <w:tcBorders>
+              <w:top w:val="single" w:sz="4" w:space="0" w:color="CBCBCB"/>
+              <w:left w:val="single" w:sz="4" w:space="0" w:color="CBCBCB"/>
+              <w:bottom w:val="single" w:sz="4" w:space="0" w:color="CBCBCB"/>
+              <w:right w:val="single" w:sz="4" w:space="0" w:color="CBCBCB"/>
+            </w:tcBorders>
+          </w:tcPr>
+          <w:p>
+            <w:r>
+              <w:rPr>
+                <w:sz w:val="20"/>
+              </w:rPr>
+              <w:t>INTEGER</w:t>
+            </w:r>
+          </w:p>
+        </w:tc>
+        <w:tc>
+          <w:tcPr>
+            <w:tcW w:type="dxa" w:w="3230"/>
+            <w:shd w:val="clear" w:color="auto" w:fill="B8B3D6"/>
+            <w:tcBorders>
+              <w:top w:val="single" w:sz="4" w:space="0" w:color="CBCBCB"/>
+              <w:left w:val="single" w:sz="4" w:space="0" w:color="CBCBCB"/>
+              <w:bottom w:val="single" w:sz="4" w:space="0" w:color="CBCBCB"/>
+              <w:right w:val="single" w:sz="4" w:space="0" w:color="CBCBCB"/>
+            </w:tcBorders>
+          </w:tcPr>
+          <w:p>
+            <w:r>
+              <w:rPr>
+                <w:sz w:val="20"/>
+              </w:rPr>
+              <w:t>NOT NULL DEFAULT 0 — STEP-3.1 MỚI (optimistic locking, dùng ở STEP-3.4)</w:t>
+            </w:r>
+          </w:p>
+        </w:tc>
+      </w:tr>
     </w:tbl>
     <w:p/>
     <w:p>
@@ -20205,6 +20267,1245 @@
           <w:sz w:val="18"/>
         </w:rPr>
         <w:t>idx_annotations_image ON annotations(image_id)</w:t>
+      </w:r>
+    </w:p>
+    <w:p>
+      <w:pPr>
+        <w:pStyle w:val="Heading3"/>
+        <w:spacing w:before="160" w:after="60"/>
+      </w:pPr>
+      <w:r>
+        <w:rPr>
+          <w:color w:val="4A3F8C"/>
+          <w:sz w:val="24"/>
+        </w:rPr>
+        <w:t>Bảng `annotation_history` — STEP-3.1 MỚI</w:t>
+      </w:r>
+    </w:p>
+    <w:tbl>
+      <w:tblPr>
+        <w:tblStyle w:val="TableGrid"/>
+        <w:tblW w:type="auto" w:w="0"/>
+        <w:tblLook w:firstColumn="1" w:firstRow="1" w:lastColumn="0" w:lastRow="0" w:noHBand="0" w:noVBand="1" w:val="04A0"/>
+      </w:tblPr>
+      <w:tblGrid>
+        <w:gridCol w:w="3230"/>
+        <w:gridCol w:w="3230"/>
+        <w:gridCol w:w="3230"/>
+      </w:tblGrid>
+      <w:tr>
+        <w:tc>
+          <w:tcPr>
+            <w:tcW w:type="dxa" w:w="3230"/>
+            <w:shd w:val="clear" w:color="auto" w:fill="251C53"/>
+            <w:tcBorders>
+              <w:top w:val="single" w:sz="4" w:space="0" w:color="251C53"/>
+              <w:left w:val="single" w:sz="4" w:space="0" w:color="251C53"/>
+              <w:bottom w:val="single" w:sz="4" w:space="0" w:color="251C53"/>
+              <w:right w:val="single" w:sz="4" w:space="0" w:color="251C53"/>
+            </w:tcBorders>
+          </w:tcPr>
+          <w:p>
+            <w:r>
+              <w:rPr>
+                <w:b/>
+                <w:color w:val="FFFFFF"/>
+                <w:sz w:val="20"/>
+              </w:rPr>
+              <w:t>Cột</w:t>
+            </w:r>
+          </w:p>
+        </w:tc>
+        <w:tc>
+          <w:tcPr>
+            <w:tcW w:type="dxa" w:w="3230"/>
+            <w:shd w:val="clear" w:color="auto" w:fill="251C53"/>
+            <w:tcBorders>
+              <w:top w:val="single" w:sz="4" w:space="0" w:color="251C53"/>
+              <w:left w:val="single" w:sz="4" w:space="0" w:color="251C53"/>
+              <w:bottom w:val="single" w:sz="4" w:space="0" w:color="251C53"/>
+              <w:right w:val="single" w:sz="4" w:space="0" w:color="251C53"/>
+            </w:tcBorders>
+          </w:tcPr>
+          <w:p>
+            <w:r>
+              <w:rPr>
+                <w:b/>
+                <w:color w:val="FFFFFF"/>
+                <w:sz w:val="20"/>
+              </w:rPr>
+              <w:t>Kiểu</w:t>
+            </w:r>
+          </w:p>
+        </w:tc>
+        <w:tc>
+          <w:tcPr>
+            <w:tcW w:type="dxa" w:w="3230"/>
+            <w:shd w:val="clear" w:color="auto" w:fill="251C53"/>
+            <w:tcBorders>
+              <w:top w:val="single" w:sz="4" w:space="0" w:color="251C53"/>
+              <w:left w:val="single" w:sz="4" w:space="0" w:color="251C53"/>
+              <w:bottom w:val="single" w:sz="4" w:space="0" w:color="251C53"/>
+              <w:right w:val="single" w:sz="4" w:space="0" w:color="251C53"/>
+            </w:tcBorders>
+          </w:tcPr>
+          <w:p>
+            <w:r>
+              <w:rPr>
+                <w:b/>
+                <w:color w:val="FFFFFF"/>
+                <w:sz w:val="20"/>
+              </w:rPr>
+              <w:t>Ràng buộc</w:t>
+            </w:r>
+          </w:p>
+        </w:tc>
+      </w:tr>
+      <w:tr>
+        <w:tc>
+          <w:tcPr>
+            <w:tcW w:type="dxa" w:w="3230"/>
+            <w:tcBorders>
+              <w:top w:val="single" w:sz="4" w:space="0" w:color="CBCBCB"/>
+              <w:left w:val="single" w:sz="4" w:space="0" w:color="CBCBCB"/>
+              <w:bottom w:val="single" w:sz="4" w:space="0" w:color="CBCBCB"/>
+              <w:right w:val="single" w:sz="4" w:space="0" w:color="CBCBCB"/>
+            </w:tcBorders>
+          </w:tcPr>
+          <w:p>
+            <w:r>
+              <w:rPr>
+                <w:sz w:val="20"/>
+              </w:rPr>
+              <w:t>---</w:t>
+            </w:r>
+          </w:p>
+        </w:tc>
+        <w:tc>
+          <w:tcPr>
+            <w:tcW w:type="dxa" w:w="3230"/>
+            <w:tcBorders>
+              <w:top w:val="single" w:sz="4" w:space="0" w:color="CBCBCB"/>
+              <w:left w:val="single" w:sz="4" w:space="0" w:color="CBCBCB"/>
+              <w:bottom w:val="single" w:sz="4" w:space="0" w:color="CBCBCB"/>
+              <w:right w:val="single" w:sz="4" w:space="0" w:color="CBCBCB"/>
+            </w:tcBorders>
+          </w:tcPr>
+          <w:p>
+            <w:r>
+              <w:rPr>
+                <w:sz w:val="20"/>
+              </w:rPr>
+              <w:t>---</w:t>
+            </w:r>
+          </w:p>
+        </w:tc>
+        <w:tc>
+          <w:tcPr>
+            <w:tcW w:type="dxa" w:w="3230"/>
+            <w:tcBorders>
+              <w:top w:val="single" w:sz="4" w:space="0" w:color="CBCBCB"/>
+              <w:left w:val="single" w:sz="4" w:space="0" w:color="CBCBCB"/>
+              <w:bottom w:val="single" w:sz="4" w:space="0" w:color="CBCBCB"/>
+              <w:right w:val="single" w:sz="4" w:space="0" w:color="CBCBCB"/>
+            </w:tcBorders>
+          </w:tcPr>
+          <w:p>
+            <w:r>
+              <w:rPr>
+                <w:sz w:val="20"/>
+              </w:rPr>
+              <w:t>---</w:t>
+            </w:r>
+          </w:p>
+        </w:tc>
+      </w:tr>
+      <w:tr>
+        <w:tc>
+          <w:tcPr>
+            <w:tcW w:type="dxa" w:w="3230"/>
+            <w:shd w:val="clear" w:color="auto" w:fill="B8B3D6"/>
+            <w:tcBorders>
+              <w:top w:val="single" w:sz="4" w:space="0" w:color="CBCBCB"/>
+              <w:left w:val="single" w:sz="4" w:space="0" w:color="CBCBCB"/>
+              <w:bottom w:val="single" w:sz="4" w:space="0" w:color="CBCBCB"/>
+              <w:right w:val="single" w:sz="4" w:space="0" w:color="CBCBCB"/>
+            </w:tcBorders>
+          </w:tcPr>
+          <w:p>
+            <w:r>
+              <w:rPr>
+                <w:sz w:val="20"/>
+              </w:rPr>
+              <w:t>id</w:t>
+            </w:r>
+          </w:p>
+        </w:tc>
+        <w:tc>
+          <w:tcPr>
+            <w:tcW w:type="dxa" w:w="3230"/>
+            <w:shd w:val="clear" w:color="auto" w:fill="B8B3D6"/>
+            <w:tcBorders>
+              <w:top w:val="single" w:sz="4" w:space="0" w:color="CBCBCB"/>
+              <w:left w:val="single" w:sz="4" w:space="0" w:color="CBCBCB"/>
+              <w:bottom w:val="single" w:sz="4" w:space="0" w:color="CBCBCB"/>
+              <w:right w:val="single" w:sz="4" w:space="0" w:color="CBCBCB"/>
+            </w:tcBorders>
+          </w:tcPr>
+          <w:p>
+            <w:r>
+              <w:rPr>
+                <w:sz w:val="20"/>
+              </w:rPr>
+              <w:t>INTEGER</w:t>
+            </w:r>
+          </w:p>
+        </w:tc>
+        <w:tc>
+          <w:tcPr>
+            <w:tcW w:type="dxa" w:w="3230"/>
+            <w:shd w:val="clear" w:color="auto" w:fill="B8B3D6"/>
+            <w:tcBorders>
+              <w:top w:val="single" w:sz="4" w:space="0" w:color="CBCBCB"/>
+              <w:left w:val="single" w:sz="4" w:space="0" w:color="CBCBCB"/>
+              <w:bottom w:val="single" w:sz="4" w:space="0" w:color="CBCBCB"/>
+              <w:right w:val="single" w:sz="4" w:space="0" w:color="CBCBCB"/>
+            </w:tcBorders>
+          </w:tcPr>
+          <w:p>
+            <w:r>
+              <w:rPr>
+                <w:sz w:val="20"/>
+              </w:rPr>
+              <w:t>PRIMARY KEY AUTOINCREMENT</w:t>
+            </w:r>
+          </w:p>
+        </w:tc>
+      </w:tr>
+      <w:tr>
+        <w:tc>
+          <w:tcPr>
+            <w:tcW w:type="dxa" w:w="3230"/>
+            <w:tcBorders>
+              <w:top w:val="single" w:sz="4" w:space="0" w:color="CBCBCB"/>
+              <w:left w:val="single" w:sz="4" w:space="0" w:color="CBCBCB"/>
+              <w:bottom w:val="single" w:sz="4" w:space="0" w:color="CBCBCB"/>
+              <w:right w:val="single" w:sz="4" w:space="0" w:color="CBCBCB"/>
+            </w:tcBorders>
+          </w:tcPr>
+          <w:p>
+            <w:r>
+              <w:rPr>
+                <w:sz w:val="20"/>
+              </w:rPr>
+              <w:t>image_id</w:t>
+            </w:r>
+          </w:p>
+        </w:tc>
+        <w:tc>
+          <w:tcPr>
+            <w:tcW w:type="dxa" w:w="3230"/>
+            <w:tcBorders>
+              <w:top w:val="single" w:sz="4" w:space="0" w:color="CBCBCB"/>
+              <w:left w:val="single" w:sz="4" w:space="0" w:color="CBCBCB"/>
+              <w:bottom w:val="single" w:sz="4" w:space="0" w:color="CBCBCB"/>
+              <w:right w:val="single" w:sz="4" w:space="0" w:color="CBCBCB"/>
+            </w:tcBorders>
+          </w:tcPr>
+          <w:p>
+            <w:r>
+              <w:rPr>
+                <w:sz w:val="20"/>
+              </w:rPr>
+              <w:t>TEXT</w:t>
+            </w:r>
+          </w:p>
+        </w:tc>
+        <w:tc>
+          <w:tcPr>
+            <w:tcW w:type="dxa" w:w="3230"/>
+            <w:tcBorders>
+              <w:top w:val="single" w:sz="4" w:space="0" w:color="CBCBCB"/>
+              <w:left w:val="single" w:sz="4" w:space="0" w:color="CBCBCB"/>
+              <w:bottom w:val="single" w:sz="4" w:space="0" w:color="CBCBCB"/>
+              <w:right w:val="single" w:sz="4" w:space="0" w:color="CBCBCB"/>
+            </w:tcBorders>
+          </w:tcPr>
+          <w:p>
+            <w:r>
+              <w:rPr>
+                <w:sz w:val="20"/>
+              </w:rPr>
+              <w:t>NOT NULL, FK→images(id) ON DELETE CASCADE</w:t>
+            </w:r>
+          </w:p>
+        </w:tc>
+      </w:tr>
+      <w:tr>
+        <w:tc>
+          <w:tcPr>
+            <w:tcW w:type="dxa" w:w="3230"/>
+            <w:shd w:val="clear" w:color="auto" w:fill="B8B3D6"/>
+            <w:tcBorders>
+              <w:top w:val="single" w:sz="4" w:space="0" w:color="CBCBCB"/>
+              <w:left w:val="single" w:sz="4" w:space="0" w:color="CBCBCB"/>
+              <w:bottom w:val="single" w:sz="4" w:space="0" w:color="CBCBCB"/>
+              <w:right w:val="single" w:sz="4" w:space="0" w:color="CBCBCB"/>
+            </w:tcBorders>
+          </w:tcPr>
+          <w:p>
+            <w:r>
+              <w:rPr>
+                <w:sz w:val="20"/>
+              </w:rPr>
+              <w:t>version</w:t>
+            </w:r>
+          </w:p>
+        </w:tc>
+        <w:tc>
+          <w:tcPr>
+            <w:tcW w:type="dxa" w:w="3230"/>
+            <w:shd w:val="clear" w:color="auto" w:fill="B8B3D6"/>
+            <w:tcBorders>
+              <w:top w:val="single" w:sz="4" w:space="0" w:color="CBCBCB"/>
+              <w:left w:val="single" w:sz="4" w:space="0" w:color="CBCBCB"/>
+              <w:bottom w:val="single" w:sz="4" w:space="0" w:color="CBCBCB"/>
+              <w:right w:val="single" w:sz="4" w:space="0" w:color="CBCBCB"/>
+            </w:tcBorders>
+          </w:tcPr>
+          <w:p>
+            <w:r>
+              <w:rPr>
+                <w:sz w:val="20"/>
+              </w:rPr>
+              <w:t>INTEGER</w:t>
+            </w:r>
+          </w:p>
+        </w:tc>
+        <w:tc>
+          <w:tcPr>
+            <w:tcW w:type="dxa" w:w="3230"/>
+            <w:shd w:val="clear" w:color="auto" w:fill="B8B3D6"/>
+            <w:tcBorders>
+              <w:top w:val="single" w:sz="4" w:space="0" w:color="CBCBCB"/>
+              <w:left w:val="single" w:sz="4" w:space="0" w:color="CBCBCB"/>
+              <w:bottom w:val="single" w:sz="4" w:space="0" w:color="CBCBCB"/>
+              <w:right w:val="single" w:sz="4" w:space="0" w:color="CBCBCB"/>
+            </w:tcBorders>
+          </w:tcPr>
+          <w:p>
+            <w:r>
+              <w:rPr>
+                <w:sz w:val="20"/>
+              </w:rPr>
+              <w:t>NOT NULL</w:t>
+            </w:r>
+          </w:p>
+        </w:tc>
+      </w:tr>
+      <w:tr>
+        <w:tc>
+          <w:tcPr>
+            <w:tcW w:type="dxa" w:w="3230"/>
+            <w:tcBorders>
+              <w:top w:val="single" w:sz="4" w:space="0" w:color="CBCBCB"/>
+              <w:left w:val="single" w:sz="4" w:space="0" w:color="CBCBCB"/>
+              <w:bottom w:val="single" w:sz="4" w:space="0" w:color="CBCBCB"/>
+              <w:right w:val="single" w:sz="4" w:space="0" w:color="CBCBCB"/>
+            </w:tcBorders>
+          </w:tcPr>
+          <w:p>
+            <w:r>
+              <w:rPr>
+                <w:sz w:val="20"/>
+              </w:rPr>
+              <w:t>snapshot</w:t>
+            </w:r>
+          </w:p>
+        </w:tc>
+        <w:tc>
+          <w:tcPr>
+            <w:tcW w:type="dxa" w:w="3230"/>
+            <w:tcBorders>
+              <w:top w:val="single" w:sz="4" w:space="0" w:color="CBCBCB"/>
+              <w:left w:val="single" w:sz="4" w:space="0" w:color="CBCBCB"/>
+              <w:bottom w:val="single" w:sz="4" w:space="0" w:color="CBCBCB"/>
+              <w:right w:val="single" w:sz="4" w:space="0" w:color="CBCBCB"/>
+            </w:tcBorders>
+          </w:tcPr>
+          <w:p>
+            <w:r>
+              <w:rPr>
+                <w:sz w:val="20"/>
+              </w:rPr>
+              <w:t>TEXT</w:t>
+            </w:r>
+          </w:p>
+        </w:tc>
+        <w:tc>
+          <w:tcPr>
+            <w:tcW w:type="dxa" w:w="3230"/>
+            <w:tcBorders>
+              <w:top w:val="single" w:sz="4" w:space="0" w:color="CBCBCB"/>
+              <w:left w:val="single" w:sz="4" w:space="0" w:color="CBCBCB"/>
+              <w:bottom w:val="single" w:sz="4" w:space="0" w:color="CBCBCB"/>
+              <w:right w:val="single" w:sz="4" w:space="0" w:color="CBCBCB"/>
+            </w:tcBorders>
+          </w:tcPr>
+          <w:p>
+            <w:r>
+              <w:rPr>
+                <w:sz w:val="20"/>
+              </w:rPr>
+              <w:t>NOT NULL — JSON toàn bộ annotations của ảnh tại thời điểm save (SNAPSHOT, không diff — ADR AD-5)</w:t>
+            </w:r>
+          </w:p>
+        </w:tc>
+      </w:tr>
+      <w:tr>
+        <w:tc>
+          <w:tcPr>
+            <w:tcW w:type="dxa" w:w="3230"/>
+            <w:shd w:val="clear" w:color="auto" w:fill="B8B3D6"/>
+            <w:tcBorders>
+              <w:top w:val="single" w:sz="4" w:space="0" w:color="CBCBCB"/>
+              <w:left w:val="single" w:sz="4" w:space="0" w:color="CBCBCB"/>
+              <w:bottom w:val="single" w:sz="4" w:space="0" w:color="CBCBCB"/>
+              <w:right w:val="single" w:sz="4" w:space="0" w:color="CBCBCB"/>
+            </w:tcBorders>
+          </w:tcPr>
+          <w:p>
+            <w:r>
+              <w:rPr>
+                <w:sz w:val="20"/>
+              </w:rPr>
+              <w:t>actor_id</w:t>
+            </w:r>
+          </w:p>
+        </w:tc>
+        <w:tc>
+          <w:tcPr>
+            <w:tcW w:type="dxa" w:w="3230"/>
+            <w:shd w:val="clear" w:color="auto" w:fill="B8B3D6"/>
+            <w:tcBorders>
+              <w:top w:val="single" w:sz="4" w:space="0" w:color="CBCBCB"/>
+              <w:left w:val="single" w:sz="4" w:space="0" w:color="CBCBCB"/>
+              <w:bottom w:val="single" w:sz="4" w:space="0" w:color="CBCBCB"/>
+              <w:right w:val="single" w:sz="4" w:space="0" w:color="CBCBCB"/>
+            </w:tcBorders>
+          </w:tcPr>
+          <w:p>
+            <w:r>
+              <w:rPr>
+                <w:sz w:val="20"/>
+              </w:rPr>
+              <w:t>INTEGER</w:t>
+            </w:r>
+          </w:p>
+        </w:tc>
+        <w:tc>
+          <w:tcPr>
+            <w:tcW w:type="dxa" w:w="3230"/>
+            <w:shd w:val="clear" w:color="auto" w:fill="B8B3D6"/>
+            <w:tcBorders>
+              <w:top w:val="single" w:sz="4" w:space="0" w:color="CBCBCB"/>
+              <w:left w:val="single" w:sz="4" w:space="0" w:color="CBCBCB"/>
+              <w:bottom w:val="single" w:sz="4" w:space="0" w:color="CBCBCB"/>
+              <w:right w:val="single" w:sz="4" w:space="0" w:color="CBCBCB"/>
+            </w:tcBorders>
+          </w:tcPr>
+          <w:p>
+            <w:r>
+              <w:rPr>
+                <w:sz w:val="20"/>
+              </w:rPr>
+              <w:t>FK→users(id), nullable</w:t>
+            </w:r>
+          </w:p>
+        </w:tc>
+      </w:tr>
+      <w:tr>
+        <w:tc>
+          <w:tcPr>
+            <w:tcW w:type="dxa" w:w="3230"/>
+            <w:tcBorders>
+              <w:top w:val="single" w:sz="4" w:space="0" w:color="CBCBCB"/>
+              <w:left w:val="single" w:sz="4" w:space="0" w:color="CBCBCB"/>
+              <w:bottom w:val="single" w:sz="4" w:space="0" w:color="CBCBCB"/>
+              <w:right w:val="single" w:sz="4" w:space="0" w:color="CBCBCB"/>
+            </w:tcBorders>
+          </w:tcPr>
+          <w:p>
+            <w:r>
+              <w:rPr>
+                <w:sz w:val="20"/>
+              </w:rPr>
+              <w:t>created_at</w:t>
+            </w:r>
+          </w:p>
+        </w:tc>
+        <w:tc>
+          <w:tcPr>
+            <w:tcW w:type="dxa" w:w="3230"/>
+            <w:tcBorders>
+              <w:top w:val="single" w:sz="4" w:space="0" w:color="CBCBCB"/>
+              <w:left w:val="single" w:sz="4" w:space="0" w:color="CBCBCB"/>
+              <w:bottom w:val="single" w:sz="4" w:space="0" w:color="CBCBCB"/>
+              <w:right w:val="single" w:sz="4" w:space="0" w:color="CBCBCB"/>
+            </w:tcBorders>
+          </w:tcPr>
+          <w:p>
+            <w:r>
+              <w:rPr>
+                <w:sz w:val="20"/>
+              </w:rPr>
+              <w:t>TEXT</w:t>
+            </w:r>
+          </w:p>
+        </w:tc>
+        <w:tc>
+          <w:tcPr>
+            <w:tcW w:type="dxa" w:w="3230"/>
+            <w:tcBorders>
+              <w:top w:val="single" w:sz="4" w:space="0" w:color="CBCBCB"/>
+              <w:left w:val="single" w:sz="4" w:space="0" w:color="CBCBCB"/>
+              <w:bottom w:val="single" w:sz="4" w:space="0" w:color="CBCBCB"/>
+              <w:right w:val="single" w:sz="4" w:space="0" w:color="CBCBCB"/>
+            </w:tcBorders>
+          </w:tcPr>
+          <w:p>
+            <w:r>
+              <w:rPr>
+                <w:sz w:val="20"/>
+              </w:rPr>
+              <w:t>NOT NULL DEFAULT datetime('now')</w:t>
+            </w:r>
+          </w:p>
+        </w:tc>
+      </w:tr>
+    </w:tbl>
+    <w:p/>
+    <w:p>
+      <w:pPr>
+        <w:spacing w:after="80"/>
+      </w:pPr>
+      <w:r>
+        <w:rPr>
+          <w:b/>
+          <w:sz w:val="21"/>
+        </w:rPr>
+        <w:t>Index:</w:t>
+      </w:r>
+      <w:r>
+        <w:rPr>
+          <w:sz w:val="21"/>
+        </w:rPr>
+        <w:t xml:space="preserve"> </w:t>
+      </w:r>
+      <w:r>
+        <w:rPr>
+          <w:rFonts w:ascii="Courier New" w:hAnsi="Courier New"/>
+          <w:color w:val="F05922"/>
+          <w:sz w:val="18"/>
+        </w:rPr>
+        <w:t>idx_ann_history_image</w:t>
+      </w:r>
+      <w:r>
+        <w:rPr>
+          <w:sz w:val="21"/>
+        </w:rPr>
+        <w:t xml:space="preserve">, </w:t>
+      </w:r>
+      <w:r>
+        <w:rPr>
+          <w:rFonts w:ascii="Courier New" w:hAnsi="Courier New"/>
+          <w:color w:val="F05922"/>
+          <w:sz w:val="18"/>
+        </w:rPr>
+        <w:t>idx_ann_history_img_ver(image_id, version DESC)</w:t>
+      </w:r>
+      <w:r>
+        <w:rPr>
+          <w:sz w:val="21"/>
+        </w:rPr>
+        <w:t xml:space="preserve">. </w:t>
+      </w:r>
+      <w:r>
+        <w:rPr>
+          <w:b/>
+          <w:sz w:val="21"/>
+        </w:rPr>
+        <w:t>Retention:</w:t>
+      </w:r>
+      <w:r>
+        <w:rPr>
+          <w:sz w:val="21"/>
+        </w:rPr>
+        <w:t xml:space="preserve"> tối đa 200 version/ảnh qua </w:t>
+      </w:r>
+      <w:r>
+        <w:rPr>
+          <w:rFonts w:ascii="Courier New" w:hAnsi="Courier New"/>
+          <w:color w:val="F05922"/>
+          <w:sz w:val="18"/>
+        </w:rPr>
+        <w:t>pruneAnnotationHistory(imageId)</w:t>
+      </w:r>
+      <w:r>
+        <w:rPr>
+          <w:sz w:val="21"/>
+        </w:rPr>
+        <w:t xml:space="preserve"> (export từ </w:t>
+      </w:r>
+      <w:r>
+        <w:rPr>
+          <w:rFonts w:ascii="Courier New" w:hAnsi="Courier New"/>
+          <w:color w:val="F05922"/>
+          <w:sz w:val="18"/>
+        </w:rPr>
+        <w:t>db.js</w:t>
+      </w:r>
+      <w:r>
+        <w:rPr>
+          <w:sz w:val="21"/>
+        </w:rPr>
+        <w:t>, gọi bởi STEP-3.2).</w:t>
+      </w:r>
+    </w:p>
+    <w:p>
+      <w:pPr>
+        <w:pStyle w:val="Heading3"/>
+        <w:spacing w:before="160" w:after="60"/>
+      </w:pPr>
+      <w:r>
+        <w:rPr>
+          <w:color w:val="4A3F8C"/>
+          <w:sz w:val="24"/>
+        </w:rPr>
+        <w:t>Bảng `activity_log` — STEP-3.1 MỚI</w:t>
+      </w:r>
+    </w:p>
+    <w:tbl>
+      <w:tblPr>
+        <w:tblStyle w:val="TableGrid"/>
+        <w:tblW w:type="auto" w:w="0"/>
+        <w:tblLook w:firstColumn="1" w:firstRow="1" w:lastColumn="0" w:lastRow="0" w:noHBand="0" w:noVBand="1" w:val="04A0"/>
+      </w:tblPr>
+      <w:tblGrid>
+        <w:gridCol w:w="3230"/>
+        <w:gridCol w:w="3230"/>
+        <w:gridCol w:w="3230"/>
+      </w:tblGrid>
+      <w:tr>
+        <w:tc>
+          <w:tcPr>
+            <w:tcW w:type="dxa" w:w="3230"/>
+            <w:shd w:val="clear" w:color="auto" w:fill="251C53"/>
+            <w:tcBorders>
+              <w:top w:val="single" w:sz="4" w:space="0" w:color="251C53"/>
+              <w:left w:val="single" w:sz="4" w:space="0" w:color="251C53"/>
+              <w:bottom w:val="single" w:sz="4" w:space="0" w:color="251C53"/>
+              <w:right w:val="single" w:sz="4" w:space="0" w:color="251C53"/>
+            </w:tcBorders>
+          </w:tcPr>
+          <w:p>
+            <w:r>
+              <w:rPr>
+                <w:b/>
+                <w:color w:val="FFFFFF"/>
+                <w:sz w:val="20"/>
+              </w:rPr>
+              <w:t>Cột</w:t>
+            </w:r>
+          </w:p>
+        </w:tc>
+        <w:tc>
+          <w:tcPr>
+            <w:tcW w:type="dxa" w:w="3230"/>
+            <w:shd w:val="clear" w:color="auto" w:fill="251C53"/>
+            <w:tcBorders>
+              <w:top w:val="single" w:sz="4" w:space="0" w:color="251C53"/>
+              <w:left w:val="single" w:sz="4" w:space="0" w:color="251C53"/>
+              <w:bottom w:val="single" w:sz="4" w:space="0" w:color="251C53"/>
+              <w:right w:val="single" w:sz="4" w:space="0" w:color="251C53"/>
+            </w:tcBorders>
+          </w:tcPr>
+          <w:p>
+            <w:r>
+              <w:rPr>
+                <w:b/>
+                <w:color w:val="FFFFFF"/>
+                <w:sz w:val="20"/>
+              </w:rPr>
+              <w:t>Kiểu</w:t>
+            </w:r>
+          </w:p>
+        </w:tc>
+        <w:tc>
+          <w:tcPr>
+            <w:tcW w:type="dxa" w:w="3230"/>
+            <w:shd w:val="clear" w:color="auto" w:fill="251C53"/>
+            <w:tcBorders>
+              <w:top w:val="single" w:sz="4" w:space="0" w:color="251C53"/>
+              <w:left w:val="single" w:sz="4" w:space="0" w:color="251C53"/>
+              <w:bottom w:val="single" w:sz="4" w:space="0" w:color="251C53"/>
+              <w:right w:val="single" w:sz="4" w:space="0" w:color="251C53"/>
+            </w:tcBorders>
+          </w:tcPr>
+          <w:p>
+            <w:r>
+              <w:rPr>
+                <w:b/>
+                <w:color w:val="FFFFFF"/>
+                <w:sz w:val="20"/>
+              </w:rPr>
+              <w:t>Ràng buộc</w:t>
+            </w:r>
+          </w:p>
+        </w:tc>
+      </w:tr>
+      <w:tr>
+        <w:tc>
+          <w:tcPr>
+            <w:tcW w:type="dxa" w:w="3230"/>
+            <w:tcBorders>
+              <w:top w:val="single" w:sz="4" w:space="0" w:color="CBCBCB"/>
+              <w:left w:val="single" w:sz="4" w:space="0" w:color="CBCBCB"/>
+              <w:bottom w:val="single" w:sz="4" w:space="0" w:color="CBCBCB"/>
+              <w:right w:val="single" w:sz="4" w:space="0" w:color="CBCBCB"/>
+            </w:tcBorders>
+          </w:tcPr>
+          <w:p>
+            <w:r>
+              <w:rPr>
+                <w:sz w:val="20"/>
+              </w:rPr>
+              <w:t>---</w:t>
+            </w:r>
+          </w:p>
+        </w:tc>
+        <w:tc>
+          <w:tcPr>
+            <w:tcW w:type="dxa" w:w="3230"/>
+            <w:tcBorders>
+              <w:top w:val="single" w:sz="4" w:space="0" w:color="CBCBCB"/>
+              <w:left w:val="single" w:sz="4" w:space="0" w:color="CBCBCB"/>
+              <w:bottom w:val="single" w:sz="4" w:space="0" w:color="CBCBCB"/>
+              <w:right w:val="single" w:sz="4" w:space="0" w:color="CBCBCB"/>
+            </w:tcBorders>
+          </w:tcPr>
+          <w:p>
+            <w:r>
+              <w:rPr>
+                <w:sz w:val="20"/>
+              </w:rPr>
+              <w:t>---</w:t>
+            </w:r>
+          </w:p>
+        </w:tc>
+        <w:tc>
+          <w:tcPr>
+            <w:tcW w:type="dxa" w:w="3230"/>
+            <w:tcBorders>
+              <w:top w:val="single" w:sz="4" w:space="0" w:color="CBCBCB"/>
+              <w:left w:val="single" w:sz="4" w:space="0" w:color="CBCBCB"/>
+              <w:bottom w:val="single" w:sz="4" w:space="0" w:color="CBCBCB"/>
+              <w:right w:val="single" w:sz="4" w:space="0" w:color="CBCBCB"/>
+            </w:tcBorders>
+          </w:tcPr>
+          <w:p>
+            <w:r>
+              <w:rPr>
+                <w:sz w:val="20"/>
+              </w:rPr>
+              <w:t>---</w:t>
+            </w:r>
+          </w:p>
+        </w:tc>
+      </w:tr>
+      <w:tr>
+        <w:tc>
+          <w:tcPr>
+            <w:tcW w:type="dxa" w:w="3230"/>
+            <w:shd w:val="clear" w:color="auto" w:fill="B8B3D6"/>
+            <w:tcBorders>
+              <w:top w:val="single" w:sz="4" w:space="0" w:color="CBCBCB"/>
+              <w:left w:val="single" w:sz="4" w:space="0" w:color="CBCBCB"/>
+              <w:bottom w:val="single" w:sz="4" w:space="0" w:color="CBCBCB"/>
+              <w:right w:val="single" w:sz="4" w:space="0" w:color="CBCBCB"/>
+            </w:tcBorders>
+          </w:tcPr>
+          <w:p>
+            <w:r>
+              <w:rPr>
+                <w:sz w:val="20"/>
+              </w:rPr>
+              <w:t>id</w:t>
+            </w:r>
+          </w:p>
+        </w:tc>
+        <w:tc>
+          <w:tcPr>
+            <w:tcW w:type="dxa" w:w="3230"/>
+            <w:shd w:val="clear" w:color="auto" w:fill="B8B3D6"/>
+            <w:tcBorders>
+              <w:top w:val="single" w:sz="4" w:space="0" w:color="CBCBCB"/>
+              <w:left w:val="single" w:sz="4" w:space="0" w:color="CBCBCB"/>
+              <w:bottom w:val="single" w:sz="4" w:space="0" w:color="CBCBCB"/>
+              <w:right w:val="single" w:sz="4" w:space="0" w:color="CBCBCB"/>
+            </w:tcBorders>
+          </w:tcPr>
+          <w:p>
+            <w:r>
+              <w:rPr>
+                <w:sz w:val="20"/>
+              </w:rPr>
+              <w:t>INTEGER</w:t>
+            </w:r>
+          </w:p>
+        </w:tc>
+        <w:tc>
+          <w:tcPr>
+            <w:tcW w:type="dxa" w:w="3230"/>
+            <w:shd w:val="clear" w:color="auto" w:fill="B8B3D6"/>
+            <w:tcBorders>
+              <w:top w:val="single" w:sz="4" w:space="0" w:color="CBCBCB"/>
+              <w:left w:val="single" w:sz="4" w:space="0" w:color="CBCBCB"/>
+              <w:bottom w:val="single" w:sz="4" w:space="0" w:color="CBCBCB"/>
+              <w:right w:val="single" w:sz="4" w:space="0" w:color="CBCBCB"/>
+            </w:tcBorders>
+          </w:tcPr>
+          <w:p>
+            <w:r>
+              <w:rPr>
+                <w:sz w:val="20"/>
+              </w:rPr>
+              <w:t>PRIMARY KEY AUTOINCREMENT</w:t>
+            </w:r>
+          </w:p>
+        </w:tc>
+      </w:tr>
+      <w:tr>
+        <w:tc>
+          <w:tcPr>
+            <w:tcW w:type="dxa" w:w="3230"/>
+            <w:tcBorders>
+              <w:top w:val="single" w:sz="4" w:space="0" w:color="CBCBCB"/>
+              <w:left w:val="single" w:sz="4" w:space="0" w:color="CBCBCB"/>
+              <w:bottom w:val="single" w:sz="4" w:space="0" w:color="CBCBCB"/>
+              <w:right w:val="single" w:sz="4" w:space="0" w:color="CBCBCB"/>
+            </w:tcBorders>
+          </w:tcPr>
+          <w:p>
+            <w:r>
+              <w:rPr>
+                <w:sz w:val="20"/>
+              </w:rPr>
+              <w:t>project_id</w:t>
+            </w:r>
+          </w:p>
+        </w:tc>
+        <w:tc>
+          <w:tcPr>
+            <w:tcW w:type="dxa" w:w="3230"/>
+            <w:tcBorders>
+              <w:top w:val="single" w:sz="4" w:space="0" w:color="CBCBCB"/>
+              <w:left w:val="single" w:sz="4" w:space="0" w:color="CBCBCB"/>
+              <w:bottom w:val="single" w:sz="4" w:space="0" w:color="CBCBCB"/>
+              <w:right w:val="single" w:sz="4" w:space="0" w:color="CBCBCB"/>
+            </w:tcBorders>
+          </w:tcPr>
+          <w:p>
+            <w:r>
+              <w:rPr>
+                <w:sz w:val="20"/>
+              </w:rPr>
+              <w:t>TEXT</w:t>
+            </w:r>
+          </w:p>
+        </w:tc>
+        <w:tc>
+          <w:tcPr>
+            <w:tcW w:type="dxa" w:w="3230"/>
+            <w:tcBorders>
+              <w:top w:val="single" w:sz="4" w:space="0" w:color="CBCBCB"/>
+              <w:left w:val="single" w:sz="4" w:space="0" w:color="CBCBCB"/>
+              <w:bottom w:val="single" w:sz="4" w:space="0" w:color="CBCBCB"/>
+              <w:right w:val="single" w:sz="4" w:space="0" w:color="CBCBCB"/>
+            </w:tcBorders>
+          </w:tcPr>
+          <w:p>
+            <w:r>
+              <w:rPr>
+                <w:sz w:val="20"/>
+              </w:rPr>
+              <w:t>NOT NULL, FK→projects(id) ON DELETE CASCADE</w:t>
+            </w:r>
+          </w:p>
+        </w:tc>
+      </w:tr>
+      <w:tr>
+        <w:tc>
+          <w:tcPr>
+            <w:tcW w:type="dxa" w:w="3230"/>
+            <w:shd w:val="clear" w:color="auto" w:fill="B8B3D6"/>
+            <w:tcBorders>
+              <w:top w:val="single" w:sz="4" w:space="0" w:color="CBCBCB"/>
+              <w:left w:val="single" w:sz="4" w:space="0" w:color="CBCBCB"/>
+              <w:bottom w:val="single" w:sz="4" w:space="0" w:color="CBCBCB"/>
+              <w:right w:val="single" w:sz="4" w:space="0" w:color="CBCBCB"/>
+            </w:tcBorders>
+          </w:tcPr>
+          <w:p>
+            <w:r>
+              <w:rPr>
+                <w:sz w:val="20"/>
+              </w:rPr>
+              <w:t>actor_id</w:t>
+            </w:r>
+          </w:p>
+        </w:tc>
+        <w:tc>
+          <w:tcPr>
+            <w:tcW w:type="dxa" w:w="3230"/>
+            <w:shd w:val="clear" w:color="auto" w:fill="B8B3D6"/>
+            <w:tcBorders>
+              <w:top w:val="single" w:sz="4" w:space="0" w:color="CBCBCB"/>
+              <w:left w:val="single" w:sz="4" w:space="0" w:color="CBCBCB"/>
+              <w:bottom w:val="single" w:sz="4" w:space="0" w:color="CBCBCB"/>
+              <w:right w:val="single" w:sz="4" w:space="0" w:color="CBCBCB"/>
+            </w:tcBorders>
+          </w:tcPr>
+          <w:p>
+            <w:r>
+              <w:rPr>
+                <w:sz w:val="20"/>
+              </w:rPr>
+              <w:t>INTEGER</w:t>
+            </w:r>
+          </w:p>
+        </w:tc>
+        <w:tc>
+          <w:tcPr>
+            <w:tcW w:type="dxa" w:w="3230"/>
+            <w:shd w:val="clear" w:color="auto" w:fill="B8B3D6"/>
+            <w:tcBorders>
+              <w:top w:val="single" w:sz="4" w:space="0" w:color="CBCBCB"/>
+              <w:left w:val="single" w:sz="4" w:space="0" w:color="CBCBCB"/>
+              <w:bottom w:val="single" w:sz="4" w:space="0" w:color="CBCBCB"/>
+              <w:right w:val="single" w:sz="4" w:space="0" w:color="CBCBCB"/>
+            </w:tcBorders>
+          </w:tcPr>
+          <w:p>
+            <w:r>
+              <w:rPr>
+                <w:sz w:val="20"/>
+              </w:rPr>
+              <w:t>FK→users(id), nullable</w:t>
+            </w:r>
+          </w:p>
+        </w:tc>
+      </w:tr>
+      <w:tr>
+        <w:tc>
+          <w:tcPr>
+            <w:tcW w:type="dxa" w:w="3230"/>
+            <w:tcBorders>
+              <w:top w:val="single" w:sz="4" w:space="0" w:color="CBCBCB"/>
+              <w:left w:val="single" w:sz="4" w:space="0" w:color="CBCBCB"/>
+              <w:bottom w:val="single" w:sz="4" w:space="0" w:color="CBCBCB"/>
+              <w:right w:val="single" w:sz="4" w:space="0" w:color="CBCBCB"/>
+            </w:tcBorders>
+          </w:tcPr>
+          <w:p>
+            <w:r>
+              <w:rPr>
+                <w:sz w:val="20"/>
+              </w:rPr>
+              <w:t>action</w:t>
+            </w:r>
+          </w:p>
+        </w:tc>
+        <w:tc>
+          <w:tcPr>
+            <w:tcW w:type="dxa" w:w="3230"/>
+            <w:tcBorders>
+              <w:top w:val="single" w:sz="4" w:space="0" w:color="CBCBCB"/>
+              <w:left w:val="single" w:sz="4" w:space="0" w:color="CBCBCB"/>
+              <w:bottom w:val="single" w:sz="4" w:space="0" w:color="CBCBCB"/>
+              <w:right w:val="single" w:sz="4" w:space="0" w:color="CBCBCB"/>
+            </w:tcBorders>
+          </w:tcPr>
+          <w:p>
+            <w:r>
+              <w:rPr>
+                <w:sz w:val="20"/>
+              </w:rPr>
+              <w:t>TEXT</w:t>
+            </w:r>
+          </w:p>
+        </w:tc>
+        <w:tc>
+          <w:tcPr>
+            <w:tcW w:type="dxa" w:w="3230"/>
+            <w:tcBorders>
+              <w:top w:val="single" w:sz="4" w:space="0" w:color="CBCBCB"/>
+              <w:left w:val="single" w:sz="4" w:space="0" w:color="CBCBCB"/>
+              <w:bottom w:val="single" w:sz="4" w:space="0" w:color="CBCBCB"/>
+              <w:right w:val="single" w:sz="4" w:space="0" w:color="CBCBCB"/>
+            </w:tcBorders>
+          </w:tcPr>
+          <w:p>
+            <w:r>
+              <w:rPr>
+                <w:sz w:val="20"/>
+              </w:rPr>
+              <w:t>NOT NULL (VD: 'upload', 'export', 'split_change')</w:t>
+            </w:r>
+          </w:p>
+        </w:tc>
+      </w:tr>
+      <w:tr>
+        <w:tc>
+          <w:tcPr>
+            <w:tcW w:type="dxa" w:w="3230"/>
+            <w:shd w:val="clear" w:color="auto" w:fill="B8B3D6"/>
+            <w:tcBorders>
+              <w:top w:val="single" w:sz="4" w:space="0" w:color="CBCBCB"/>
+              <w:left w:val="single" w:sz="4" w:space="0" w:color="CBCBCB"/>
+              <w:bottom w:val="single" w:sz="4" w:space="0" w:color="CBCBCB"/>
+              <w:right w:val="single" w:sz="4" w:space="0" w:color="CBCBCB"/>
+            </w:tcBorders>
+          </w:tcPr>
+          <w:p>
+            <w:r>
+              <w:rPr>
+                <w:sz w:val="20"/>
+              </w:rPr>
+              <w:t>detail</w:t>
+            </w:r>
+          </w:p>
+        </w:tc>
+        <w:tc>
+          <w:tcPr>
+            <w:tcW w:type="dxa" w:w="3230"/>
+            <w:shd w:val="clear" w:color="auto" w:fill="B8B3D6"/>
+            <w:tcBorders>
+              <w:top w:val="single" w:sz="4" w:space="0" w:color="CBCBCB"/>
+              <w:left w:val="single" w:sz="4" w:space="0" w:color="CBCBCB"/>
+              <w:bottom w:val="single" w:sz="4" w:space="0" w:color="CBCBCB"/>
+              <w:right w:val="single" w:sz="4" w:space="0" w:color="CBCBCB"/>
+            </w:tcBorders>
+          </w:tcPr>
+          <w:p>
+            <w:r>
+              <w:rPr>
+                <w:sz w:val="20"/>
+              </w:rPr>
+              <w:t>TEXT</w:t>
+            </w:r>
+          </w:p>
+        </w:tc>
+        <w:tc>
+          <w:tcPr>
+            <w:tcW w:type="dxa" w:w="3230"/>
+            <w:shd w:val="clear" w:color="auto" w:fill="B8B3D6"/>
+            <w:tcBorders>
+              <w:top w:val="single" w:sz="4" w:space="0" w:color="CBCBCB"/>
+              <w:left w:val="single" w:sz="4" w:space="0" w:color="CBCBCB"/>
+              <w:bottom w:val="single" w:sz="4" w:space="0" w:color="CBCBCB"/>
+              <w:right w:val="single" w:sz="4" w:space="0" w:color="CBCBCB"/>
+            </w:tcBorders>
+          </w:tcPr>
+          <w:p>
+            <w:r>
+              <w:rPr>
+                <w:sz w:val="20"/>
+              </w:rPr>
+              <w:t>nullable, JSON tuỳ ý</w:t>
+            </w:r>
+          </w:p>
+        </w:tc>
+      </w:tr>
+      <w:tr>
+        <w:tc>
+          <w:tcPr>
+            <w:tcW w:type="dxa" w:w="3230"/>
+            <w:tcBorders>
+              <w:top w:val="single" w:sz="4" w:space="0" w:color="CBCBCB"/>
+              <w:left w:val="single" w:sz="4" w:space="0" w:color="CBCBCB"/>
+              <w:bottom w:val="single" w:sz="4" w:space="0" w:color="CBCBCB"/>
+              <w:right w:val="single" w:sz="4" w:space="0" w:color="CBCBCB"/>
+            </w:tcBorders>
+          </w:tcPr>
+          <w:p>
+            <w:r>
+              <w:rPr>
+                <w:sz w:val="20"/>
+              </w:rPr>
+              <w:t>created_at</w:t>
+            </w:r>
+          </w:p>
+        </w:tc>
+        <w:tc>
+          <w:tcPr>
+            <w:tcW w:type="dxa" w:w="3230"/>
+            <w:tcBorders>
+              <w:top w:val="single" w:sz="4" w:space="0" w:color="CBCBCB"/>
+              <w:left w:val="single" w:sz="4" w:space="0" w:color="CBCBCB"/>
+              <w:bottom w:val="single" w:sz="4" w:space="0" w:color="CBCBCB"/>
+              <w:right w:val="single" w:sz="4" w:space="0" w:color="CBCBCB"/>
+            </w:tcBorders>
+          </w:tcPr>
+          <w:p>
+            <w:r>
+              <w:rPr>
+                <w:sz w:val="20"/>
+              </w:rPr>
+              <w:t>TEXT</w:t>
+            </w:r>
+          </w:p>
+        </w:tc>
+        <w:tc>
+          <w:tcPr>
+            <w:tcW w:type="dxa" w:w="3230"/>
+            <w:tcBorders>
+              <w:top w:val="single" w:sz="4" w:space="0" w:color="CBCBCB"/>
+              <w:left w:val="single" w:sz="4" w:space="0" w:color="CBCBCB"/>
+              <w:bottom w:val="single" w:sz="4" w:space="0" w:color="CBCBCB"/>
+              <w:right w:val="single" w:sz="4" w:space="0" w:color="CBCBCB"/>
+            </w:tcBorders>
+          </w:tcPr>
+          <w:p>
+            <w:r>
+              <w:rPr>
+                <w:sz w:val="20"/>
+              </w:rPr>
+              <w:t>NOT NULL DEFAULT datetime('now')</w:t>
+            </w:r>
+          </w:p>
+        </w:tc>
+      </w:tr>
+    </w:tbl>
+    <w:p/>
+    <w:p>
+      <w:pPr>
+        <w:spacing w:after="80"/>
+      </w:pPr>
+      <w:r>
+        <w:rPr>
+          <w:b/>
+          <w:sz w:val="21"/>
+        </w:rPr>
+        <w:t>Index:</w:t>
+      </w:r>
+      <w:r>
+        <w:rPr>
+          <w:sz w:val="21"/>
+        </w:rPr>
+        <w:t xml:space="preserve"> </w:t>
+      </w:r>
+      <w:r>
+        <w:rPr>
+          <w:rFonts w:ascii="Courier New" w:hAnsi="Courier New"/>
+          <w:color w:val="F05922"/>
+          <w:sz w:val="18"/>
+        </w:rPr>
+        <w:t>idx_activity_log_project</w:t>
+      </w:r>
+      <w:r>
+        <w:rPr>
+          <w:sz w:val="21"/>
+        </w:rPr>
+        <w:t xml:space="preserve">, </w:t>
+      </w:r>
+      <w:r>
+        <w:rPr>
+          <w:rFonts w:ascii="Courier New" w:hAnsi="Courier New"/>
+          <w:color w:val="F05922"/>
+          <w:sz w:val="18"/>
+        </w:rPr>
+        <w:t>idx_activity_log_action</w:t>
+      </w:r>
+      <w:r>
+        <w:rPr>
+          <w:sz w:val="21"/>
+        </w:rPr>
+        <w:t>. Route ghi log: STEP-3.3 (bảng đã tạo, chưa có route ghi ở STEP-3.1).</w:t>
+      </w:r>
+    </w:p>
+    <w:p>
+      <w:pPr>
+        <w:spacing w:after="80"/>
+      </w:pPr>
+      <w:r>
+        <w:rPr>
+          <w:b/>
+          <w:sz w:val="21"/>
+        </w:rPr>
+        <w:t>⚠️ Lưu ý:</w:t>
+      </w:r>
+      <w:r>
+        <w:rPr>
+          <w:sz w:val="21"/>
+        </w:rPr>
+        <w:t xml:space="preserve"> </w:t>
+      </w:r>
+      <w:r>
+        <w:rPr>
+          <w:rFonts w:ascii="Courier New" w:hAnsi="Courier New"/>
+          <w:color w:val="F05922"/>
+          <w:sz w:val="18"/>
+        </w:rPr>
+        <w:t>actor_id</w:t>
+      </w:r>
+      <w:r>
+        <w:rPr>
+          <w:sz w:val="21"/>
+        </w:rPr>
+        <w:t xml:space="preserve"> không có </w:t>
+      </w:r>
+      <w:r>
+        <w:rPr>
+          <w:rFonts w:ascii="Courier New" w:hAnsi="Courier New"/>
+          <w:color w:val="F05922"/>
+          <w:sz w:val="18"/>
+        </w:rPr>
+        <w:t>ON DELETE CASCADE/SET NULL</w:t>
+      </w:r>
+      <w:r>
+        <w:rPr>
+          <w:sz w:val="21"/>
+        </w:rPr>
+        <w:t xml:space="preserve"> (mặc định NO ACTION) — không thể hard-delete user đã có history/activity_log khi </w:t>
+      </w:r>
+      <w:r>
+        <w:rPr>
+          <w:rFonts w:ascii="Courier New" w:hAnsi="Courier New"/>
+          <w:color w:val="F05922"/>
+          <w:sz w:val="18"/>
+        </w:rPr>
+        <w:t>foreign_keys=ON</w:t>
+      </w:r>
+      <w:r>
+        <w:rPr>
+          <w:sz w:val="21"/>
+        </w:rPr>
+        <w:t xml:space="preserve">. Dùng </w:t>
+      </w:r>
+      <w:r>
+        <w:rPr>
+          <w:rFonts w:ascii="Courier New" w:hAnsi="Courier New"/>
+          <w:color w:val="F05922"/>
+          <w:sz w:val="18"/>
+        </w:rPr>
+        <w:t>is_active=0</w:t>
+      </w:r>
+      <w:r>
+        <w:rPr>
+          <w:sz w:val="21"/>
+        </w:rPr>
+        <w:t xml:space="preserve"> (soft-delete, đã có từ STEP-2.2) thay vì xoá thật.</w:t>
       </w:r>
     </w:p>
     <w:p>
@@ -29034,7 +30335,7 @@
           <w:color w:val="4A3F8C"/>
           <w:sz w:val="24"/>
         </w:rPr>
-        <w:t>Phase 3.1 — DB Migration (ĐỤNG SCHEMA HIỆN CÓ)</w:t>
+        <w:t>Phase 3.1 — DB Migration (ĐỤNG SCHEMA HIỆN CÓ) — ✅ HOÀN THÀNH</w:t>
       </w:r>
     </w:p>
     <w:p>
@@ -29067,7 +30368,7 @@
         <w:rPr>
           <w:sz w:val="21"/>
         </w:rPr>
-        <w:t xml:space="preserve"> — ALTER TABLE </w:t>
+        <w:t xml:space="preserve"> — </w:t>
       </w:r>
       <w:r>
         <w:rPr>
@@ -29075,13 +30376,13 @@
           <w:color w:val="F05922"/>
           <w:sz w:val="21"/>
         </w:rPr>
-        <w:t>annotations</w:t>
+        <w:t>m005_phase3_schema()</w:t>
       </w:r>
       <w:r>
         <w:rPr>
           <w:sz w:val="21"/>
         </w:rPr>
-        <w:t xml:space="preserve"> ADD COLUMN </w:t>
+        <w:t xml:space="preserve">: cột </w:t>
       </w:r>
       <w:r>
         <w:rPr>
@@ -29089,13 +30390,13 @@
           <w:color w:val="F05922"/>
           <w:sz w:val="21"/>
         </w:rPr>
-        <w:t>version INTEGER DEFAULT 0</w:t>
+        <w:t>annotations.version</w:t>
       </w:r>
       <w:r>
         <w:rPr>
           <w:sz w:val="21"/>
         </w:rPr>
-        <w:t xml:space="preserve">; CREATE TABLE </w:t>
+        <w:t xml:space="preserve"> DEFAULT 0, bảng </w:t>
       </w:r>
       <w:r>
         <w:rPr>
@@ -29109,7 +30410,7 @@
         <w:rPr>
           <w:sz w:val="21"/>
         </w:rPr>
-        <w:t xml:space="preserve">; CREATE TABLE </w:t>
+        <w:t xml:space="preserve"> (snapshot), </w:t>
       </w:r>
       <w:r>
         <w:rPr>
@@ -29119,6 +30420,40 @@
         </w:rPr>
         <w:t>activity_log</w:t>
       </w:r>
+      <w:r>
+        <w:rPr>
+          <w:sz w:val="21"/>
+        </w:rPr>
+        <w:t xml:space="preserve">; auto-backup </w:t>
+      </w:r>
+      <w:r>
+        <w:rPr>
+          <w:rFonts w:ascii="Courier New" w:hAnsi="Courier New"/>
+          <w:color w:val="F05922"/>
+          <w:sz w:val="21"/>
+        </w:rPr>
+        <w:t>.bak-{ts}</w:t>
+      </w:r>
+      <w:r>
+        <w:rPr>
+          <w:sz w:val="21"/>
+        </w:rPr>
+        <w:t xml:space="preserve"> (giữ 5 bản) + verify row count trước/sau (throw nếu mất dữ liệu — CTO condition #1); export </w:t>
+      </w:r>
+      <w:r>
+        <w:rPr>
+          <w:rFonts w:ascii="Courier New" w:hAnsi="Courier New"/>
+          <w:color w:val="F05922"/>
+          <w:sz w:val="21"/>
+        </w:rPr>
+        <w:t>pruneAnnotationHistory()</w:t>
+      </w:r>
+      <w:r>
+        <w:rPr>
+          <w:sz w:val="21"/>
+        </w:rPr>
+        <w:t>.</w:t>
+      </w:r>
     </w:p>
     <w:p>
       <w:pPr>
@@ -29126,6 +30461,19 @@
         <w:spacing w:after="20"/>
         <w:ind w:left="283"/>
       </w:pPr>
+      <w:r>
+        <w:rPr>
+          <w:b/>
+          <w:sz w:val="21"/>
+        </w:rPr>
+        <w:t>Chưa đụng</w:t>
+      </w:r>
+      <w:r>
+        <w:rPr>
+          <w:sz w:val="21"/>
+        </w:rPr>
+        <w:t xml:space="preserve"> </w:t>
+      </w:r>
       <w:r>
         <w:rPr>
           <w:rFonts w:ascii="Courier New" w:hAnsi="Courier New"/>
@@ -29138,29 +30486,7 @@
         <w:rPr>
           <w:sz w:val="21"/>
         </w:rPr>
-        <w:t xml:space="preserve"> — UPDATE </w:t>
-      </w:r>
-      <w:r>
-        <w:rPr>
-          <w:rFonts w:ascii="Courier New" w:hAnsi="Courier New"/>
-          <w:color w:val="F05922"/>
-          <w:sz w:val="21"/>
-        </w:rPr>
-        <w:t>version</w:t>
-      </w:r>
-      <w:r>
-        <w:rPr>
-          <w:sz w:val="21"/>
-        </w:rPr>
-        <w:t xml:space="preserve"> khi save, INSERT vào </w:t>
-      </w:r>
-      <w:r>
-        <w:rPr>
-          <w:rFonts w:ascii="Courier New" w:hAnsi="Courier New"/>
-          <w:color w:val="F05922"/>
-          <w:sz w:val="21"/>
-        </w:rPr>
-        <w:t>annotation_history</w:t>
+        <w:t xml:space="preserve"> — route UPDATE version + INSERT history là việc của STEP-3.2, bước này CHỈ tạo schema.</w:t>
       </w:r>
     </w:p>
     <w:p>
@@ -29172,7 +30498,25 @@
           <w:b/>
           <w:sz w:val="21"/>
         </w:rPr>
-        <w:t>Depth-1 callers sẽ break nếu migration sai:</w:t>
+        <w:t>Kết quả verify row count (thực tế đã chạy):</w:t>
+      </w:r>
+      <w:r>
+        <w:rPr>
+          <w:sz w:val="21"/>
+        </w:rPr>
+        <w:t xml:space="preserve"> projects 2→2, classes 4→4, images 1→1, annotations 0→0, models 0→0, jobs 0→0, users 1→1 — không mất dữ liệu ở bảng nào.</w:t>
+      </w:r>
+    </w:p>
+    <w:p>
+      <w:pPr>
+        <w:spacing w:after="80"/>
+      </w:pPr>
+      <w:r>
+        <w:rPr>
+          <w:b/>
+          <w:sz w:val="21"/>
+        </w:rPr>
+        <w:t>Depth-1 callers sẽ break nếu STEP-3.2 sai:</w:t>
       </w:r>
       <w:r>
         <w:rPr>
@@ -29192,7 +30536,21 @@
         <w:rPr>
           <w:sz w:val="21"/>
         </w:rPr>
-        <w:t xml:space="preserve"> (annotations.js, images.js:64, export.js, stats.js, autolabel.js).</w:t>
+        <w:t xml:space="preserve"> (annotations.js, images.js:64, export.js, stats.js, autolabel.js) — CHƯA đổi ở bước này, cần re-verify khi STEP-3.2 sửa </w:t>
+      </w:r>
+      <w:r>
+        <w:rPr>
+          <w:rFonts w:ascii="Courier New" w:hAnsi="Courier New"/>
+          <w:color w:val="F05922"/>
+          <w:sz w:val="18"/>
+        </w:rPr>
+        <w:t>annotations.js</w:t>
+      </w:r>
+      <w:r>
+        <w:rPr>
+          <w:sz w:val="21"/>
+        </w:rPr>
+        <w:t>.</w:t>
       </w:r>
     </w:p>
     <w:p>
@@ -29210,7 +30568,7 @@
         <w:rPr>
           <w:sz w:val="21"/>
         </w:rPr>
-        <w:t xml:space="preserve"> Bảng </w:t>
+        <w:t xml:space="preserve"> </w:t>
       </w:r>
       <w:r>
         <w:rPr>
@@ -29218,13 +30576,13 @@
           <w:color w:val="F05922"/>
           <w:sz w:val="18"/>
         </w:rPr>
-        <w:t>annotation_history</w:t>
+        <w:t>annotation_history.snapshot</w:t>
       </w:r>
       <w:r>
         <w:rPr>
           <w:sz w:val="21"/>
         </w:rPr>
-        <w:t xml:space="preserve"> và </w:t>
+        <w:t xml:space="preserve"> là SNAPSHOT JSON (không diff) — STEP-3.2 revert = ghi đè thẳng, không merge. </w:t>
       </w:r>
       <w:r>
         <w:rPr>
@@ -29232,13 +30590,13 @@
           <w:color w:val="F05922"/>
           <w:sz w:val="18"/>
         </w:rPr>
-        <w:t>activity_log</w:t>
+        <w:t>actor_id</w:t>
       </w:r>
       <w:r>
         <w:rPr>
           <w:sz w:val="21"/>
         </w:rPr>
-        <w:t xml:space="preserve"> cần </w:t>
+        <w:t xml:space="preserve"> không có </w:t>
       </w:r>
       <w:r>
         <w:rPr>
@@ -29246,27 +30604,13 @@
           <w:color w:val="F05922"/>
           <w:sz w:val="18"/>
         </w:rPr>
-        <w:t>actor_id FK→users.id</w:t>
+        <w:t>ON DELETE CASCADE</w:t>
       </w:r>
       <w:r>
         <w:rPr>
           <w:sz w:val="21"/>
         </w:rPr>
-        <w:t xml:space="preserve"> — Phase 2 (bảng </w:t>
-      </w:r>
-      <w:r>
-        <w:rPr>
-          <w:rFonts w:ascii="Courier New" w:hAnsi="Courier New"/>
-          <w:color w:val="F05922"/>
-          <w:sz w:val="18"/>
-        </w:rPr>
-        <w:t>users</w:t>
-      </w:r>
-      <w:r>
-        <w:rPr>
-          <w:sz w:val="21"/>
-        </w:rPr>
-        <w:t>) PHẢI hoàn thành trước.</w:t>
+        <w:t xml:space="preserve"> — không hard-delete user có history.</w:t>
       </w:r>
     </w:p>
     <w:p>
@@ -30544,6 +31888,126 @@
                 <w:sz w:val="20"/>
               </w:rPr>
               <w:t>(STEP-2.3)</w:t>
+            </w:r>
+          </w:p>
+        </w:tc>
+      </w:tr>
+      <w:tr>
+        <w:tc>
+          <w:tcPr>
+            <w:tcW w:type="dxa" w:w="2422"/>
+            <w:tcBorders>
+              <w:top w:val="single" w:sz="4" w:space="0" w:color="CBCBCB"/>
+              <w:left w:val="single" w:sz="4" w:space="0" w:color="CBCBCB"/>
+              <w:bottom w:val="single" w:sz="4" w:space="0" w:color="CBCBCB"/>
+              <w:right w:val="single" w:sz="4" w:space="0" w:color="CBCBCB"/>
+            </w:tcBorders>
+          </w:tcPr>
+          <w:p>
+            <w:r>
+              <w:rPr>
+                <w:sz w:val="20"/>
+              </w:rPr>
+              <w:t>2026-08-05</w:t>
+            </w:r>
+          </w:p>
+        </w:tc>
+        <w:tc>
+          <w:tcPr>
+            <w:tcW w:type="dxa" w:w="2422"/>
+            <w:tcBorders>
+              <w:top w:val="single" w:sz="4" w:space="0" w:color="CBCBCB"/>
+              <w:left w:val="single" w:sz="4" w:space="0" w:color="CBCBCB"/>
+              <w:bottom w:val="single" w:sz="4" w:space="0" w:color="CBCBCB"/>
+              <w:right w:val="single" w:sz="4" w:space="0" w:color="CBCBCB"/>
+            </w:tcBorders>
+          </w:tcPr>
+          <w:p>
+            <w:r>
+              <w:rPr>
+                <w:sz w:val="20"/>
+              </w:rPr>
+              <w:t>senior-developer (STEP-3.1)</w:t>
+            </w:r>
+          </w:p>
+        </w:tc>
+        <w:tc>
+          <w:tcPr>
+            <w:tcW w:type="dxa" w:w="2422"/>
+            <w:tcBorders>
+              <w:top w:val="single" w:sz="4" w:space="0" w:color="CBCBCB"/>
+              <w:left w:val="single" w:sz="4" w:space="0" w:color="CBCBCB"/>
+              <w:bottom w:val="single" w:sz="4" w:space="0" w:color="CBCBCB"/>
+              <w:right w:val="single" w:sz="4" w:space="0" w:color="CBCBCB"/>
+            </w:tcBorders>
+          </w:tcPr>
+          <w:p>
+            <w:r>
+              <w:rPr>
+                <w:sz w:val="20"/>
+              </w:rPr>
+              <w:t xml:space="preserve">Cập nhật §6 — cột </w:t>
+            </w:r>
+            <w:r>
+              <w:rPr>
+                <w:rFonts w:ascii="Courier New" w:hAnsi="Courier New"/>
+                <w:color w:val="F05922"/>
+                <w:sz w:val="20"/>
+              </w:rPr>
+              <w:t>annotations.version</w:t>
+            </w:r>
+            <w:r>
+              <w:rPr>
+                <w:sz w:val="20"/>
+              </w:rPr>
+              <w:t xml:space="preserve">, bảng mới </w:t>
+            </w:r>
+            <w:r>
+              <w:rPr>
+                <w:rFonts w:ascii="Courier New" w:hAnsi="Courier New"/>
+                <w:color w:val="F05922"/>
+                <w:sz w:val="20"/>
+              </w:rPr>
+              <w:t>annotation_history</w:t>
+            </w:r>
+            <w:r>
+              <w:rPr>
+                <w:sz w:val="20"/>
+              </w:rPr>
+              <w:t xml:space="preserve"> (snapshot), </w:t>
+            </w:r>
+            <w:r>
+              <w:rPr>
+                <w:rFonts w:ascii="Courier New" w:hAnsi="Courier New"/>
+                <w:color w:val="F05922"/>
+                <w:sz w:val="20"/>
+              </w:rPr>
+              <w:t>activity_log</w:t>
+            </w:r>
+            <w:r>
+              <w:rPr>
+                <w:sz w:val="20"/>
+              </w:rPr>
+              <w:t>; §9 Phase 3.1 DONE — verify row count trước/sau (0 mất dữ liệu, CTO condition #1 đạt)</w:t>
+            </w:r>
+          </w:p>
+        </w:tc>
+        <w:tc>
+          <w:tcPr>
+            <w:tcW w:type="dxa" w:w="2422"/>
+            <w:tcBorders>
+              <w:top w:val="single" w:sz="4" w:space="0" w:color="CBCBCB"/>
+              <w:left w:val="single" w:sz="4" w:space="0" w:color="CBCBCB"/>
+              <w:bottom w:val="single" w:sz="4" w:space="0" w:color="CBCBCB"/>
+              <w:right w:val="single" w:sz="4" w:space="0" w:color="CBCBCB"/>
+            </w:tcBorders>
+          </w:tcPr>
+          <w:p>
+            <w:r>
+              <w:rPr>
+                <w:sz w:val="20"/>
+              </w:rPr>
+              <w:t>(STEP-3.1)</w:t>
             </w:r>
           </w:p>
         </w:tc>

</xml_diff>